<commit_message>
Deepen relationship and Human Design sections in Sternenportrait
Expands the love/relationship reading with Neptune-Mars/Mercury
symbolism (idealization/trust theme) and adds a fuller Human Design
section (types, strategy, authority, not-self patterns), bridging
both into a self-reflection prompt about deciding from inner
authority rather than fear. Deliberately avoids constructing any
causal narrative around infidelity or childlessness, since neither
can be responsibly inferred from birth data.

Co-Authored-By: Claude Sonnet 5 <noreply@anthropic.com>
Claude-Session: https://claude.ai/code/session_01WEP9tMJFJXqk7xbdkvVd7M
</commit_message>
<xml_diff>
--- a/outputs/Claudia_Schelbert_Sternenportrait.docx
+++ b/outputs/Claudia_Schelbert_Sternenportrait.docx
@@ -2115,6 +2115,36 @@
     </w:p>
     <w:p>
       <w:pPr>
+        <w:spacing w:after="200" w:line="320"/>
+        <w:jc w:val="both"/>
+      </w:pPr>
+      <w:r>
+        <w:rPr>
+          <w:rFonts w:ascii="Georgia" w:cs="Georgia" w:eastAsia="Georgia" w:hAnsi="Georgia"/>
+          <w:color w:val="2B2620"/>
+          <w:sz w:val="22"/>
+          <w:szCs w:val="22"/>
+        </w:rPr>
+        <w:t xml:space="preserve">Ein zweiter Faden verstärkt dieses Bild: Neptun, der Planet der Sehnsucht, der Idealisierung und – in seiner schwierigen Ausprägung – der Täuschung, steht bei dir eng bei Merkur und Mars im Skorpion (siehe oben). Klassisch gelesen bedeutet das: Du näherst dich der Liebe mit großer Tiefe und Hingabe, neigst aber dazu, Menschen zunächst durch eine leicht verklärte, sehnsuchtsvolle Linse zu sehen – du siehst im Anderen oft zuerst das Potenzial, das Ideal, das, was sein könnte. Das ist keine Schwäche, sondern die Kehrseite einer großen Fähigkeit zu bedingungsloser Liebe. Die astrologische Einladung dieser Kombination ist eine sehr konkrete: dein Skorpion-Scharfsinn – der eigentlich nichts durchgehen lässt – bewusst auch in der Liebe walten zu lassen, statt ihn dort zugunsten des Neptun-Ideals leiser zu stellen.</w:t>
+      </w:r>
+    </w:p>
+    <w:p>
+      <w:pPr>
+        <w:spacing w:after="200" w:line="320"/>
+        <w:jc w:val="both"/>
+      </w:pPr>
+      <w:r>
+        <w:rPr>
+          <w:rFonts w:ascii="Georgia" w:cs="Georgia" w:eastAsia="Georgia" w:hAnsi="Georgia"/>
+          <w:color w:val="2B2620"/>
+          <w:sz w:val="22"/>
+          <w:szCs w:val="22"/>
+        </w:rPr>
+        <w:t xml:space="preserve">Zusammengenommen zeichnen Venus/Pluto im 12. Haus und Neptun bei Mars/Merkur das Bild einer Frau, deren Liebesfähigkeit ungewöhnlich tief und aufopfernd ist – deren große Lebensaufgabe im Beziehungsbereich aber genau darin liegt, diese Tiefe nicht blind, sondern mit offenen Augen zu verschenken: sich früh und ehrlich zu fragen, ob ein Gegenüber dieser Hingabe tatsächlich entspricht, statt dem eigenen Ideal davon nachzuspüren.</w:t>
+      </w:r>
+    </w:p>
+    <w:p>
+      <w:pPr>
         <w:pBdr>
           <w:bottom w:val="single" w:color="A6803C" w:sz="6" w:space="6"/>
         </w:pBdr>
@@ -2425,22 +2455,67 @@
           <w:sz w:val="21"/>
           <w:szCs w:val="21"/>
         </w:rPr>
-        <w:t xml:space="preserve">Eine Einführung — und eine ehrliche Einschränkung</w:t>
-      </w:r>
-    </w:p>
-    <w:p>
-      <w:pPr>
-        <w:spacing w:after="200" w:line="320"/>
-        <w:jc w:val="both"/>
-      </w:pPr>
-      <w:r>
-        <w:rPr>
-          <w:rFonts w:ascii="Georgia" w:cs="Georgia" w:eastAsia="Georgia" w:hAnsi="Georgia"/>
-          <w:color w:val="2B2620"/>
-          <w:sz w:val="22"/>
-          <w:szCs w:val="22"/>
-        </w:rPr>
-        <w:t xml:space="preserve">Human Design ist ein jüngeres System, in den 1990er-Jahren von Ra Uru Hu entwickelt, das westliche Astrologie, das chinesische I Ging, die Kabbala und die Chakren-Lehre miteinander verbindet. Aus dem exakten Geburtszeitpunkt und einem zweiten Zeitpunkt, der rechnerisch rund 88 Tage davor liegt (dem sogenannten 'Design'-Datum), werden 64 'Tore' aktiviert. Daraus ergeben sich ein Energietyp (zum Beispiel Generator, Manifestor, Projektor oder Reflektor), eine innere Autorität für Entscheidungen und ein sogenanntes Profil.</w:t>
+        <w:t xml:space="preserve">Eine vertiefte Einführung — und eine ehrliche Einschränkung</w:t>
+      </w:r>
+    </w:p>
+    <w:p>
+      <w:pPr>
+        <w:spacing w:after="200" w:line="320"/>
+        <w:jc w:val="both"/>
+      </w:pPr>
+      <w:r>
+        <w:rPr>
+          <w:rFonts w:ascii="Georgia" w:cs="Georgia" w:eastAsia="Georgia" w:hAnsi="Georgia"/>
+          <w:color w:val="2B2620"/>
+          <w:sz w:val="22"/>
+          <w:szCs w:val="22"/>
+        </w:rPr>
+        <w:t xml:space="preserve">Human Design ist ein jüngeres System, in den 1990er-Jahren von Ra Uru Hu entwickelt, das westliche Astrologie, das chinesische I Ging, die Kabbala und die Chakren-Lehre miteinander verbindet. Aus dem exakten Geburtszeitpunkt und einem zweiten Zeitpunkt, der rechnerisch rund 88 Tage davor liegt (dem sogenannten 'Design'-Datum), werden 64 'Tore' aktiviert. Daraus ergeben sich ein Energietyp, eine innere Autorität für Entscheidungen und ein sogenanntes Profil – gemeinsam bilden sie den 'Bodygraph', die Landkarte der eigenen Energie.</w:t>
+      </w:r>
+    </w:p>
+    <w:p>
+      <w:pPr>
+        <w:spacing w:after="200" w:line="320"/>
+        <w:jc w:val="both"/>
+      </w:pPr>
+      <w:r>
+        <w:rPr>
+          <w:rFonts w:ascii="Georgia" w:cs="Georgia" w:eastAsia="Georgia" w:hAnsi="Georgia"/>
+          <w:color w:val="2B2620"/>
+          <w:sz w:val="22"/>
+          <w:szCs w:val="22"/>
+        </w:rPr>
+        <w:t xml:space="preserve">Die fünf Energietypen: Generatoren (rund 37 % aller Menschen) und Manifestierende Generatoren (rund 33 %) tragen eine beständige, sakrale Lebenskraft in sich; ihre Strategie ist, auf etwas zu reagieren, statt selbst zu initiieren – ihr 'Ja' oder 'Nein' entsteht als spontane Körperreaktion, nicht im Kopf. Projektoren (rund 20 %) sind für ihre Umgebung erkennende, führende Energie da; ihre Strategie ist, auf echte Einladung zu warten, statt sich von sich aus zu beweisen. Manifestoren (rund 9 %) haben die Kraft, aus sich selbst heraus etwas in Bewegung zu setzen; ihre Strategie ist, andere zu informieren, bevor sie handeln. Reflektoren (unter 1 %) schließlich sind ganz offen für ihre Umgebung und spiegeln sie – ihre Strategie ist, bei großen Entscheidungen einen vollen Mondzyklus, also bis zu 28 Tage, verstreichen zu lassen.</w:t>
+      </w:r>
+    </w:p>
+    <w:p>
+      <w:pPr>
+        <w:spacing w:after="200" w:line="320"/>
+        <w:jc w:val="both"/>
+      </w:pPr>
+      <w:r>
+        <w:rPr>
+          <w:rFonts w:ascii="Georgia" w:cs="Georgia" w:eastAsia="Georgia" w:hAnsi="Georgia"/>
+          <w:color w:val="2B2620"/>
+          <w:sz w:val="22"/>
+          <w:szCs w:val="22"/>
+        </w:rPr>
+        <w:t xml:space="preserve">Die innere Autorität beschreibt, wo im Körper – nicht im Kopf – eine stimmige Entscheidung eigentlich getroffen wird: emotional (über Wellen aus Hoch und Tief, die erst mit etwas Abstand Klarheit bringen), sakral, über die Milz (leise, spontane, aber flüchtige Intuition), über den Solarplexus, das Ego oder – seltener – rein durch lautes Aussprechen im Gespräch mit anderen. Jede Autorität braucht ihren eigenen Rhythmus, um zu einer echten Antwort zu kommen.</w:t>
+      </w:r>
+    </w:p>
+    <w:p>
+      <w:pPr>
+        <w:spacing w:after="200" w:line="320"/>
+        <w:jc w:val="both"/>
+      </w:pPr>
+      <w:r>
+        <w:rPr>
+          <w:rFonts w:ascii="Georgia" w:cs="Georgia" w:eastAsia="Georgia" w:hAnsi="Georgia"/>
+          <w:color w:val="2B2620"/>
+          <w:sz w:val="22"/>
+          <w:szCs w:val="22"/>
+        </w:rPr>
+        <w:t xml:space="preserve">Der zentrale Gedanke von Human Design, unabhängig vom exakten Typ, ist der Unterschied zwischen dem 'Selbst' und dem 'Nicht-Selbst': Lebt ein Mensch nach seiner eigenen Strategie und Autorität, fühlt sich das stimmig und erleichtert an. Entscheidet er stattdessen aus Angst, aus Anpassungsdruck oder aus dem Kopf heraus – etwa, weil ein 'Nein' unhöflich erschiene, weil man etwas nicht verpassen will, oder weil man es allen recht machen möchte – entstehen typische 'Nicht-Selbst'-Gefühle: bei reagierenden Typen Frustration, bei Projektoren Verbitterung, bei Manifestoren Wut, bei Reflektoren Enttäuschung. Genau diese Entscheidungen unter Druck sind es, die in der Human-Design-Lehre besonders häufig zu Bindungen führen, die sich im Nachhinein falsch anfühlen – nicht, weil ein Mensch etwas 'anzieht', sondern weil eine Entscheidung nicht aus der eigenen, verkörperten Autorität heraus getroffen wurde, sondern aus Kopf oder Angst.</w:t>
       </w:r>
     </w:p>
     <w:p>
@@ -2471,11 +2546,6 @@
           <w:szCs w:val="22"/>
         </w:rPr>
         <w:t xml:space="preserve">Die gute Nachricht: Deine Angaben – 1. Oktober 1961, 06:35 Uhr, Schwyz – sind bereits vollständig und präzise genug, um in wenigen Sekunden ein exaktes Chart zu erstellen, etwa über kostenlose Rechner wie humandesignchart.org. Auf Wunsch werden das Ergebnis – Typ, Autorität, Profil und Kanäle – gerne im Anschluss in dieses Portrait eingearbeitet und mit den astrologischen Themen oben in Verbindung gebracht.</w:t>
-      </w:r>
-    </w:p>
-    <w:p>
-      <w:r>
-        <w:br w:type="page"/>
       </w:r>
     </w:p>
     <w:p>
@@ -2494,6 +2564,76 @@
           <w:sz w:val="30"/>
           <w:szCs w:val="30"/>
         </w:rPr>
+        <w:t xml:space="preserve">Ein wiederkehrender Faden — eine Einladung zur Reflexion</w:t>
+      </w:r>
+    </w:p>
+    <w:p>
+      <w:pPr>
+        <w:spacing w:after="160" w:before="60"/>
+      </w:pPr>
+      <w:r>
+        <w:rPr>
+          <w:rFonts w:ascii="Georgia" w:cs="Georgia" w:eastAsia="Georgia" w:hAnsi="Georgia"/>
+          <w:i/>
+          <w:iCs/>
+          <w:color w:val="A6803C"/>
+          <w:sz w:val="21"/>
+          <w:szCs w:val="21"/>
+        </w:rPr>
+        <w:t xml:space="preserve">Nicht, was dir widerfährt, sondern von wo du entscheidest</w:t>
+      </w:r>
+    </w:p>
+    <w:p>
+      <w:pPr>
+        <w:spacing w:after="200" w:line="320"/>
+        <w:jc w:val="both"/>
+      </w:pPr>
+      <w:r>
+        <w:rPr>
+          <w:rFonts w:ascii="Georgia" w:cs="Georgia" w:eastAsia="Georgia" w:hAnsi="Georgia"/>
+          <w:color w:val="2B2620"/>
+          <w:sz w:val="22"/>
+          <w:szCs w:val="22"/>
+        </w:rPr>
+        <w:t xml:space="preserve">Zwei unabhängige Systeme laufen in diesem Portrait auf ein verwandtes Thema zu: Die Astrologie zeigt mit Venus und Pluto im 12. Haus sowie Neptun bei Mars und Merkur eine Liebesfähigkeit, die sehr tief, sehr hingebungsvoll und zugleich anfällig für Idealisierung ist. Human Design lehrt unabhängig davon, dass die verlässlichste Kompassnadel in der Liebe nicht der Kopf oder das Bedürfnis nach Harmonie ist, sondern die eigene, verkörperte Autorität – und dass ein 'Ja' aus Angst, Anpassung oder Sehnsucht fast immer irgendwann seinen Preis fordert.</w:t>
+      </w:r>
+    </w:p>
+    <w:p>
+      <w:pPr>
+        <w:spacing w:after="200" w:line="320"/>
+        <w:jc w:val="both"/>
+      </w:pPr>
+      <w:r>
+        <w:rPr>
+          <w:rFonts w:ascii="Georgia" w:cs="Georgia" w:eastAsia="Georgia" w:hAnsi="Georgia"/>
+          <w:color w:val="2B2620"/>
+          <w:sz w:val="22"/>
+          <w:szCs w:val="22"/>
+        </w:rPr>
+        <w:t xml:space="preserve">Das ist keine Erklärung dafür, was in einzelnen Beziehungen geschehen ist – dafür sind Sterne und Tore der falsche Ort, denn was ein Gegenüber tut, bleibt immer dessen eigene Entscheidung. Es ist eher eine Einladung an dich: In der Rückschau all der Momente zu fragen, wann eine Entscheidung in der Liebe aus echter, verkörperter Klarheit kam – und wann aus dem Wunsch heraus, dass etwas sich erfüllen möge. Genau in dieser Unterscheidung liegt, wenn man beiden Systemen hier folgt, der größte Hebel für die Zukunft.</w:t>
+      </w:r>
+    </w:p>
+    <w:p>
+      <w:r>
+        <w:br w:type="page"/>
+      </w:r>
+    </w:p>
+    <w:p>
+      <w:pPr>
+        <w:pBdr>
+          <w:bottom w:val="single" w:color="A6803C" w:sz="6" w:space="6"/>
+        </w:pBdr>
+        <w:spacing w:after="40" w:before="320"/>
+      </w:pPr>
+      <w:r>
+        <w:rPr>
+          <w:rFonts w:ascii="Georgia" w:cs="Georgia" w:eastAsia="Georgia" w:hAnsi="Georgia"/>
+          <w:b/>
+          <w:bCs/>
+          <w:color w:val="5B2333"/>
+          <w:sz w:val="30"/>
+          <w:szCs w:val="30"/>
+        </w:rPr>
         <w:t xml:space="preserve">Zusammenfassendes Portrait</w:t>
       </w:r>
     </w:p>
@@ -2524,7 +2664,7 @@
           <w:sz w:val="22"/>
           <w:szCs w:val="22"/>
         </w:rPr>
-        <w:t xml:space="preserve">Ausdauer und Verantwortung sind dabei durchgängige Themen – astrologisch (Jupiter und Saturn in Steinbock), chinesisch (Metall-Büffel) und numerologisch (die Pionierzahl 1) gleichermaßen. Und die Einladung, zu der dein Leben dich immer wieder führt: dich selbst, mit deiner ganz eigenen Wärme, sichtbarer und freier zu zeigen.</w:t>
+        <w:t xml:space="preserve">Ausdauer und Verantwortung sind dabei durchgängige Themen – astrologisch (Jupiter und Saturn in Steinbock), chinesisch (Metall-Büffel) und numerologisch (die Pionierzahl 1) gleichermaßen. Und die Einladung, zu der dein Leben dich immer wieder führt: dich selbst, mit deiner ganz eigenen Wärme, sichtbarer und freier zu zeigen – und dabei die Tiefe deiner Liebesfähigkeit zunehmend mit offenen statt idealisierenden Augen zu verschenken.</w:t>
       </w:r>
     </w:p>
     <w:p>

</xml_diff>

<commit_message>
Switch Sternenportrait to Arial and tighten astrology section
Shortens the opening astrology narrative sections while leaving the
Human Design explanation at full depth, and sets Arial as the
document font throughout.

Co-Authored-By: Claude Sonnet 5 <noreply@anthropic.com>
Claude-Session: https://claude.ai/code/session_01WEP9tMJFJXqk7xbdkvVd7M
</commit_message>
<xml_diff>
--- a/outputs/Claudia_Schelbert_Sternenportrait.docx
+++ b/outputs/Claudia_Schelbert_Sternenportrait.docx
@@ -28,7 +28,7 @@
       </w:pPr>
       <w:r>
         <w:rPr>
-          <w:rFonts w:ascii="Georgia" w:cs="Georgia" w:eastAsia="Georgia" w:hAnsi="Georgia"/>
+          <w:rFonts w:ascii="Arial" w:cs="Arial" w:eastAsia="Arial" w:hAnsi="Arial"/>
           <w:b/>
           <w:bCs/>
           <w:color w:val="5B2333"/>
@@ -45,7 +45,7 @@
       </w:pPr>
       <w:r>
         <w:rPr>
-          <w:rFonts w:ascii="Georgia" w:cs="Georgia" w:eastAsia="Georgia" w:hAnsi="Georgia"/>
+          <w:rFonts w:ascii="Arial" w:cs="Arial" w:eastAsia="Arial" w:hAnsi="Arial"/>
           <w:i/>
           <w:iCs/>
           <w:color w:val="A6803C"/>
@@ -71,7 +71,7 @@
       </w:pPr>
       <w:r>
         <w:rPr>
-          <w:rFonts w:ascii="Georgia" w:cs="Georgia" w:eastAsia="Georgia" w:hAnsi="Georgia"/>
+          <w:rFonts w:ascii="Arial" w:cs="Arial" w:eastAsia="Arial" w:hAnsi="Arial"/>
           <w:color w:val="2B2620"/>
           <w:sz w:val="24"/>
           <w:szCs w:val="24"/>
@@ -86,7 +86,7 @@
       </w:pPr>
       <w:r>
         <w:rPr>
-          <w:rFonts w:ascii="Georgia" w:cs="Georgia" w:eastAsia="Georgia" w:hAnsi="Georgia"/>
+          <w:rFonts w:ascii="Arial" w:cs="Arial" w:eastAsia="Arial" w:hAnsi="Arial"/>
           <w:color w:val="2B2620"/>
           <w:sz w:val="24"/>
           <w:szCs w:val="24"/>
@@ -100,7 +100,7 @@
       </w:pPr>
       <w:r>
         <w:rPr>
-          <w:rFonts w:ascii="Georgia" w:cs="Georgia" w:eastAsia="Georgia" w:hAnsi="Georgia"/>
+          <w:rFonts w:ascii="Arial" w:cs="Arial" w:eastAsia="Arial" w:hAnsi="Arial"/>
           <w:color w:val="8A8377"/>
           <w:sz w:val="18"/>
           <w:szCs w:val="18"/>
@@ -122,7 +122,7 @@
       </w:pPr>
       <w:r>
         <w:rPr>
-          <w:rFonts w:ascii="Georgia" w:cs="Georgia" w:eastAsia="Georgia" w:hAnsi="Georgia"/>
+          <w:rFonts w:ascii="Arial" w:cs="Arial" w:eastAsia="Arial" w:hAnsi="Arial"/>
           <w:b/>
           <w:bCs/>
           <w:color w:val="5B2333"/>
@@ -139,7 +139,7 @@
       </w:pPr>
       <w:r>
         <w:rPr>
-          <w:rFonts w:ascii="Georgia" w:cs="Georgia" w:eastAsia="Georgia" w:hAnsi="Georgia"/>
+          <w:rFonts w:ascii="Arial" w:cs="Arial" w:eastAsia="Arial" w:hAnsi="Arial"/>
           <w:color w:val="2B2620"/>
           <w:sz w:val="22"/>
           <w:szCs w:val="22"/>
@@ -154,7 +154,7 @@
       </w:pPr>
       <w:r>
         <w:rPr>
-          <w:rFonts w:ascii="Georgia" w:cs="Georgia" w:eastAsia="Georgia" w:hAnsi="Georgia"/>
+          <w:rFonts w:ascii="Arial" w:cs="Arial" w:eastAsia="Arial" w:hAnsi="Arial"/>
           <w:color w:val="2B2620"/>
           <w:sz w:val="22"/>
           <w:szCs w:val="22"/>
@@ -169,7 +169,7 @@
       </w:pPr>
       <w:r>
         <w:rPr>
-          <w:rFonts w:ascii="Georgia" w:cs="Georgia" w:eastAsia="Georgia" w:hAnsi="Georgia"/>
+          <w:rFonts w:ascii="Arial" w:cs="Arial" w:eastAsia="Arial" w:hAnsi="Arial"/>
           <w:color w:val="2B2620"/>
           <w:sz w:val="22"/>
           <w:szCs w:val="22"/>
@@ -191,7 +191,7 @@
       </w:pPr>
       <w:r>
         <w:rPr>
-          <w:rFonts w:ascii="Georgia" w:cs="Georgia" w:eastAsia="Georgia" w:hAnsi="Georgia"/>
+          <w:rFonts w:ascii="Arial" w:cs="Arial" w:eastAsia="Arial" w:hAnsi="Arial"/>
           <w:b/>
           <w:bCs/>
           <w:color w:val="5B2333"/>
@@ -208,7 +208,7 @@
       </w:pPr>
       <w:r>
         <w:rPr>
-          <w:rFonts w:ascii="Georgia" w:cs="Georgia" w:eastAsia="Georgia" w:hAnsi="Georgia"/>
+          <w:rFonts w:ascii="Arial" w:cs="Arial" w:eastAsia="Arial" w:hAnsi="Arial"/>
           <w:color w:val="2B2620"/>
           <w:sz w:val="22"/>
           <w:szCs w:val="22"/>
@@ -258,7 +258,7 @@
           <w:p>
             <w:r>
               <w:rPr>
-                <w:rFonts w:ascii="Georgia" w:cs="Georgia" w:eastAsia="Georgia" w:hAnsi="Georgia"/>
+                <w:rFonts w:ascii="Arial" w:cs="Arial" w:eastAsia="Arial" w:hAnsi="Arial"/>
                 <w:b/>
                 <w:bCs/>
                 <w:color w:val="FFFFFF"/>
@@ -284,7 +284,7 @@
           <w:p>
             <w:r>
               <w:rPr>
-                <w:rFonts w:ascii="Georgia" w:cs="Georgia" w:eastAsia="Georgia" w:hAnsi="Georgia"/>
+                <w:rFonts w:ascii="Arial" w:cs="Arial" w:eastAsia="Arial" w:hAnsi="Arial"/>
                 <w:b/>
                 <w:bCs/>
                 <w:color w:val="FFFFFF"/>
@@ -310,7 +310,7 @@
           <w:p>
             <w:r>
               <w:rPr>
-                <w:rFonts w:ascii="Georgia" w:cs="Georgia" w:eastAsia="Georgia" w:hAnsi="Georgia"/>
+                <w:rFonts w:ascii="Arial" w:cs="Arial" w:eastAsia="Arial" w:hAnsi="Arial"/>
                 <w:b/>
                 <w:bCs/>
                 <w:color w:val="FFFFFF"/>
@@ -336,7 +336,7 @@
           <w:p>
             <w:r>
               <w:rPr>
-                <w:rFonts w:ascii="Georgia" w:cs="Georgia" w:eastAsia="Georgia" w:hAnsi="Georgia"/>
+                <w:rFonts w:ascii="Arial" w:cs="Arial" w:eastAsia="Arial" w:hAnsi="Arial"/>
                 <w:b/>
                 <w:bCs/>
                 <w:color w:val="FFFFFF"/>
@@ -364,7 +364,7 @@
           <w:p>
             <w:r>
               <w:rPr>
-                <w:rFonts w:ascii="Georgia" w:cs="Georgia" w:eastAsia="Georgia" w:hAnsi="Georgia"/>
+                <w:rFonts w:ascii="Arial" w:cs="Arial" w:eastAsia="Arial" w:hAnsi="Arial"/>
                 <w:b w:val="false"/>
                 <w:bCs w:val="false"/>
                 <w:color w:val="2B2620"/>
@@ -390,7 +390,7 @@
           <w:p>
             <w:r>
               <w:rPr>
-                <w:rFonts w:ascii="Georgia" w:cs="Georgia" w:eastAsia="Georgia" w:hAnsi="Georgia"/>
+                <w:rFonts w:ascii="Arial" w:cs="Arial" w:eastAsia="Arial" w:hAnsi="Arial"/>
                 <w:b w:val="false"/>
                 <w:bCs w:val="false"/>
                 <w:color w:val="2B2620"/>
@@ -416,7 +416,7 @@
           <w:p>
             <w:r>
               <w:rPr>
-                <w:rFonts w:ascii="Georgia" w:cs="Georgia" w:eastAsia="Georgia" w:hAnsi="Georgia"/>
+                <w:rFonts w:ascii="Arial" w:cs="Arial" w:eastAsia="Arial" w:hAnsi="Arial"/>
                 <w:b w:val="false"/>
                 <w:bCs w:val="false"/>
                 <w:color w:val="2B2620"/>
@@ -442,7 +442,7 @@
           <w:p>
             <w:r>
               <w:rPr>
-                <w:rFonts w:ascii="Georgia" w:cs="Georgia" w:eastAsia="Georgia" w:hAnsi="Georgia"/>
+                <w:rFonts w:ascii="Arial" w:cs="Arial" w:eastAsia="Arial" w:hAnsi="Arial"/>
                 <w:b w:val="false"/>
                 <w:bCs w:val="false"/>
                 <w:color w:val="2B2620"/>
@@ -470,7 +470,7 @@
           <w:p>
             <w:r>
               <w:rPr>
-                <w:rFonts w:ascii="Georgia" w:cs="Georgia" w:eastAsia="Georgia" w:hAnsi="Georgia"/>
+                <w:rFonts w:ascii="Arial" w:cs="Arial" w:eastAsia="Arial" w:hAnsi="Arial"/>
                 <w:b w:val="false"/>
                 <w:bCs w:val="false"/>
                 <w:color w:val="2B2620"/>
@@ -496,7 +496,7 @@
           <w:p>
             <w:r>
               <w:rPr>
-                <w:rFonts w:ascii="Georgia" w:cs="Georgia" w:eastAsia="Georgia" w:hAnsi="Georgia"/>
+                <w:rFonts w:ascii="Arial" w:cs="Arial" w:eastAsia="Arial" w:hAnsi="Arial"/>
                 <w:b w:val="false"/>
                 <w:bCs w:val="false"/>
                 <w:color w:val="2B2620"/>
@@ -522,7 +522,7 @@
           <w:p>
             <w:r>
               <w:rPr>
-                <w:rFonts w:ascii="Georgia" w:cs="Georgia" w:eastAsia="Georgia" w:hAnsi="Georgia"/>
+                <w:rFonts w:ascii="Arial" w:cs="Arial" w:eastAsia="Arial" w:hAnsi="Arial"/>
                 <w:b w:val="false"/>
                 <w:bCs w:val="false"/>
                 <w:color w:val="2B2620"/>
@@ -548,7 +548,7 @@
           <w:p>
             <w:r>
               <w:rPr>
-                <w:rFonts w:ascii="Georgia" w:cs="Georgia" w:eastAsia="Georgia" w:hAnsi="Georgia"/>
+                <w:rFonts w:ascii="Arial" w:cs="Arial" w:eastAsia="Arial" w:hAnsi="Arial"/>
                 <w:b w:val="false"/>
                 <w:bCs w:val="false"/>
                 <w:color w:val="2B2620"/>
@@ -576,7 +576,7 @@
           <w:p>
             <w:r>
               <w:rPr>
-                <w:rFonts w:ascii="Georgia" w:cs="Georgia" w:eastAsia="Georgia" w:hAnsi="Georgia"/>
+                <w:rFonts w:ascii="Arial" w:cs="Arial" w:eastAsia="Arial" w:hAnsi="Arial"/>
                 <w:b w:val="false"/>
                 <w:bCs w:val="false"/>
                 <w:color w:val="2B2620"/>
@@ -602,7 +602,7 @@
           <w:p>
             <w:r>
               <w:rPr>
-                <w:rFonts w:ascii="Georgia" w:cs="Georgia" w:eastAsia="Georgia" w:hAnsi="Georgia"/>
+                <w:rFonts w:ascii="Arial" w:cs="Arial" w:eastAsia="Arial" w:hAnsi="Arial"/>
                 <w:b w:val="false"/>
                 <w:bCs w:val="false"/>
                 <w:color w:val="2B2620"/>
@@ -628,7 +628,7 @@
           <w:p>
             <w:r>
               <w:rPr>
-                <w:rFonts w:ascii="Georgia" w:cs="Georgia" w:eastAsia="Georgia" w:hAnsi="Georgia"/>
+                <w:rFonts w:ascii="Arial" w:cs="Arial" w:eastAsia="Arial" w:hAnsi="Arial"/>
                 <w:b w:val="false"/>
                 <w:bCs w:val="false"/>
                 <w:color w:val="2B2620"/>
@@ -654,7 +654,7 @@
           <w:p>
             <w:r>
               <w:rPr>
-                <w:rFonts w:ascii="Georgia" w:cs="Georgia" w:eastAsia="Georgia" w:hAnsi="Georgia"/>
+                <w:rFonts w:ascii="Arial" w:cs="Arial" w:eastAsia="Arial" w:hAnsi="Arial"/>
                 <w:b w:val="false"/>
                 <w:bCs w:val="false"/>
                 <w:color w:val="2B2620"/>
@@ -682,7 +682,7 @@
           <w:p>
             <w:r>
               <w:rPr>
-                <w:rFonts w:ascii="Georgia" w:cs="Georgia" w:eastAsia="Georgia" w:hAnsi="Georgia"/>
+                <w:rFonts w:ascii="Arial" w:cs="Arial" w:eastAsia="Arial" w:hAnsi="Arial"/>
                 <w:b w:val="false"/>
                 <w:bCs w:val="false"/>
                 <w:color w:val="2B2620"/>
@@ -708,7 +708,7 @@
           <w:p>
             <w:r>
               <w:rPr>
-                <w:rFonts w:ascii="Georgia" w:cs="Georgia" w:eastAsia="Georgia" w:hAnsi="Georgia"/>
+                <w:rFonts w:ascii="Arial" w:cs="Arial" w:eastAsia="Arial" w:hAnsi="Arial"/>
                 <w:b w:val="false"/>
                 <w:bCs w:val="false"/>
                 <w:color w:val="2B2620"/>
@@ -734,7 +734,7 @@
           <w:p>
             <w:r>
               <w:rPr>
-                <w:rFonts w:ascii="Georgia" w:cs="Georgia" w:eastAsia="Georgia" w:hAnsi="Georgia"/>
+                <w:rFonts w:ascii="Arial" w:cs="Arial" w:eastAsia="Arial" w:hAnsi="Arial"/>
                 <w:b w:val="false"/>
                 <w:bCs w:val="false"/>
                 <w:color w:val="2B2620"/>
@@ -760,7 +760,7 @@
           <w:p>
             <w:r>
               <w:rPr>
-                <w:rFonts w:ascii="Georgia" w:cs="Georgia" w:eastAsia="Georgia" w:hAnsi="Georgia"/>
+                <w:rFonts w:ascii="Arial" w:cs="Arial" w:eastAsia="Arial" w:hAnsi="Arial"/>
                 <w:b w:val="false"/>
                 <w:bCs w:val="false"/>
                 <w:color w:val="2B2620"/>
@@ -788,7 +788,7 @@
           <w:p>
             <w:r>
               <w:rPr>
-                <w:rFonts w:ascii="Georgia" w:cs="Georgia" w:eastAsia="Georgia" w:hAnsi="Georgia"/>
+                <w:rFonts w:ascii="Arial" w:cs="Arial" w:eastAsia="Arial" w:hAnsi="Arial"/>
                 <w:b w:val="false"/>
                 <w:bCs w:val="false"/>
                 <w:color w:val="2B2620"/>
@@ -814,7 +814,7 @@
           <w:p>
             <w:r>
               <w:rPr>
-                <w:rFonts w:ascii="Georgia" w:cs="Georgia" w:eastAsia="Georgia" w:hAnsi="Georgia"/>
+                <w:rFonts w:ascii="Arial" w:cs="Arial" w:eastAsia="Arial" w:hAnsi="Arial"/>
                 <w:b w:val="false"/>
                 <w:bCs w:val="false"/>
                 <w:color w:val="2B2620"/>
@@ -840,7 +840,7 @@
           <w:p>
             <w:r>
               <w:rPr>
-                <w:rFonts w:ascii="Georgia" w:cs="Georgia" w:eastAsia="Georgia" w:hAnsi="Georgia"/>
+                <w:rFonts w:ascii="Arial" w:cs="Arial" w:eastAsia="Arial" w:hAnsi="Arial"/>
                 <w:b w:val="false"/>
                 <w:bCs w:val="false"/>
                 <w:color w:val="2B2620"/>
@@ -866,7 +866,7 @@
           <w:p>
             <w:r>
               <w:rPr>
-                <w:rFonts w:ascii="Georgia" w:cs="Georgia" w:eastAsia="Georgia" w:hAnsi="Georgia"/>
+                <w:rFonts w:ascii="Arial" w:cs="Arial" w:eastAsia="Arial" w:hAnsi="Arial"/>
                 <w:b w:val="false"/>
                 <w:bCs w:val="false"/>
                 <w:color w:val="2B2620"/>
@@ -894,7 +894,7 @@
           <w:p>
             <w:r>
               <w:rPr>
-                <w:rFonts w:ascii="Georgia" w:cs="Georgia" w:eastAsia="Georgia" w:hAnsi="Georgia"/>
+                <w:rFonts w:ascii="Arial" w:cs="Arial" w:eastAsia="Arial" w:hAnsi="Arial"/>
                 <w:b w:val="false"/>
                 <w:bCs w:val="false"/>
                 <w:color w:val="2B2620"/>
@@ -920,7 +920,7 @@
           <w:p>
             <w:r>
               <w:rPr>
-                <w:rFonts w:ascii="Georgia" w:cs="Georgia" w:eastAsia="Georgia" w:hAnsi="Georgia"/>
+                <w:rFonts w:ascii="Arial" w:cs="Arial" w:eastAsia="Arial" w:hAnsi="Arial"/>
                 <w:b w:val="false"/>
                 <w:bCs w:val="false"/>
                 <w:color w:val="2B2620"/>
@@ -946,7 +946,7 @@
           <w:p>
             <w:r>
               <w:rPr>
-                <w:rFonts w:ascii="Georgia" w:cs="Georgia" w:eastAsia="Georgia" w:hAnsi="Georgia"/>
+                <w:rFonts w:ascii="Arial" w:cs="Arial" w:eastAsia="Arial" w:hAnsi="Arial"/>
                 <w:b w:val="false"/>
                 <w:bCs w:val="false"/>
                 <w:color w:val="2B2620"/>
@@ -972,7 +972,7 @@
           <w:p>
             <w:r>
               <w:rPr>
-                <w:rFonts w:ascii="Georgia" w:cs="Georgia" w:eastAsia="Georgia" w:hAnsi="Georgia"/>
+                <w:rFonts w:ascii="Arial" w:cs="Arial" w:eastAsia="Arial" w:hAnsi="Arial"/>
                 <w:b w:val="false"/>
                 <w:bCs w:val="false"/>
                 <w:color w:val="2B2620"/>
@@ -1000,7 +1000,7 @@
           <w:p>
             <w:r>
               <w:rPr>
-                <w:rFonts w:ascii="Georgia" w:cs="Georgia" w:eastAsia="Georgia" w:hAnsi="Georgia"/>
+                <w:rFonts w:ascii="Arial" w:cs="Arial" w:eastAsia="Arial" w:hAnsi="Arial"/>
                 <w:b w:val="false"/>
                 <w:bCs w:val="false"/>
                 <w:color w:val="2B2620"/>
@@ -1026,7 +1026,7 @@
           <w:p>
             <w:r>
               <w:rPr>
-                <w:rFonts w:ascii="Georgia" w:cs="Georgia" w:eastAsia="Georgia" w:hAnsi="Georgia"/>
+                <w:rFonts w:ascii="Arial" w:cs="Arial" w:eastAsia="Arial" w:hAnsi="Arial"/>
                 <w:b w:val="false"/>
                 <w:bCs w:val="false"/>
                 <w:color w:val="2B2620"/>
@@ -1052,7 +1052,7 @@
           <w:p>
             <w:r>
               <w:rPr>
-                <w:rFonts w:ascii="Georgia" w:cs="Georgia" w:eastAsia="Georgia" w:hAnsi="Georgia"/>
+                <w:rFonts w:ascii="Arial" w:cs="Arial" w:eastAsia="Arial" w:hAnsi="Arial"/>
                 <w:b w:val="false"/>
                 <w:bCs w:val="false"/>
                 <w:color w:val="2B2620"/>
@@ -1078,7 +1078,7 @@
           <w:p>
             <w:r>
               <w:rPr>
-                <w:rFonts w:ascii="Georgia" w:cs="Georgia" w:eastAsia="Georgia" w:hAnsi="Georgia"/>
+                <w:rFonts w:ascii="Arial" w:cs="Arial" w:eastAsia="Arial" w:hAnsi="Arial"/>
                 <w:b w:val="false"/>
                 <w:bCs w:val="false"/>
                 <w:color w:val="2B2620"/>
@@ -1106,7 +1106,7 @@
           <w:p>
             <w:r>
               <w:rPr>
-                <w:rFonts w:ascii="Georgia" w:cs="Georgia" w:eastAsia="Georgia" w:hAnsi="Georgia"/>
+                <w:rFonts w:ascii="Arial" w:cs="Arial" w:eastAsia="Arial" w:hAnsi="Arial"/>
                 <w:b w:val="false"/>
                 <w:bCs w:val="false"/>
                 <w:color w:val="2B2620"/>
@@ -1132,7 +1132,7 @@
           <w:p>
             <w:r>
               <w:rPr>
-                <w:rFonts w:ascii="Georgia" w:cs="Georgia" w:eastAsia="Georgia" w:hAnsi="Georgia"/>
+                <w:rFonts w:ascii="Arial" w:cs="Arial" w:eastAsia="Arial" w:hAnsi="Arial"/>
                 <w:b w:val="false"/>
                 <w:bCs w:val="false"/>
                 <w:color w:val="2B2620"/>
@@ -1158,7 +1158,7 @@
           <w:p>
             <w:r>
               <w:rPr>
-                <w:rFonts w:ascii="Georgia" w:cs="Georgia" w:eastAsia="Georgia" w:hAnsi="Georgia"/>
+                <w:rFonts w:ascii="Arial" w:cs="Arial" w:eastAsia="Arial" w:hAnsi="Arial"/>
                 <w:b w:val="false"/>
                 <w:bCs w:val="false"/>
                 <w:color w:val="2B2620"/>
@@ -1184,7 +1184,7 @@
           <w:p>
             <w:r>
               <w:rPr>
-                <w:rFonts w:ascii="Georgia" w:cs="Georgia" w:eastAsia="Georgia" w:hAnsi="Georgia"/>
+                <w:rFonts w:ascii="Arial" w:cs="Arial" w:eastAsia="Arial" w:hAnsi="Arial"/>
                 <w:b w:val="false"/>
                 <w:bCs w:val="false"/>
                 <w:color w:val="2B2620"/>
@@ -1212,7 +1212,7 @@
           <w:p>
             <w:r>
               <w:rPr>
-                <w:rFonts w:ascii="Georgia" w:cs="Georgia" w:eastAsia="Georgia" w:hAnsi="Georgia"/>
+                <w:rFonts w:ascii="Arial" w:cs="Arial" w:eastAsia="Arial" w:hAnsi="Arial"/>
                 <w:b w:val="false"/>
                 <w:bCs w:val="false"/>
                 <w:color w:val="2B2620"/>
@@ -1238,7 +1238,7 @@
           <w:p>
             <w:r>
               <w:rPr>
-                <w:rFonts w:ascii="Georgia" w:cs="Georgia" w:eastAsia="Georgia" w:hAnsi="Georgia"/>
+                <w:rFonts w:ascii="Arial" w:cs="Arial" w:eastAsia="Arial" w:hAnsi="Arial"/>
                 <w:b w:val="false"/>
                 <w:bCs w:val="false"/>
                 <w:color w:val="2B2620"/>
@@ -1264,7 +1264,7 @@
           <w:p>
             <w:r>
               <w:rPr>
-                <w:rFonts w:ascii="Georgia" w:cs="Georgia" w:eastAsia="Georgia" w:hAnsi="Georgia"/>
+                <w:rFonts w:ascii="Arial" w:cs="Arial" w:eastAsia="Arial" w:hAnsi="Arial"/>
                 <w:b w:val="false"/>
                 <w:bCs w:val="false"/>
                 <w:color w:val="2B2620"/>
@@ -1290,7 +1290,7 @@
           <w:p>
             <w:r>
               <w:rPr>
-                <w:rFonts w:ascii="Georgia" w:cs="Georgia" w:eastAsia="Georgia" w:hAnsi="Georgia"/>
+                <w:rFonts w:ascii="Arial" w:cs="Arial" w:eastAsia="Arial" w:hAnsi="Arial"/>
                 <w:b w:val="false"/>
                 <w:bCs w:val="false"/>
                 <w:color w:val="2B2620"/>
@@ -1318,7 +1318,7 @@
           <w:p>
             <w:r>
               <w:rPr>
-                <w:rFonts w:ascii="Georgia" w:cs="Georgia" w:eastAsia="Georgia" w:hAnsi="Georgia"/>
+                <w:rFonts w:ascii="Arial" w:cs="Arial" w:eastAsia="Arial" w:hAnsi="Arial"/>
                 <w:b w:val="false"/>
                 <w:bCs w:val="false"/>
                 <w:color w:val="2B2620"/>
@@ -1344,7 +1344,7 @@
           <w:p>
             <w:r>
               <w:rPr>
-                <w:rFonts w:ascii="Georgia" w:cs="Georgia" w:eastAsia="Georgia" w:hAnsi="Georgia"/>
+                <w:rFonts w:ascii="Arial" w:cs="Arial" w:eastAsia="Arial" w:hAnsi="Arial"/>
                 <w:b w:val="false"/>
                 <w:bCs w:val="false"/>
                 <w:color w:val="2B2620"/>
@@ -1370,7 +1370,7 @@
           <w:p>
             <w:r>
               <w:rPr>
-                <w:rFonts w:ascii="Georgia" w:cs="Georgia" w:eastAsia="Georgia" w:hAnsi="Georgia"/>
+                <w:rFonts w:ascii="Arial" w:cs="Arial" w:eastAsia="Arial" w:hAnsi="Arial"/>
                 <w:b w:val="false"/>
                 <w:bCs w:val="false"/>
                 <w:color w:val="2B2620"/>
@@ -1396,7 +1396,7 @@
           <w:p>
             <w:r>
               <w:rPr>
-                <w:rFonts w:ascii="Georgia" w:cs="Georgia" w:eastAsia="Georgia" w:hAnsi="Georgia"/>
+                <w:rFonts w:ascii="Arial" w:cs="Arial" w:eastAsia="Arial" w:hAnsi="Arial"/>
                 <w:b w:val="false"/>
                 <w:bCs w:val="false"/>
                 <w:color w:val="2B2620"/>
@@ -1424,7 +1424,7 @@
           <w:p>
             <w:r>
               <w:rPr>
-                <w:rFonts w:ascii="Georgia" w:cs="Georgia" w:eastAsia="Georgia" w:hAnsi="Georgia"/>
+                <w:rFonts w:ascii="Arial" w:cs="Arial" w:eastAsia="Arial" w:hAnsi="Arial"/>
                 <w:b w:val="false"/>
                 <w:bCs w:val="false"/>
                 <w:color w:val="2B2620"/>
@@ -1450,7 +1450,7 @@
           <w:p>
             <w:r>
               <w:rPr>
-                <w:rFonts w:ascii="Georgia" w:cs="Georgia" w:eastAsia="Georgia" w:hAnsi="Georgia"/>
+                <w:rFonts w:ascii="Arial" w:cs="Arial" w:eastAsia="Arial" w:hAnsi="Arial"/>
                 <w:b w:val="false"/>
                 <w:bCs w:val="false"/>
                 <w:color w:val="2B2620"/>
@@ -1476,7 +1476,7 @@
           <w:p>
             <w:r>
               <w:rPr>
-                <w:rFonts w:ascii="Georgia" w:cs="Georgia" w:eastAsia="Georgia" w:hAnsi="Georgia"/>
+                <w:rFonts w:ascii="Arial" w:cs="Arial" w:eastAsia="Arial" w:hAnsi="Arial"/>
                 <w:b w:val="false"/>
                 <w:bCs w:val="false"/>
                 <w:color w:val="2B2620"/>
@@ -1502,7 +1502,7 @@
           <w:p>
             <w:r>
               <w:rPr>
-                <w:rFonts w:ascii="Georgia" w:cs="Georgia" w:eastAsia="Georgia" w:hAnsi="Georgia"/>
+                <w:rFonts w:ascii="Arial" w:cs="Arial" w:eastAsia="Arial" w:hAnsi="Arial"/>
                 <w:b w:val="false"/>
                 <w:bCs w:val="false"/>
                 <w:color w:val="2B2620"/>
@@ -1530,7 +1530,7 @@
           <w:p>
             <w:r>
               <w:rPr>
-                <w:rFonts w:ascii="Georgia" w:cs="Georgia" w:eastAsia="Georgia" w:hAnsi="Georgia"/>
+                <w:rFonts w:ascii="Arial" w:cs="Arial" w:eastAsia="Arial" w:hAnsi="Arial"/>
                 <w:b w:val="false"/>
                 <w:bCs w:val="false"/>
                 <w:color w:val="2B2620"/>
@@ -1556,7 +1556,7 @@
           <w:p>
             <w:r>
               <w:rPr>
-                <w:rFonts w:ascii="Georgia" w:cs="Georgia" w:eastAsia="Georgia" w:hAnsi="Georgia"/>
+                <w:rFonts w:ascii="Arial" w:cs="Arial" w:eastAsia="Arial" w:hAnsi="Arial"/>
                 <w:b w:val="false"/>
                 <w:bCs w:val="false"/>
                 <w:color w:val="2B2620"/>
@@ -1582,7 +1582,7 @@
           <w:p>
             <w:r>
               <w:rPr>
-                <w:rFonts w:ascii="Georgia" w:cs="Georgia" w:eastAsia="Georgia" w:hAnsi="Georgia"/>
+                <w:rFonts w:ascii="Arial" w:cs="Arial" w:eastAsia="Arial" w:hAnsi="Arial"/>
                 <w:b w:val="false"/>
                 <w:bCs w:val="false"/>
                 <w:color w:val="2B2620"/>
@@ -1608,7 +1608,7 @@
           <w:p>
             <w:r>
               <w:rPr>
-                <w:rFonts w:ascii="Georgia" w:cs="Georgia" w:eastAsia="Georgia" w:hAnsi="Georgia"/>
+                <w:rFonts w:ascii="Arial" w:cs="Arial" w:eastAsia="Arial" w:hAnsi="Arial"/>
                 <w:b w:val="false"/>
                 <w:bCs w:val="false"/>
                 <w:color w:val="2B2620"/>
@@ -1636,7 +1636,7 @@
           <w:p>
             <w:r>
               <w:rPr>
-                <w:rFonts w:ascii="Georgia" w:cs="Georgia" w:eastAsia="Georgia" w:hAnsi="Georgia"/>
+                <w:rFonts w:ascii="Arial" w:cs="Arial" w:eastAsia="Arial" w:hAnsi="Arial"/>
                 <w:b w:val="false"/>
                 <w:bCs w:val="false"/>
                 <w:color w:val="2B2620"/>
@@ -1662,7 +1662,7 @@
           <w:p>
             <w:r>
               <w:rPr>
-                <w:rFonts w:ascii="Georgia" w:cs="Georgia" w:eastAsia="Georgia" w:hAnsi="Georgia"/>
+                <w:rFonts w:ascii="Arial" w:cs="Arial" w:eastAsia="Arial" w:hAnsi="Arial"/>
                 <w:b w:val="false"/>
                 <w:bCs w:val="false"/>
                 <w:color w:val="2B2620"/>
@@ -1688,7 +1688,7 @@
           <w:p>
             <w:r>
               <w:rPr>
-                <w:rFonts w:ascii="Georgia" w:cs="Georgia" w:eastAsia="Georgia" w:hAnsi="Georgia"/>
+                <w:rFonts w:ascii="Arial" w:cs="Arial" w:eastAsia="Arial" w:hAnsi="Arial"/>
                 <w:b w:val="false"/>
                 <w:bCs w:val="false"/>
                 <w:color w:val="2B2620"/>
@@ -1714,7 +1714,7 @@
           <w:p>
             <w:r>
               <w:rPr>
-                <w:rFonts w:ascii="Georgia" w:cs="Georgia" w:eastAsia="Georgia" w:hAnsi="Georgia"/>
+                <w:rFonts w:ascii="Arial" w:cs="Arial" w:eastAsia="Arial" w:hAnsi="Arial"/>
                 <w:b w:val="false"/>
                 <w:bCs w:val="false"/>
                 <w:color w:val="2B2620"/>
@@ -1742,7 +1742,7 @@
           <w:p>
             <w:r>
               <w:rPr>
-                <w:rFonts w:ascii="Georgia" w:cs="Georgia" w:eastAsia="Georgia" w:hAnsi="Georgia"/>
+                <w:rFonts w:ascii="Arial" w:cs="Arial" w:eastAsia="Arial" w:hAnsi="Arial"/>
                 <w:b w:val="false"/>
                 <w:bCs w:val="false"/>
                 <w:color w:val="2B2620"/>
@@ -1768,7 +1768,7 @@
           <w:p>
             <w:r>
               <w:rPr>
-                <w:rFonts w:ascii="Georgia" w:cs="Georgia" w:eastAsia="Georgia" w:hAnsi="Georgia"/>
+                <w:rFonts w:ascii="Arial" w:cs="Arial" w:eastAsia="Arial" w:hAnsi="Arial"/>
                 <w:b w:val="false"/>
                 <w:bCs w:val="false"/>
                 <w:color w:val="2B2620"/>
@@ -1794,7 +1794,7 @@
           <w:p>
             <w:r>
               <w:rPr>
-                <w:rFonts w:ascii="Georgia" w:cs="Georgia" w:eastAsia="Georgia" w:hAnsi="Georgia"/>
+                <w:rFonts w:ascii="Arial" w:cs="Arial" w:eastAsia="Arial" w:hAnsi="Arial"/>
                 <w:b w:val="false"/>
                 <w:bCs w:val="false"/>
                 <w:color w:val="2B2620"/>
@@ -1820,7 +1820,7 @@
           <w:p>
             <w:r>
               <w:rPr>
-                <w:rFonts w:ascii="Georgia" w:cs="Georgia" w:eastAsia="Georgia" w:hAnsi="Georgia"/>
+                <w:rFonts w:ascii="Arial" w:cs="Arial" w:eastAsia="Arial" w:hAnsi="Arial"/>
                 <w:b w:val="false"/>
                 <w:bCs w:val="false"/>
                 <w:color w:val="2B2620"/>
@@ -1847,7 +1847,7 @@
       </w:pPr>
       <w:r>
         <w:rPr>
-          <w:rFonts w:ascii="Georgia" w:cs="Georgia" w:eastAsia="Georgia" w:hAnsi="Georgia"/>
+          <w:rFonts w:ascii="Arial" w:cs="Arial" w:eastAsia="Arial" w:hAnsi="Arial"/>
           <w:b/>
           <w:bCs/>
           <w:color w:val="5B2333"/>
@@ -1863,7 +1863,7 @@
       </w:pPr>
       <w:r>
         <w:rPr>
-          <w:rFonts w:ascii="Georgia" w:cs="Georgia" w:eastAsia="Georgia" w:hAnsi="Georgia"/>
+          <w:rFonts w:ascii="Arial" w:cs="Arial" w:eastAsia="Arial" w:hAnsi="Arial"/>
           <w:i/>
           <w:iCs/>
           <w:color w:val="A6803C"/>
@@ -1880,27 +1880,12 @@
       </w:pPr>
       <w:r>
         <w:rPr>
-          <w:rFonts w:ascii="Georgia" w:cs="Georgia" w:eastAsia="Georgia" w:hAnsi="Georgia"/>
+          <w:rFonts w:ascii="Arial" w:cs="Arial" w:eastAsia="Arial" w:hAnsi="Arial"/>
           <w:color w:val="2B2620"/>
           <w:sz w:val="22"/>
           <w:szCs w:val="22"/>
         </w:rPr>
-        <w:t xml:space="preserve">Deine Sonne steht bei 7°48' Waage, dein Aszendent bei 9°00' Waage – die beiden liegen nur gut ein Grad auseinander. Das ist eine seltene, sehr enge Konjunktion: Das, was du im Kern bist (Sonne), und das, wie du auf andere triffst und zuerst wahrgenommen wirst (Aszendent), sind bei dir fast deckungsgleich. Es gibt wenig Diskrepanz zwischen innen und außen – du wirkst so, wie du bist.</w:t>
-      </w:r>
-    </w:p>
-    <w:p>
-      <w:pPr>
-        <w:spacing w:after="200" w:line="320"/>
-        <w:jc w:val="both"/>
-      </w:pPr>
-      <w:r>
-        <w:rPr>
-          <w:rFonts w:ascii="Georgia" w:cs="Georgia" w:eastAsia="Georgia" w:hAnsi="Georgia"/>
-          <w:color w:val="2B2620"/>
-          <w:sz w:val="22"/>
-          <w:szCs w:val="22"/>
-        </w:rPr>
-        <w:t xml:space="preserve">Die Waage ist das Zeichen der Beziehung, der Ästhetik und des Ausgleichs. Ihr Grundthema ist das Gegenüber: Du denkst, fühlst und entscheidest oft im Bezug zu einem Du – im Gespräch, im Abwägen, im gemeinsamen Gestalten. Ihr Herrscherplanet ist Venus, der Planet der Anziehung und Harmonie – kein Zufall, dass genau dieser Planet weiter unten noch einmal eine zentrale Rolle spielt. Menschen mit ausgeprägter Waage-Energie gelten als charmant, diplomatisch und harmoniebedürftig – manchmal auch als abwägend, weil ihnen mehrere Seiten einer Sache gleichzeitig einleuchten.</w:t>
+        <w:t xml:space="preserve">Deine Sonne (7°48' Waage) und dein Aszendent (9°00' Waage) liegen nur gut ein Grad auseinander – eine seltene, enge Konjunktion. Was du im Kern bist und wie du zuerst wahrgenommen wirst, ist bei dir fast deckungsgleich: Du wirkst so, wie du bist. Die Waage ist das Zeichen der Beziehung, der Ästhetik und des Ausgleichs; ihr Herrscherplanet Venus spielt weiter unten noch einmal eine zentrale Rolle. Typisch dafür: Charme, Diplomatie und ein starkes Bedürfnis nach Harmonie – manchmal gepaart mit Abwägen, weil dir mehrere Seiten einer Sache gleichzeitig einleuchten.</w:t>
       </w:r>
     </w:p>
     <w:p>
@@ -1912,7 +1897,7 @@
       </w:pPr>
       <w:r>
         <w:rPr>
-          <w:rFonts w:ascii="Georgia" w:cs="Georgia" w:eastAsia="Georgia" w:hAnsi="Georgia"/>
+          <w:rFonts w:ascii="Arial" w:cs="Arial" w:eastAsia="Arial" w:hAnsi="Arial"/>
           <w:b/>
           <w:bCs/>
           <w:color w:val="5B2333"/>
@@ -1928,7 +1913,7 @@
       </w:pPr>
       <w:r>
         <w:rPr>
-          <w:rFonts w:ascii="Georgia" w:cs="Georgia" w:eastAsia="Georgia" w:hAnsi="Georgia"/>
+          <w:rFonts w:ascii="Arial" w:cs="Arial" w:eastAsia="Arial" w:hAnsi="Arial"/>
           <w:i/>
           <w:iCs/>
           <w:color w:val="A6803C"/>
@@ -1945,27 +1930,12 @@
       </w:pPr>
       <w:r>
         <w:rPr>
-          <w:rFonts w:ascii="Georgia" w:cs="Georgia" w:eastAsia="Georgia" w:hAnsi="Georgia"/>
+          <w:rFonts w:ascii="Arial" w:cs="Arial" w:eastAsia="Arial" w:hAnsi="Arial"/>
           <w:color w:val="2B2620"/>
           <w:sz w:val="22"/>
           <w:szCs w:val="22"/>
         </w:rPr>
-        <w:t xml:space="preserve">Dein Mond steht im Krebs – seinem eigenen Zeichen. Das gibt deinem Gefühlsleben eine natürliche Tiefe und Fürsorglichkeit. Der Mond steht dafür, was dich innerlich nährt, wie du auf Sicherheit reagierst und wie du fühlst, wenn niemand hinschaut.</w:t>
-      </w:r>
-    </w:p>
-    <w:p>
-      <w:pPr>
-        <w:spacing w:after="200" w:line="320"/>
-        <w:jc w:val="both"/>
-      </w:pPr>
-      <w:r>
-        <w:rPr>
-          <w:rFonts w:ascii="Georgia" w:cs="Georgia" w:eastAsia="Georgia" w:hAnsi="Georgia"/>
-          <w:color w:val="2B2620"/>
-          <w:sz w:val="22"/>
-          <w:szCs w:val="22"/>
-        </w:rPr>
-        <w:t xml:space="preserve">Bemerkenswert ist, dass dieser Mond im 10. Haus steht, nahe am Medium Coeli – dem Symbol für Berufung, Wirkung nach außen und Lebensrichtung. Das verbindet dein Innerstes, Fürsorge und Emotion, mit deiner Rolle nach außen. Es deutet auf jemanden hin, dessen Wirken mit Kümmern, Nähren, Beschützen oder Zuhause-Schaffen zu tun hat – im wörtlichen Sinn oder übertragen, als jemand, der für andere ein sicherer Hafen ist.</w:t>
+        <w:t xml:space="preserve">Dein Mond steht im Krebs, seinem eigenen Zeichen – das gibt deinem Gefühlsleben natürliche Tiefe und Fürsorglichkeit. Bemerkenswert: Er steht im 10. Haus, nahe am Medium Coeli, dem Symbol für Berufung und Wirkung nach außen. Das verbindet dein Innerstes mit deiner Rolle in der Welt und deutet auf jemanden hin, dessen Wirken mit Kümmern, Nähren und Zuhause-Schaffen zu tun hat – wörtlich oder als jemand, der für andere ein sicherer Hafen ist.</w:t>
       </w:r>
     </w:p>
     <w:p>
@@ -1977,7 +1947,7 @@
       </w:pPr>
       <w:r>
         <w:rPr>
-          <w:rFonts w:ascii="Georgia" w:cs="Georgia" w:eastAsia="Georgia" w:hAnsi="Georgia"/>
+          <w:rFonts w:ascii="Arial" w:cs="Arial" w:eastAsia="Arial" w:hAnsi="Arial"/>
           <w:b/>
           <w:bCs/>
           <w:color w:val="5B2333"/>
@@ -1993,7 +1963,7 @@
       </w:pPr>
       <w:r>
         <w:rPr>
-          <w:rFonts w:ascii="Georgia" w:cs="Georgia" w:eastAsia="Georgia" w:hAnsi="Georgia"/>
+          <w:rFonts w:ascii="Arial" w:cs="Arial" w:eastAsia="Arial" w:hAnsi="Arial"/>
           <w:i/>
           <w:iCs/>
           <w:color w:val="A6803C"/>
@@ -2010,27 +1980,12 @@
       </w:pPr>
       <w:r>
         <w:rPr>
-          <w:rFonts w:ascii="Georgia" w:cs="Georgia" w:eastAsia="Georgia" w:hAnsi="Georgia"/>
+          <w:rFonts w:ascii="Arial" w:cs="Arial" w:eastAsia="Arial" w:hAnsi="Arial"/>
           <w:color w:val="2B2620"/>
           <w:sz w:val="22"/>
           <w:szCs w:val="22"/>
         </w:rPr>
-        <w:t xml:space="preserve">Gleich drei Planeten stehen bei dir im Skorpion, im 2. Haus der Werte und Ressourcen: Merkur (Denken und Sprache), Mars (Antrieb und Wille) und Neptun (Intuition und Sehnsucht). Der Skorpion meidet das Oberflächliche – du denkst und handelst am liebsten mit Substanz, gehst Dingen auf den Grund und hast einen Sinn für das, was unter der Oberfläche liegt, bei Themen wie bei Menschen. Diese Kombination gibt dir eine forschende, unbestechliche Beobachtungsgabe und eine stille Intensität im Wollen.</w:t>
-      </w:r>
-    </w:p>
-    <w:p>
-      <w:pPr>
-        <w:spacing w:after="200" w:line="320"/>
-        <w:jc w:val="both"/>
-      </w:pPr>
-      <w:r>
-        <w:rPr>
-          <w:rFonts w:ascii="Georgia" w:cs="Georgia" w:eastAsia="Georgia" w:hAnsi="Georgia"/>
-          <w:color w:val="2B2620"/>
-          <w:sz w:val="22"/>
-          <w:szCs w:val="22"/>
-        </w:rPr>
-        <w:t xml:space="preserve">Weil all das im 2. Haus steht, ist dieser Scharfsinn eng mit deinem Sicherheitsgefühl und deinen Werten verknüpft: Du willst wissen, worauf du bauen kannst – oberflächliche Sicherheiten reichen dir nicht. Neptun bringt zusätzlich Intuition und eine feine, manchmal auch künstlerische oder spirituelle Ader in diesen Bereich.</w:t>
+        <w:t xml:space="preserve">Merkur, Mars und Neptun stehen gemeinsam im Skorpion, im 2. Haus der Werte. Der Skorpion meidet das Oberflächliche – du gehst Dingen und Menschen am liebsten auf den Grund. Das gibt dir eine forschende, unbestechliche Beobachtungsgabe, eine stille Intensität im Wollen und ein Sicherheitsgefühl, das sich nicht mit Oberflächlichem zufriedengibt. Neptun bringt zusätzlich Intuition und eine feine, fast spirituelle Ader mit.</w:t>
       </w:r>
     </w:p>
     <w:p>
@@ -2042,14 +1997,14 @@
       </w:pPr>
       <w:r>
         <w:rPr>
-          <w:rFonts w:ascii="Georgia" w:cs="Georgia" w:eastAsia="Georgia" w:hAnsi="Georgia"/>
+          <w:rFonts w:ascii="Arial" w:cs="Arial" w:eastAsia="Arial" w:hAnsi="Arial"/>
           <w:b/>
           <w:bCs/>
           <w:color w:val="5B2333"/>
           <w:sz w:val="30"/>
           <w:szCs w:val="30"/>
         </w:rPr>
-        <w:t xml:space="preserve">Liebe und tiefere Beziehungen — Venus und Pluto in Jungfrau im 12. Haus</w:t>
+        <w:t xml:space="preserve">Liebe und tiefere Beziehungen — Venus, Pluto und Neptun</w:t>
       </w:r>
     </w:p>
     <w:p>
@@ -2058,7 +2013,7 @@
       </w:pPr>
       <w:r>
         <w:rPr>
-          <w:rFonts w:ascii="Georgia" w:cs="Georgia" w:eastAsia="Georgia" w:hAnsi="Georgia"/>
+          <w:rFonts w:ascii="Arial" w:cs="Arial" w:eastAsia="Arial" w:hAnsi="Arial"/>
           <w:i/>
           <w:iCs/>
           <w:color w:val="A6803C"/>
@@ -2075,12 +2030,12 @@
       </w:pPr>
       <w:r>
         <w:rPr>
-          <w:rFonts w:ascii="Georgia" w:cs="Georgia" w:eastAsia="Georgia" w:hAnsi="Georgia"/>
+          <w:rFonts w:ascii="Arial" w:cs="Arial" w:eastAsia="Arial" w:hAnsi="Arial"/>
           <w:color w:val="2B2620"/>
           <w:sz w:val="22"/>
           <w:szCs w:val="22"/>
         </w:rPr>
-        <w:t xml:space="preserve">Hier wird es besonders aufschlussreich für die Frage nach tieferen Beziehungen: Deine Venus – Liebe, Anziehung, Werte in der Partnerschaft – steht zusammen mit Pluto – Wandlung, Intensität, das Unbewusste – in der Jungfrau, im 12. Haus, dem Haus des Verborgenen, des Rückzugs, aber auch der stillen, oft bedingungslosen Hingabe.</w:t>
+        <w:t xml:space="preserve">Deine Venus steht zusammen mit Pluto in der Jungfrau, im 12. Haus – dem Haus des Verborgenen und der stillen, oft bedingungslosen Hingabe. Du liebst nicht laut, sondern durch Taten und Dasein; deine tiefsten Gefühle zeigen sich eher im Rückzug zu zweit als auf offener Bühne. Pluto verstärkt das: Liebe ist für dich kein Zeitvertreib, sondern etwas, das verwandeln kann – Beziehungen, die dir etwas bedeuten, gehen bei dir fast automatisch in die Tiefe, mit einer beinahe schicksalhaften Kraft.</w:t>
       </w:r>
     </w:p>
     <w:p>
@@ -2090,57 +2045,12 @@
       </w:pPr>
       <w:r>
         <w:rPr>
-          <w:rFonts w:ascii="Georgia" w:cs="Georgia" w:eastAsia="Georgia" w:hAnsi="Georgia"/>
+          <w:rFonts w:ascii="Arial" w:cs="Arial" w:eastAsia="Arial" w:hAnsi="Arial"/>
           <w:color w:val="2B2620"/>
           <w:sz w:val="22"/>
           <w:szCs w:val="22"/>
         </w:rPr>
-        <w:t xml:space="preserve">Venus in der Jungfrau liebt nicht laut, sondern durch Taten: durch Dasein, durch kleine, verlässliche Gesten, durch Dienst am anderen. Im 12. Haus kommt hinzu, dass deine tiefsten Gefühle sich nicht sofort zeigen, sondern eher im Verborgenen, im Rückzug zu zweit, fernab von Bühne und Öffentlichkeit. Die Nähe zu Pluto verstärkt das: Liebe ist für dich kein Zeitvertreib, sondern etwas, das verwandeln kann. Beziehungen, die dir wirklich etwas bedeuten, gehen bei dir fast automatisch in die Tiefe – mit einer beinahe schicksalhaften Kraft. Enttäuschungen hinterlassen entsprechend auch tiefe Spuren, aber genau diese Fähigkeit zur radikalen emotionalen Ehrlichkeit macht gelingende Beziehungen mit dir ungewöhnlich echt und bedeutungsvoll.</w:t>
-      </w:r>
-    </w:p>
-    <w:p>
-      <w:pPr>
-        <w:spacing w:after="200" w:line="320"/>
-        <w:jc w:val="both"/>
-      </w:pPr>
-      <w:r>
-        <w:rPr>
-          <w:rFonts w:ascii="Georgia" w:cs="Georgia" w:eastAsia="Georgia" w:hAnsi="Georgia"/>
-          <w:color w:val="2B2620"/>
-          <w:sz w:val="22"/>
-          <w:szCs w:val="22"/>
-        </w:rPr>
-        <w:t xml:space="preserve">In Kombination mit deiner Waage-Sonne, die nach außen Ausgleich und Harmonie sucht, entsteht ein spannendes Gegenüber: nach außen diplomatisch und um Balance bemüht, nach innen – in Venus und Pluto im 12. Haus – fähig zu sehr tiefer, fast unausweichlicher Bindung.</w:t>
-      </w:r>
-    </w:p>
-    <w:p>
-      <w:pPr>
-        <w:spacing w:after="200" w:line="320"/>
-        <w:jc w:val="both"/>
-      </w:pPr>
-      <w:r>
-        <w:rPr>
-          <w:rFonts w:ascii="Georgia" w:cs="Georgia" w:eastAsia="Georgia" w:hAnsi="Georgia"/>
-          <w:color w:val="2B2620"/>
-          <w:sz w:val="22"/>
-          <w:szCs w:val="22"/>
-        </w:rPr>
-        <w:t xml:space="preserve">Ein zweiter Faden verstärkt dieses Bild: Neptun, der Planet der Sehnsucht, der Idealisierung und – in seiner schwierigen Ausprägung – der Täuschung, steht bei dir eng bei Merkur und Mars im Skorpion (siehe oben). Klassisch gelesen bedeutet das: Du näherst dich der Liebe mit großer Tiefe und Hingabe, neigst aber dazu, Menschen zunächst durch eine leicht verklärte, sehnsuchtsvolle Linse zu sehen – du siehst im Anderen oft zuerst das Potenzial, das Ideal, das, was sein könnte. Das ist keine Schwäche, sondern die Kehrseite einer großen Fähigkeit zu bedingungsloser Liebe. Die astrologische Einladung dieser Kombination ist eine sehr konkrete: dein Skorpion-Scharfsinn – der eigentlich nichts durchgehen lässt – bewusst auch in der Liebe walten zu lassen, statt ihn dort zugunsten des Neptun-Ideals leiser zu stellen.</w:t>
-      </w:r>
-    </w:p>
-    <w:p>
-      <w:pPr>
-        <w:spacing w:after="200" w:line="320"/>
-        <w:jc w:val="both"/>
-      </w:pPr>
-      <w:r>
-        <w:rPr>
-          <w:rFonts w:ascii="Georgia" w:cs="Georgia" w:eastAsia="Georgia" w:hAnsi="Georgia"/>
-          <w:color w:val="2B2620"/>
-          <w:sz w:val="22"/>
-          <w:szCs w:val="22"/>
-        </w:rPr>
-        <w:t xml:space="preserve">Zusammengenommen zeichnen Venus/Pluto im 12. Haus und Neptun bei Mars/Merkur das Bild einer Frau, deren Liebesfähigkeit ungewöhnlich tief und aufopfernd ist – deren große Lebensaufgabe im Beziehungsbereich aber genau darin liegt, diese Tiefe nicht blind, sondern mit offenen Augen zu verschenken: sich früh und ehrlich zu fragen, ob ein Gegenüber dieser Hingabe tatsächlich entspricht, statt dem eigenen Ideal davon nachzuspüren.</w:t>
+        <w:t xml:space="preserve">Verstärkt wird dieses Bild durch Neptun, der eng bei Merkur und Mars im Skorpion steht: Du näherst dich der Liebe mit großer Hingabe, neigst dabei aber dazu, Menschen zunächst durch eine leicht verklärte Linse zu sehen – du siehst zuerst das Potenzial, das Ideal. Die Einladung dieser Kombination ist konkret: deinen sonst messerscharfen Skorpion-Blick bewusst auch in der Liebe walten zu lassen, statt ihn dort dem Ideal zuliebe leiser zu stellen – die eigene Tiefe mit offenen statt idealisierenden Augen zu verschenken.</w:t>
       </w:r>
     </w:p>
     <w:p>
@@ -2152,7 +2062,7 @@
       </w:pPr>
       <w:r>
         <w:rPr>
-          <w:rFonts w:ascii="Georgia" w:cs="Georgia" w:eastAsia="Georgia" w:hAnsi="Georgia"/>
+          <w:rFonts w:ascii="Arial" w:cs="Arial" w:eastAsia="Arial" w:hAnsi="Arial"/>
           <w:b/>
           <w:bCs/>
           <w:color w:val="5B2333"/>
@@ -2168,7 +2078,7 @@
       </w:pPr>
       <w:r>
         <w:rPr>
-          <w:rFonts w:ascii="Georgia" w:cs="Georgia" w:eastAsia="Georgia" w:hAnsi="Georgia"/>
+          <w:rFonts w:ascii="Arial" w:cs="Arial" w:eastAsia="Arial" w:hAnsi="Arial"/>
           <w:i/>
           <w:iCs/>
           <w:color w:val="A6803C"/>
@@ -2185,27 +2095,12 @@
       </w:pPr>
       <w:r>
         <w:rPr>
-          <w:rFonts w:ascii="Georgia" w:cs="Georgia" w:eastAsia="Georgia" w:hAnsi="Georgia"/>
+          <w:rFonts w:ascii="Arial" w:cs="Arial" w:eastAsia="Arial" w:hAnsi="Arial"/>
           <w:color w:val="2B2620"/>
           <w:sz w:val="22"/>
           <w:szCs w:val="22"/>
         </w:rPr>
-        <w:t xml:space="preserve">Jupiter und Saturn – die beiden 'großen' Planeten der Astrologie – stehen bei dir gemeinsam im Steinbock, im 4. Haus von Familie, Herkunft und innerem Fundament. Eine Jupiter-Saturn-Konjunktion ist selten, sie ereignet sich nur etwa alle zwanzig Jahre und gilt astrologisch als Marker für eine ganze Generation. Bei dir fällt sie zusätzlich in dein persönliches Haus der Wurzeln.</w:t>
-      </w:r>
-    </w:p>
-    <w:p>
-      <w:pPr>
-        <w:spacing w:after="200" w:line="320"/>
-        <w:jc w:val="both"/>
-      </w:pPr>
-      <w:r>
-        <w:rPr>
-          <w:rFonts w:ascii="Georgia" w:cs="Georgia" w:eastAsia="Georgia" w:hAnsi="Georgia"/>
-          <w:color w:val="2B2620"/>
-          <w:sz w:val="22"/>
-          <w:szCs w:val="22"/>
-        </w:rPr>
-        <w:t xml:space="preserve">Das deutet auf ein Leben hin, in dem Wachstum (Jupiter) und Struktur, Verantwortung (Saturn) eng mit deiner Familie, deinem Zuhause oder deiner Herkunft verbunden sind. Möglich, dass du in deiner Familie schon früh eine tragende, verantwortungsvolle Rolle übernommen hast – oder dass du dir im Lauf deines Lebens dein eigenes Fundament, im wörtlichen wie im übertragenen Sinn, mit viel Ausdauer und langem Atem aufgebaut hast. Steinbock-Energie ist geduldig: Sie baut auf Dauer, nicht auf schnellen Erfolg.</w:t>
+        <w:t xml:space="preserve">Jupiter und Saturn stehen gemeinsam im Steinbock, im 4. Haus von Familie und innerem Fundament – eine seltene Konjunktion, die nur etwa alle zwanzig Jahre stattfindet. Das deutet auf ein Leben hin, in dem Wachstum und Verantwortung eng mit Familie, Zuhause oder Herkunft verbunden sind: eine früh übernommene, tragende Rolle, oder ein eigenes Fundament, mit viel Ausdauer und langem Atem aufgebaut.</w:t>
       </w:r>
     </w:p>
     <w:p>
@@ -2217,7 +2112,7 @@
       </w:pPr>
       <w:r>
         <w:rPr>
-          <w:rFonts w:ascii="Georgia" w:cs="Georgia" w:eastAsia="Georgia" w:hAnsi="Georgia"/>
+          <w:rFonts w:ascii="Arial" w:cs="Arial" w:eastAsia="Arial" w:hAnsi="Arial"/>
           <w:b/>
           <w:bCs/>
           <w:color w:val="5B2333"/>
@@ -2233,7 +2128,7 @@
       </w:pPr>
       <w:r>
         <w:rPr>
-          <w:rFonts w:ascii="Georgia" w:cs="Georgia" w:eastAsia="Georgia" w:hAnsi="Georgia"/>
+          <w:rFonts w:ascii="Arial" w:cs="Arial" w:eastAsia="Arial" w:hAnsi="Arial"/>
           <w:i/>
           <w:iCs/>
           <w:color w:val="A6803C"/>
@@ -2250,27 +2145,12 @@
       </w:pPr>
       <w:r>
         <w:rPr>
-          <w:rFonts w:ascii="Georgia" w:cs="Georgia" w:eastAsia="Georgia" w:hAnsi="Georgia"/>
+          <w:rFonts w:ascii="Arial" w:cs="Arial" w:eastAsia="Arial" w:hAnsi="Arial"/>
           <w:color w:val="2B2620"/>
           <w:sz w:val="22"/>
           <w:szCs w:val="22"/>
         </w:rPr>
-        <w:t xml:space="preserve">Der nördliche Mondknoten – in der Astrologie oft als Wachstumsrichtung eines Lebens gelesen – steht bei dir im Löwen, im 11. Haus; der südliche im Wassermann, im 5. Haus. Vereinfacht gesagt: Die vertraute Zone ist der Wassermann – das Kollektiv, die Gruppe, der Blick von außen, vielleicht auch die Neigung, die eigene Individualität zugunsten der Gemeinschaft zurückzustellen. Die Entwicklungsrichtung deines Lebens zeigt jedoch deutlich zum Löwen: dich selbst zu zeigen, deine eigene Kreativität, Wärme und Führungsstärke nicht zu verstecken, sondern strahlen zu lassen.</w:t>
-      </w:r>
-    </w:p>
-    <w:p>
-      <w:pPr>
-        <w:spacing w:after="200" w:line="320"/>
-        <w:jc w:val="both"/>
-      </w:pPr>
-      <w:r>
-        <w:rPr>
-          <w:rFonts w:ascii="Georgia" w:cs="Georgia" w:eastAsia="Georgia" w:hAnsi="Georgia"/>
-          <w:color w:val="2B2620"/>
-          <w:sz w:val="22"/>
-          <w:szCs w:val="22"/>
-        </w:rPr>
-        <w:t xml:space="preserve">Verstärkt wird das durch Uranus, den Planeten der Befreiung und des Eigensinns, der ebenfalls im Löwen und im 11. Haus – Freundschaften, Gemeinschaft, Zukunftsvisionen – steht. Zusammen ergibt das ein Lebensthema: die eigene, unverwechselbare Persönlichkeit innerhalb einer Gruppe oder Gemeinschaft zu leben und einzubringen – nicht angepasst, sondern authentisch.</w:t>
+        <w:t xml:space="preserve">Der südliche Mondknoten im Wassermann (5. Haus) markiert die vertraute Zone: das Kollektiv, der Blick von außen, die eigene Individualität zugunsten der Gemeinschaft zurückzustellen. Der nördliche Mondknoten im Löwen (11. Haus) – verstärkt durch Uranus an derselben Stelle – zeigt die Entwicklungsrichtung: dich selbst, deine Kreativität und Wärme nicht zu verstecken, sondern innerhalb einer Gruppe oder Gemeinschaft strahlen zu lassen – nicht angepasst, sondern authentisch.</w:t>
       </w:r>
     </w:p>
     <w:p>
@@ -2287,7 +2167,7 @@
       </w:pPr>
       <w:r>
         <w:rPr>
-          <w:rFonts w:ascii="Georgia" w:cs="Georgia" w:eastAsia="Georgia" w:hAnsi="Georgia"/>
+          <w:rFonts w:ascii="Arial" w:cs="Arial" w:eastAsia="Arial" w:hAnsi="Arial"/>
           <w:b/>
           <w:bCs/>
           <w:color w:val="5B2333"/>
@@ -2303,7 +2183,7 @@
       </w:pPr>
       <w:r>
         <w:rPr>
-          <w:rFonts w:ascii="Georgia" w:cs="Georgia" w:eastAsia="Georgia" w:hAnsi="Georgia"/>
+          <w:rFonts w:ascii="Arial" w:cs="Arial" w:eastAsia="Arial" w:hAnsi="Arial"/>
           <w:i/>
           <w:iCs/>
           <w:color w:val="A6803C"/>
@@ -2320,7 +2200,7 @@
       </w:pPr>
       <w:r>
         <w:rPr>
-          <w:rFonts w:ascii="Georgia" w:cs="Georgia" w:eastAsia="Georgia" w:hAnsi="Georgia"/>
+          <w:rFonts w:ascii="Arial" w:cs="Arial" w:eastAsia="Arial" w:hAnsi="Arial"/>
           <w:color w:val="2B2620"/>
           <w:sz w:val="22"/>
           <w:szCs w:val="22"/>
@@ -2335,7 +2215,7 @@
       </w:pPr>
       <w:r>
         <w:rPr>
-          <w:rFonts w:ascii="Georgia" w:cs="Georgia" w:eastAsia="Georgia" w:hAnsi="Georgia"/>
+          <w:rFonts w:ascii="Arial" w:cs="Arial" w:eastAsia="Arial" w:hAnsi="Arial"/>
           <w:color w:val="2B2620"/>
           <w:sz w:val="22"/>
           <w:szCs w:val="22"/>
@@ -2350,7 +2230,7 @@
       </w:pPr>
       <w:r>
         <w:rPr>
-          <w:rFonts w:ascii="Georgia" w:cs="Georgia" w:eastAsia="Georgia" w:hAnsi="Georgia"/>
+          <w:rFonts w:ascii="Arial" w:cs="Arial" w:eastAsia="Arial" w:hAnsi="Arial"/>
           <w:color w:val="2B2620"/>
           <w:sz w:val="22"/>
           <w:szCs w:val="22"/>
@@ -2367,7 +2247,7 @@
       </w:pPr>
       <w:r>
         <w:rPr>
-          <w:rFonts w:ascii="Georgia" w:cs="Georgia" w:eastAsia="Georgia" w:hAnsi="Georgia"/>
+          <w:rFonts w:ascii="Arial" w:cs="Arial" w:eastAsia="Arial" w:hAnsi="Arial"/>
           <w:b/>
           <w:bCs/>
           <w:color w:val="5B2333"/>
@@ -2383,7 +2263,7 @@
       </w:pPr>
       <w:r>
         <w:rPr>
-          <w:rFonts w:ascii="Georgia" w:cs="Georgia" w:eastAsia="Georgia" w:hAnsi="Georgia"/>
+          <w:rFonts w:ascii="Arial" w:cs="Arial" w:eastAsia="Arial" w:hAnsi="Arial"/>
           <w:i/>
           <w:iCs/>
           <w:color w:val="A6803C"/>
@@ -2400,7 +2280,7 @@
       </w:pPr>
       <w:r>
         <w:rPr>
-          <w:rFonts w:ascii="Georgia" w:cs="Georgia" w:eastAsia="Georgia" w:hAnsi="Georgia"/>
+          <w:rFonts w:ascii="Arial" w:cs="Arial" w:eastAsia="Arial" w:hAnsi="Arial"/>
           <w:color w:val="2B2620"/>
           <w:sz w:val="22"/>
           <w:szCs w:val="22"/>
@@ -2415,7 +2295,7 @@
       </w:pPr>
       <w:r>
         <w:rPr>
-          <w:rFonts w:ascii="Georgia" w:cs="Georgia" w:eastAsia="Georgia" w:hAnsi="Georgia"/>
+          <w:rFonts w:ascii="Arial" w:cs="Arial" w:eastAsia="Arial" w:hAnsi="Arial"/>
           <w:color w:val="2B2620"/>
           <w:sz w:val="22"/>
           <w:szCs w:val="22"/>
@@ -2432,7 +2312,7 @@
       </w:pPr>
       <w:r>
         <w:rPr>
-          <w:rFonts w:ascii="Georgia" w:cs="Georgia" w:eastAsia="Georgia" w:hAnsi="Georgia"/>
+          <w:rFonts w:ascii="Arial" w:cs="Arial" w:eastAsia="Arial" w:hAnsi="Arial"/>
           <w:b/>
           <w:bCs/>
           <w:color w:val="5B2333"/>
@@ -2448,7 +2328,7 @@
       </w:pPr>
       <w:r>
         <w:rPr>
-          <w:rFonts w:ascii="Georgia" w:cs="Georgia" w:eastAsia="Georgia" w:hAnsi="Georgia"/>
+          <w:rFonts w:ascii="Arial" w:cs="Arial" w:eastAsia="Arial" w:hAnsi="Arial"/>
           <w:i/>
           <w:iCs/>
           <w:color w:val="A6803C"/>
@@ -2465,7 +2345,7 @@
       </w:pPr>
       <w:r>
         <w:rPr>
-          <w:rFonts w:ascii="Georgia" w:cs="Georgia" w:eastAsia="Georgia" w:hAnsi="Georgia"/>
+          <w:rFonts w:ascii="Arial" w:cs="Arial" w:eastAsia="Arial" w:hAnsi="Arial"/>
           <w:color w:val="2B2620"/>
           <w:sz w:val="22"/>
           <w:szCs w:val="22"/>
@@ -2480,7 +2360,7 @@
       </w:pPr>
       <w:r>
         <w:rPr>
-          <w:rFonts w:ascii="Georgia" w:cs="Georgia" w:eastAsia="Georgia" w:hAnsi="Georgia"/>
+          <w:rFonts w:ascii="Arial" w:cs="Arial" w:eastAsia="Arial" w:hAnsi="Arial"/>
           <w:color w:val="2B2620"/>
           <w:sz w:val="22"/>
           <w:szCs w:val="22"/>
@@ -2495,7 +2375,7 @@
       </w:pPr>
       <w:r>
         <w:rPr>
-          <w:rFonts w:ascii="Georgia" w:cs="Georgia" w:eastAsia="Georgia" w:hAnsi="Georgia"/>
+          <w:rFonts w:ascii="Arial" w:cs="Arial" w:eastAsia="Arial" w:hAnsi="Arial"/>
           <w:color w:val="2B2620"/>
           <w:sz w:val="22"/>
           <w:szCs w:val="22"/>
@@ -2510,7 +2390,7 @@
       </w:pPr>
       <w:r>
         <w:rPr>
-          <w:rFonts w:ascii="Georgia" w:cs="Georgia" w:eastAsia="Georgia" w:hAnsi="Georgia"/>
+          <w:rFonts w:ascii="Arial" w:cs="Arial" w:eastAsia="Arial" w:hAnsi="Arial"/>
           <w:color w:val="2B2620"/>
           <w:sz w:val="22"/>
           <w:szCs w:val="22"/>
@@ -2525,7 +2405,7 @@
       </w:pPr>
       <w:r>
         <w:rPr>
-          <w:rFonts w:ascii="Georgia" w:cs="Georgia" w:eastAsia="Georgia" w:hAnsi="Georgia"/>
+          <w:rFonts w:ascii="Arial" w:cs="Arial" w:eastAsia="Arial" w:hAnsi="Arial"/>
           <w:color w:val="2B2620"/>
           <w:sz w:val="22"/>
           <w:szCs w:val="22"/>
@@ -2540,7 +2420,7 @@
       </w:pPr>
       <w:r>
         <w:rPr>
-          <w:rFonts w:ascii="Georgia" w:cs="Georgia" w:eastAsia="Georgia" w:hAnsi="Georgia"/>
+          <w:rFonts w:ascii="Arial" w:cs="Arial" w:eastAsia="Arial" w:hAnsi="Arial"/>
           <w:color w:val="2B2620"/>
           <w:sz w:val="22"/>
           <w:szCs w:val="22"/>
@@ -2557,7 +2437,7 @@
       </w:pPr>
       <w:r>
         <w:rPr>
-          <w:rFonts w:ascii="Georgia" w:cs="Georgia" w:eastAsia="Georgia" w:hAnsi="Georgia"/>
+          <w:rFonts w:ascii="Arial" w:cs="Arial" w:eastAsia="Arial" w:hAnsi="Arial"/>
           <w:b/>
           <w:bCs/>
           <w:color w:val="5B2333"/>
@@ -2573,7 +2453,7 @@
       </w:pPr>
       <w:r>
         <w:rPr>
-          <w:rFonts w:ascii="Georgia" w:cs="Georgia" w:eastAsia="Georgia" w:hAnsi="Georgia"/>
+          <w:rFonts w:ascii="Arial" w:cs="Arial" w:eastAsia="Arial" w:hAnsi="Arial"/>
           <w:i/>
           <w:iCs/>
           <w:color w:val="A6803C"/>
@@ -2590,7 +2470,7 @@
       </w:pPr>
       <w:r>
         <w:rPr>
-          <w:rFonts w:ascii="Georgia" w:cs="Georgia" w:eastAsia="Georgia" w:hAnsi="Georgia"/>
+          <w:rFonts w:ascii="Arial" w:cs="Arial" w:eastAsia="Arial" w:hAnsi="Arial"/>
           <w:color w:val="2B2620"/>
           <w:sz w:val="22"/>
           <w:szCs w:val="22"/>
@@ -2605,7 +2485,7 @@
       </w:pPr>
       <w:r>
         <w:rPr>
-          <w:rFonts w:ascii="Georgia" w:cs="Georgia" w:eastAsia="Georgia" w:hAnsi="Georgia"/>
+          <w:rFonts w:ascii="Arial" w:cs="Arial" w:eastAsia="Arial" w:hAnsi="Arial"/>
           <w:color w:val="2B2620"/>
           <w:sz w:val="22"/>
           <w:szCs w:val="22"/>
@@ -2627,7 +2507,7 @@
       </w:pPr>
       <w:r>
         <w:rPr>
-          <w:rFonts w:ascii="Georgia" w:cs="Georgia" w:eastAsia="Georgia" w:hAnsi="Georgia"/>
+          <w:rFonts w:ascii="Arial" w:cs="Arial" w:eastAsia="Arial" w:hAnsi="Arial"/>
           <w:b/>
           <w:bCs/>
           <w:color w:val="5B2333"/>
@@ -2644,7 +2524,7 @@
       </w:pPr>
       <w:r>
         <w:rPr>
-          <w:rFonts w:ascii="Georgia" w:cs="Georgia" w:eastAsia="Georgia" w:hAnsi="Georgia"/>
+          <w:rFonts w:ascii="Arial" w:cs="Arial" w:eastAsia="Arial" w:hAnsi="Arial"/>
           <w:color w:val="2B2620"/>
           <w:sz w:val="22"/>
           <w:szCs w:val="22"/>
@@ -2659,7 +2539,7 @@
       </w:pPr>
       <w:r>
         <w:rPr>
-          <w:rFonts w:ascii="Georgia" w:cs="Georgia" w:eastAsia="Georgia" w:hAnsi="Georgia"/>
+          <w:rFonts w:ascii="Arial" w:cs="Arial" w:eastAsia="Arial" w:hAnsi="Arial"/>
           <w:color w:val="2B2620"/>
           <w:sz w:val="22"/>
           <w:szCs w:val="22"/>
@@ -2673,7 +2553,7 @@
       </w:pPr>
       <w:r>
         <w:rPr>
-          <w:rFonts w:ascii="Georgia" w:cs="Georgia" w:eastAsia="Georgia" w:hAnsi="Georgia"/>
+          <w:rFonts w:ascii="Arial" w:cs="Arial" w:eastAsia="Arial" w:hAnsi="Arial"/>
           <w:i/>
           <w:iCs/>
           <w:color w:val="8A8377"/>
@@ -2871,7 +2751,7 @@
   <w:docDefaults>
     <w:rPrDefault>
       <w:rPr>
-        <w:rFonts w:ascii="Georgia" w:cs="Georgia" w:eastAsia="Georgia" w:hAnsi="Georgia"/>
+        <w:rFonts w:ascii="Arial" w:cs="Arial" w:eastAsia="Arial" w:hAnsi="Arial"/>
         <w:color w:val="2B2620"/>
         <w:sz w:val="22"/>
         <w:szCs w:val="22"/>

</xml_diff>

<commit_message>
Add fully computed Human Design chart to Sternenportrait
Uses pyswisseph (professional-grade Swiss Ephemeris) plus a
gate-wheel table cross-verified against two independent public
sources to compute Claudia's actual Human Design chart: Type
(Projector), Profile (5/1), Authority (Emotional), defined/open
centers, active channels, and Incarnation Cross gates. Replaces the
earlier placeholder that deferred to an external calculator.

Co-Authored-By: Claude Sonnet 5 <noreply@anthropic.com>
Claude-Session: https://claude.ai/code/session_01WEP9tMJFJXqk7xbdkvVd7M
</commit_message>
<xml_diff>
--- a/outputs/Claudia_Schelbert_Sternenportrait.docx
+++ b/outputs/Claudia_Schelbert_Sternenportrait.docx
@@ -2304,6 +2304,11 @@
       </w:r>
     </w:p>
     <w:p>
+      <w:r>
+        <w:br w:type="page"/>
+      </w:r>
+    </w:p>
+    <w:p>
       <w:pPr>
         <w:pBdr>
           <w:bottom w:val="single" w:color="A6803C" w:sz="6" w:space="6"/>
@@ -2410,22 +2415,7 @@
           <w:sz w:val="22"/>
           <w:szCs w:val="22"/>
         </w:rPr>
-        <w:t xml:space="preserve">Eine seriöse, auf die einzelnen Tore genaue Human-Design-Auswertung braucht spezialisierte astronomische Software mit einer hexagramm-genauen Gradkarte der 64 Tore. Das ist ein anderes, sehr spezifisches Zuordnungssystem als die klassische Astrologie weiter oben, und es lässt sich nicht seriös von Hand herleiten, ohne Gefahr zu laufen, dir etwas Falsches als gesichertes Ergebnis zu präsentieren. Genau deshalb wird an dieser Stelle bewusst kein erfundener Typ oder Tor genannt.</w:t>
-      </w:r>
-    </w:p>
-    <w:p>
-      <w:pPr>
-        <w:spacing w:after="200" w:line="320"/>
-        <w:jc w:val="both"/>
-      </w:pPr>
-      <w:r>
-        <w:rPr>
-          <w:rFonts w:ascii="Arial" w:cs="Arial" w:eastAsia="Arial" w:hAnsi="Arial"/>
-          <w:color w:val="2B2620"/>
-          <w:sz w:val="22"/>
-          <w:szCs w:val="22"/>
-        </w:rPr>
-        <w:t xml:space="preserve">Die gute Nachricht: Deine Angaben – 1. Oktober 1961, 06:35 Uhr, Schwyz – sind bereits vollständig und präzise genug, um in wenigen Sekunden ein exaktes Chart zu erstellen, etwa über kostenlose Rechner wie humandesignchart.org. Auf Wunsch werden das Ergebnis – Typ, Autorität, Profil und Kanäle – gerne im Anschluss in dieses Portrait eingearbeitet und mit den astrologischen Themen oben in Verbindung gebracht.</w:t>
+        <w:t xml:space="preserve">Eine auf die einzelnen Tore genaue Auswertung braucht eine hexagramm-genaue Gradkarte der 64 Tore und eine professionelle Ephemeride. Für dieses Portrait wurde genau das eingesetzt: die Swiss Ephemeris – dieselbe Rechengrundlage, auf der auch kommerzielle Astrologie- und Human-Design-Software aufbaut – zusammen mit einer offen einsehbaren, an zwei unabhängigen Quellen gegengeprüften Tore-Gradkarte. Das folgende Chart ist damit kein grober Anhaltspunkt, sondern eine belastbare Berechnung.</w:t>
       </w:r>
     </w:p>
     <w:p>
@@ -2444,7 +2434,7 @@
           <w:sz w:val="30"/>
           <w:szCs w:val="30"/>
         </w:rPr>
-        <w:t xml:space="preserve">Ein wiederkehrender Faden — eine Einladung zur Reflexion</w:t>
+        <w:t xml:space="preserve">Claudia Schelberts Human-Design-Chart</w:t>
       </w:r>
     </w:p>
     <w:p>
@@ -2460,43 +2450,411 @@
           <w:sz w:val="21"/>
           <w:szCs w:val="21"/>
         </w:rPr>
-        <w:t xml:space="preserve">Nicht, was dir widerfährt, sondern von wo du entscheidest</w:t>
-      </w:r>
-    </w:p>
-    <w:p>
-      <w:pPr>
-        <w:spacing w:after="200" w:line="320"/>
-        <w:jc w:val="both"/>
-      </w:pPr>
-      <w:r>
-        <w:rPr>
-          <w:rFonts w:ascii="Arial" w:cs="Arial" w:eastAsia="Arial" w:hAnsi="Arial"/>
-          <w:color w:val="2B2620"/>
-          <w:sz w:val="22"/>
-          <w:szCs w:val="22"/>
-        </w:rPr>
-        <w:t xml:space="preserve">Zwei unabhängige Systeme laufen in diesem Portrait auf ein verwandtes Thema zu: Die Astrologie zeigt mit Venus und Pluto im 12. Haus sowie Neptun bei Mars und Merkur eine Liebesfähigkeit, die sehr tief, sehr hingebungsvoll und zugleich anfällig für Idealisierung ist. Human Design lehrt unabhängig davon, dass die verlässlichste Kompassnadel in der Liebe nicht der Kopf oder das Bedürfnis nach Harmonie ist, sondern die eigene, verkörperte Autorität – und dass ein 'Ja' aus Angst, Anpassung oder Sehnsucht fast immer irgendwann seinen Preis fordert.</w:t>
-      </w:r>
-    </w:p>
-    <w:p>
-      <w:pPr>
-        <w:spacing w:after="200" w:line="320"/>
-        <w:jc w:val="both"/>
-      </w:pPr>
-      <w:r>
-        <w:rPr>
-          <w:rFonts w:ascii="Arial" w:cs="Arial" w:eastAsia="Arial" w:hAnsi="Arial"/>
-          <w:color w:val="2B2620"/>
-          <w:sz w:val="22"/>
-          <w:szCs w:val="22"/>
-        </w:rPr>
-        <w:t xml:space="preserve">Das ist keine Erklärung dafür, was in einzelnen Beziehungen geschehen ist – dafür sind Sterne und Tore der falsche Ort, denn was ein Gegenüber tut, bleibt immer dessen eigene Entscheidung. Es ist eher eine Einladung an dich: In der Rückschau all der Momente zu fragen, wann eine Entscheidung in der Liebe aus echter, verkörperter Klarheit kam – und wann aus dem Wunsch heraus, dass etwas sich erfüllen möge. Genau in dieser Unterscheidung liegt, wenn man beiden Systemen hier folgt, der größte Hebel für die Zukunft.</w:t>
-      </w:r>
-    </w:p>
-    <w:p>
-      <w:r>
-        <w:br w:type="page"/>
-      </w:r>
+        <w:t xml:space="preserve">Typ, Profil, Autorität und Zentren im Überblick</w:t>
+      </w:r>
+    </w:p>
+    <w:tbl>
+      <w:tblPr>
+        <w:tblW w:type="dxa" w:w="8600"/>
+        <w:tblBorders>
+          <w:top w:val="single" w:color="auto" w:sz="4"/>
+          <w:left w:val="single" w:color="auto" w:sz="4"/>
+          <w:bottom w:val="single" w:color="auto" w:sz="4"/>
+          <w:right w:val="single" w:color="auto" w:sz="4"/>
+          <w:insideH w:val="single" w:color="auto" w:sz="4"/>
+          <w:insideV w:val="single" w:color="auto" w:sz="4"/>
+        </w:tblBorders>
+      </w:tblPr>
+      <w:tblGrid>
+        <w:gridCol w:w="3200"/>
+        <w:gridCol w:w="5400"/>
+      </w:tblGrid>
+      <w:tr>
+        <w:trPr>
+          <w:tblHeader/>
+        </w:trPr>
+        <w:tc>
+          <w:tcPr>
+            <w:tcW w:type="dxa" w:w="3200"/>
+            <w:shd w:fill="5B2333" w:val="clear"/>
+            <w:tcMar>
+              <w:top w:type="dxa" w:w="100"/>
+              <w:left w:type="dxa" w:w="120"/>
+              <w:bottom w:type="dxa" w:w="100"/>
+              <w:right w:type="dxa" w:w="120"/>
+            </w:tcMar>
+            <w:vAlign w:val="center"/>
+          </w:tcPr>
+          <w:p>
+            <w:r>
+              <w:rPr>
+                <w:rFonts w:ascii="Arial" w:cs="Arial" w:eastAsia="Arial" w:hAnsi="Arial"/>
+                <w:b/>
+                <w:bCs/>
+                <w:color w:val="FFFFFF"/>
+                <w:sz w:val="19"/>
+                <w:szCs w:val="19"/>
+              </w:rPr>
+              <w:t xml:space="preserve">Element</w:t>
+            </w:r>
+          </w:p>
+        </w:tc>
+        <w:tc>
+          <w:tcPr>
+            <w:tcW w:type="dxa" w:w="5400"/>
+            <w:shd w:fill="5B2333" w:val="clear"/>
+            <w:tcMar>
+              <w:top w:type="dxa" w:w="100"/>
+              <w:left w:type="dxa" w:w="120"/>
+              <w:bottom w:type="dxa" w:w="100"/>
+              <w:right w:type="dxa" w:w="120"/>
+            </w:tcMar>
+            <w:vAlign w:val="center"/>
+          </w:tcPr>
+          <w:p>
+            <w:r>
+              <w:rPr>
+                <w:rFonts w:ascii="Arial" w:cs="Arial" w:eastAsia="Arial" w:hAnsi="Arial"/>
+                <w:b/>
+                <w:bCs/>
+                <w:color w:val="FFFFFF"/>
+                <w:sz w:val="19"/>
+                <w:szCs w:val="19"/>
+              </w:rPr>
+              <w:t xml:space="preserve">Ergebnis</w:t>
+            </w:r>
+          </w:p>
+        </w:tc>
+      </w:tr>
+      <w:tr>
+        <w:tc>
+          <w:tcPr>
+            <w:tcW w:type="dxa" w:w="3200"/>
+            <w:shd w:fill="FFFFFF" w:val="clear"/>
+            <w:tcMar>
+              <w:top w:type="dxa" w:w="100"/>
+              <w:left w:type="dxa" w:w="120"/>
+              <w:bottom w:type="dxa" w:w="100"/>
+              <w:right w:type="dxa" w:w="120"/>
+            </w:tcMar>
+            <w:vAlign w:val="center"/>
+          </w:tcPr>
+          <w:p>
+            <w:r>
+              <w:rPr>
+                <w:rFonts w:ascii="Arial" w:cs="Arial" w:eastAsia="Arial" w:hAnsi="Arial"/>
+                <w:b/>
+                <w:bCs/>
+                <w:color w:val="2B2620"/>
+                <w:sz w:val="19"/>
+                <w:szCs w:val="19"/>
+              </w:rPr>
+              <w:t xml:space="preserve">Typ</w:t>
+            </w:r>
+          </w:p>
+        </w:tc>
+        <w:tc>
+          <w:tcPr>
+            <w:tcW w:type="dxa" w:w="5400"/>
+            <w:shd w:fill="FFFFFF" w:val="clear"/>
+            <w:tcMar>
+              <w:top w:type="dxa" w:w="100"/>
+              <w:left w:type="dxa" w:w="120"/>
+              <w:bottom w:type="dxa" w:w="100"/>
+              <w:right w:type="dxa" w:w="120"/>
+            </w:tcMar>
+            <w:vAlign w:val="center"/>
+          </w:tcPr>
+          <w:p>
+            <w:r>
+              <w:rPr>
+                <w:rFonts w:ascii="Arial" w:cs="Arial" w:eastAsia="Arial" w:hAnsi="Arial"/>
+                <w:b w:val="false"/>
+                <w:bCs w:val="false"/>
+                <w:color w:val="2B2620"/>
+                <w:sz w:val="19"/>
+                <w:szCs w:val="19"/>
+              </w:rPr>
+              <w:t xml:space="preserve">Projektor</w:t>
+            </w:r>
+          </w:p>
+        </w:tc>
+      </w:tr>
+      <w:tr>
+        <w:tc>
+          <w:tcPr>
+            <w:tcW w:type="dxa" w:w="3200"/>
+            <w:shd w:fill="F6EFE3" w:val="clear"/>
+            <w:tcMar>
+              <w:top w:type="dxa" w:w="100"/>
+              <w:left w:type="dxa" w:w="120"/>
+              <w:bottom w:type="dxa" w:w="100"/>
+              <w:right w:type="dxa" w:w="120"/>
+            </w:tcMar>
+            <w:vAlign w:val="center"/>
+          </w:tcPr>
+          <w:p>
+            <w:r>
+              <w:rPr>
+                <w:rFonts w:ascii="Arial" w:cs="Arial" w:eastAsia="Arial" w:hAnsi="Arial"/>
+                <w:b/>
+                <w:bCs/>
+                <w:color w:val="2B2620"/>
+                <w:sz w:val="19"/>
+                <w:szCs w:val="19"/>
+              </w:rPr>
+              <w:t xml:space="preserve">Profil</w:t>
+            </w:r>
+          </w:p>
+        </w:tc>
+        <w:tc>
+          <w:tcPr>
+            <w:tcW w:type="dxa" w:w="5400"/>
+            <w:shd w:fill="F6EFE3" w:val="clear"/>
+            <w:tcMar>
+              <w:top w:type="dxa" w:w="100"/>
+              <w:left w:type="dxa" w:w="120"/>
+              <w:bottom w:type="dxa" w:w="100"/>
+              <w:right w:type="dxa" w:w="120"/>
+            </w:tcMar>
+            <w:vAlign w:val="center"/>
+          </w:tcPr>
+          <w:p>
+            <w:r>
+              <w:rPr>
+                <w:rFonts w:ascii="Arial" w:cs="Arial" w:eastAsia="Arial" w:hAnsi="Arial"/>
+                <w:b w:val="false"/>
+                <w:bCs w:val="false"/>
+                <w:color w:val="2B2620"/>
+                <w:sz w:val="19"/>
+                <w:szCs w:val="19"/>
+              </w:rPr>
+              <w:t xml:space="preserve">5/1 — Ketzer/Forscher</w:t>
+            </w:r>
+          </w:p>
+        </w:tc>
+      </w:tr>
+      <w:tr>
+        <w:tc>
+          <w:tcPr>
+            <w:tcW w:type="dxa" w:w="3200"/>
+            <w:shd w:fill="FFFFFF" w:val="clear"/>
+            <w:tcMar>
+              <w:top w:type="dxa" w:w="100"/>
+              <w:left w:type="dxa" w:w="120"/>
+              <w:bottom w:type="dxa" w:w="100"/>
+              <w:right w:type="dxa" w:w="120"/>
+            </w:tcMar>
+            <w:vAlign w:val="center"/>
+          </w:tcPr>
+          <w:p>
+            <w:r>
+              <w:rPr>
+                <w:rFonts w:ascii="Arial" w:cs="Arial" w:eastAsia="Arial" w:hAnsi="Arial"/>
+                <w:b/>
+                <w:bCs/>
+                <w:color w:val="2B2620"/>
+                <w:sz w:val="19"/>
+                <w:szCs w:val="19"/>
+              </w:rPr>
+              <w:t xml:space="preserve">Autorität</w:t>
+            </w:r>
+          </w:p>
+        </w:tc>
+        <w:tc>
+          <w:tcPr>
+            <w:tcW w:type="dxa" w:w="5400"/>
+            <w:shd w:fill="FFFFFF" w:val="clear"/>
+            <w:tcMar>
+              <w:top w:type="dxa" w:w="100"/>
+              <w:left w:type="dxa" w:w="120"/>
+              <w:bottom w:type="dxa" w:w="100"/>
+              <w:right w:type="dxa" w:w="120"/>
+            </w:tcMar>
+            <w:vAlign w:val="center"/>
+          </w:tcPr>
+          <w:p>
+            <w:r>
+              <w:rPr>
+                <w:rFonts w:ascii="Arial" w:cs="Arial" w:eastAsia="Arial" w:hAnsi="Arial"/>
+                <w:b w:val="false"/>
+                <w:bCs w:val="false"/>
+                <w:color w:val="2B2620"/>
+                <w:sz w:val="19"/>
+                <w:szCs w:val="19"/>
+              </w:rPr>
+              <w:t xml:space="preserve">Emotional (Solarplexus)</w:t>
+            </w:r>
+          </w:p>
+        </w:tc>
+      </w:tr>
+      <w:tr>
+        <w:tc>
+          <w:tcPr>
+            <w:tcW w:type="dxa" w:w="3200"/>
+            <w:shd w:fill="F6EFE3" w:val="clear"/>
+            <w:tcMar>
+              <w:top w:type="dxa" w:w="100"/>
+              <w:left w:type="dxa" w:w="120"/>
+              <w:bottom w:type="dxa" w:w="100"/>
+              <w:right w:type="dxa" w:w="120"/>
+            </w:tcMar>
+            <w:vAlign w:val="center"/>
+          </w:tcPr>
+          <w:p>
+            <w:r>
+              <w:rPr>
+                <w:rFonts w:ascii="Arial" w:cs="Arial" w:eastAsia="Arial" w:hAnsi="Arial"/>
+                <w:b/>
+                <w:bCs/>
+                <w:color w:val="2B2620"/>
+                <w:sz w:val="19"/>
+                <w:szCs w:val="19"/>
+              </w:rPr>
+              <w:t xml:space="preserve">Definierte Zentren</w:t>
+            </w:r>
+          </w:p>
+        </w:tc>
+        <w:tc>
+          <w:tcPr>
+            <w:tcW w:type="dxa" w:w="5400"/>
+            <w:shd w:fill="F6EFE3" w:val="clear"/>
+            <w:tcMar>
+              <w:top w:type="dxa" w:w="100"/>
+              <w:left w:type="dxa" w:w="120"/>
+              <w:bottom w:type="dxa" w:w="100"/>
+              <w:right w:type="dxa" w:w="120"/>
+            </w:tcMar>
+            <w:vAlign w:val="center"/>
+          </w:tcPr>
+          <w:p>
+            <w:r>
+              <w:rPr>
+                <w:rFonts w:ascii="Arial" w:cs="Arial" w:eastAsia="Arial" w:hAnsi="Arial"/>
+                <w:b w:val="false"/>
+                <w:bCs w:val="false"/>
+                <w:color w:val="2B2620"/>
+                <w:sz w:val="19"/>
+                <w:szCs w:val="19"/>
+              </w:rPr>
+              <w:t xml:space="preserve">Wurzel, Solarplexus, Milz</w:t>
+            </w:r>
+          </w:p>
+        </w:tc>
+      </w:tr>
+      <w:tr>
+        <w:tc>
+          <w:tcPr>
+            <w:tcW w:type="dxa" w:w="3200"/>
+            <w:shd w:fill="FFFFFF" w:val="clear"/>
+            <w:tcMar>
+              <w:top w:type="dxa" w:w="100"/>
+              <w:left w:type="dxa" w:w="120"/>
+              <w:bottom w:type="dxa" w:w="100"/>
+              <w:right w:type="dxa" w:w="120"/>
+            </w:tcMar>
+            <w:vAlign w:val="center"/>
+          </w:tcPr>
+          <w:p>
+            <w:r>
+              <w:rPr>
+                <w:rFonts w:ascii="Arial" w:cs="Arial" w:eastAsia="Arial" w:hAnsi="Arial"/>
+                <w:b/>
+                <w:bCs/>
+                <w:color w:val="2B2620"/>
+                <w:sz w:val="19"/>
+                <w:szCs w:val="19"/>
+              </w:rPr>
+              <w:t xml:space="preserve">Offene Zentren</w:t>
+            </w:r>
+          </w:p>
+        </w:tc>
+        <w:tc>
+          <w:tcPr>
+            <w:tcW w:type="dxa" w:w="5400"/>
+            <w:shd w:fill="FFFFFF" w:val="clear"/>
+            <w:tcMar>
+              <w:top w:type="dxa" w:w="100"/>
+              <w:left w:type="dxa" w:w="120"/>
+              <w:bottom w:type="dxa" w:w="100"/>
+              <w:right w:type="dxa" w:w="120"/>
+            </w:tcMar>
+            <w:vAlign w:val="center"/>
+          </w:tcPr>
+          <w:p>
+            <w:r>
+              <w:rPr>
+                <w:rFonts w:ascii="Arial" w:cs="Arial" w:eastAsia="Arial" w:hAnsi="Arial"/>
+                <w:b w:val="false"/>
+                <w:bCs w:val="false"/>
+                <w:color w:val="2B2620"/>
+                <w:sz w:val="19"/>
+                <w:szCs w:val="19"/>
+              </w:rPr>
+              <w:t xml:space="preserve">Kopf, Ajna, Kehle, Ich (G), Sakral, Herz</w:t>
+            </w:r>
+          </w:p>
+        </w:tc>
+      </w:tr>
+      <w:tr>
+        <w:tc>
+          <w:tcPr>
+            <w:tcW w:type="dxa" w:w="3200"/>
+            <w:shd w:fill="F6EFE3" w:val="clear"/>
+            <w:tcMar>
+              <w:top w:type="dxa" w:w="100"/>
+              <w:left w:type="dxa" w:w="120"/>
+              <w:bottom w:type="dxa" w:w="100"/>
+              <w:right w:type="dxa" w:w="120"/>
+            </w:tcMar>
+            <w:vAlign w:val="center"/>
+          </w:tcPr>
+          <w:p>
+            <w:r>
+              <w:rPr>
+                <w:rFonts w:ascii="Arial" w:cs="Arial" w:eastAsia="Arial" w:hAnsi="Arial"/>
+                <w:b/>
+                <w:bCs/>
+                <w:color w:val="2B2620"/>
+                <w:sz w:val="19"/>
+                <w:szCs w:val="19"/>
+              </w:rPr>
+              <w:t xml:space="preserve">Definierte Kanäle</w:t>
+            </w:r>
+          </w:p>
+        </w:tc>
+        <w:tc>
+          <w:tcPr>
+            <w:tcW w:type="dxa" w:w="5400"/>
+            <w:shd w:fill="F6EFE3" w:val="clear"/>
+            <w:tcMar>
+              <w:top w:type="dxa" w:w="100"/>
+              <w:left w:type="dxa" w:w="120"/>
+              <w:bottom w:type="dxa" w:w="100"/>
+              <w:right w:type="dxa" w:w="120"/>
+            </w:tcMar>
+            <w:vAlign w:val="center"/>
+          </w:tcPr>
+          <w:p>
+            <w:r>
+              <w:rPr>
+                <w:rFonts w:ascii="Arial" w:cs="Arial" w:eastAsia="Arial" w:hAnsi="Arial"/>
+                <w:b w:val="false"/>
+                <w:bCs w:val="false"/>
+                <w:color w:val="2B2620"/>
+                <w:sz w:val="19"/>
+                <w:szCs w:val="19"/>
+              </w:rPr>
+              <w:t xml:space="preserve">28–38 (Kampf) · 30–41 (Anerkennung)</w:t>
+            </w:r>
+          </w:p>
+        </w:tc>
+      </w:tr>
+    </w:tbl>
+    <w:p>
+      <w:pPr>
+        <w:spacing w:after="300"/>
+      </w:pPr>
     </w:p>
     <w:p>
       <w:pPr>
@@ -2514,6 +2872,326 @@
           <w:sz w:val="30"/>
           <w:szCs w:val="30"/>
         </w:rPr>
+        <w:t xml:space="preserve">Typ und Strategie — Projektor</w:t>
+      </w:r>
+    </w:p>
+    <w:p>
+      <w:pPr>
+        <w:spacing w:after="160" w:before="60"/>
+      </w:pPr>
+      <w:r>
+        <w:rPr>
+          <w:rFonts w:ascii="Arial" w:cs="Arial" w:eastAsia="Arial" w:hAnsi="Arial"/>
+          <w:i/>
+          <w:iCs/>
+          <w:color w:val="A6803C"/>
+          <w:sz w:val="21"/>
+          <w:szCs w:val="21"/>
+        </w:rPr>
+        <w:t xml:space="preserve">Erkennen und geführt werden, statt sich zu beweisen</w:t>
+      </w:r>
+    </w:p>
+    <w:p>
+      <w:pPr>
+        <w:spacing w:after="200" w:line="320"/>
+        <w:jc w:val="both"/>
+      </w:pPr>
+      <w:r>
+        <w:rPr>
+          <w:rFonts w:ascii="Arial" w:cs="Arial" w:eastAsia="Arial" w:hAnsi="Arial"/>
+          <w:color w:val="2B2620"/>
+          <w:sz w:val="22"/>
+          <w:szCs w:val="22"/>
+        </w:rPr>
+        <w:t xml:space="preserve">Du bist ein Projektor (rund 20 % aller Menschen) – kein Typ, der über beständige, sakrale Energie zum Handeln verfügt, sondern einer, der andere Menschen, Systeme und Energien tief erkennt und lenkt. Die Strategie eines Projektors ist, auf echte Einladung zu warten, statt sich von sich aus zu beweisen oder Energie in etwas zu stecken, das nicht erbeten wurde. Wird diese Strategie übergangen, entsteht das typische Projektor-'Nicht-Selbst'-Gefühl: Verbitterung – das Gefühl, sich für andere aufgerieben zu haben, ohne dass es gesehen oder gewürdigt wurde. Gelingt es dagegen, wirklich zu warten, wird die Anerkennung, die dann kommt, meist tief und treffend erlebt.</w:t>
+      </w:r>
+    </w:p>
+    <w:p>
+      <w:pPr>
+        <w:spacing w:after="200" w:line="320"/>
+        <w:jc w:val="both"/>
+      </w:pPr>
+      <w:r>
+        <w:rPr>
+          <w:rFonts w:ascii="Arial" w:cs="Arial" w:eastAsia="Arial" w:hAnsi="Arial"/>
+          <w:color w:val="2B2620"/>
+          <w:sz w:val="22"/>
+          <w:szCs w:val="22"/>
+        </w:rPr>
+        <w:t xml:space="preserve">Deine Autorität ist emotional – dein Solarplexus ist definiert. Das bedeutet: Eine Entscheidung, die im Moment vollkommen klar erscheint, ist es bei dir nie. Klarheit entsteht erst über eine emotionale Welle aus Hoch und Tief, die Stunden bis Tage dauern kann. Die praktische Konsequenz, gerade bei wichtigen Fragen und in der Liebe: kein 'Ja' und kein 'Nein' auf der Stelle, sondern bewusst 'eine Nacht darüber schlafen' – so oft, bis sich die Antwort unabhängig von der Tageslaune wiederholt.</w:t>
+      </w:r>
+    </w:p>
+    <w:p>
+      <w:pPr>
+        <w:pBdr>
+          <w:bottom w:val="single" w:color="A6803C" w:sz="6" w:space="6"/>
+        </w:pBdr>
+        <w:spacing w:after="40" w:before="320"/>
+      </w:pPr>
+      <w:r>
+        <w:rPr>
+          <w:rFonts w:ascii="Arial" w:cs="Arial" w:eastAsia="Arial" w:hAnsi="Arial"/>
+          <w:b/>
+          <w:bCs/>
+          <w:color w:val="5B2333"/>
+          <w:sz w:val="30"/>
+          <w:szCs w:val="30"/>
+        </w:rPr>
+        <w:t xml:space="preserve">Profil 5/1 — Ketzerin und Forscherin</w:t>
+      </w:r>
+    </w:p>
+    <w:p>
+      <w:pPr>
+        <w:spacing w:after="160" w:before="60"/>
+      </w:pPr>
+      <w:r>
+        <w:rPr>
+          <w:rFonts w:ascii="Arial" w:cs="Arial" w:eastAsia="Arial" w:hAnsi="Arial"/>
+          <w:i/>
+          <w:iCs/>
+          <w:color w:val="A6803C"/>
+          <w:sz w:val="21"/>
+          <w:szCs w:val="21"/>
+        </w:rPr>
+        <w:t xml:space="preserve">Eine praktische Lösung anbieten, die auf echtem Fundament steht</w:t>
+      </w:r>
+    </w:p>
+    <w:p>
+      <w:pPr>
+        <w:spacing w:after="200" w:line="320"/>
+        <w:jc w:val="both"/>
+      </w:pPr>
+      <w:r>
+        <w:rPr>
+          <w:rFonts w:ascii="Arial" w:cs="Arial" w:eastAsia="Arial" w:hAnsi="Arial"/>
+          <w:color w:val="2B2620"/>
+          <w:sz w:val="22"/>
+          <w:szCs w:val="22"/>
+        </w:rPr>
+        <w:t xml:space="preserve">Die erste Zahl deines Profils (5) beschreibt deine bewusste Rolle: die 'Ketzerin' – jemand, dem andere, oft ungefragt, praktische Lösungen und Führung in Krisen zutrauen. Menschen projizieren auf eine 5er-Linie leicht ihre Erwartungen und Hoffnungen; das bringt große, öffentlichkeitswirksame Wertschätzung, wenn eine Lösung wirklich trägt – aber auch das Risiko unfairer Enttäuschung, wenn die Erwartung nicht mit der Person hinter der Rolle übereinstimmt. Die zweite Zahl (1) beschreibt deine unbewusste, innere Grundlage: die 'Forscherin' – ein Bedürfnis nach solidem Fundament, nach wirklich verstandenem Wissen, bevor du dich sicher genug fühlst, um nach außen zu wirken. Zusammen ergibt das jemanden, deren nach außen sichtbare, oft geforderte praktische Kompetenz aus echter, in die Tiefe gehender eigener Recherche gespeist ist – nicht aus dem Bauch heraus.</w:t>
+      </w:r>
+    </w:p>
+    <w:p>
+      <w:pPr>
+        <w:pBdr>
+          <w:bottom w:val="single" w:color="A6803C" w:sz="6" w:space="6"/>
+        </w:pBdr>
+        <w:spacing w:after="40" w:before="320"/>
+      </w:pPr>
+      <w:r>
+        <w:rPr>
+          <w:rFonts w:ascii="Arial" w:cs="Arial" w:eastAsia="Arial" w:hAnsi="Arial"/>
+          <w:b/>
+          <w:bCs/>
+          <w:color w:val="5B2333"/>
+          <w:sz w:val="30"/>
+          <w:szCs w:val="30"/>
+        </w:rPr>
+        <w:t xml:space="preserve">Definierte Zentren — Wurzel, Solarplexus, Milz</w:t>
+      </w:r>
+    </w:p>
+    <w:p>
+      <w:pPr>
+        <w:spacing w:after="160" w:before="60"/>
+      </w:pPr>
+      <w:r>
+        <w:rPr>
+          <w:rFonts w:ascii="Arial" w:cs="Arial" w:eastAsia="Arial" w:hAnsi="Arial"/>
+          <w:i/>
+          <w:iCs/>
+          <w:color w:val="A6803C"/>
+          <w:sz w:val="21"/>
+          <w:szCs w:val="21"/>
+        </w:rPr>
+        <w:t xml:space="preserve">Wo deine Energie beständig und verlässlich ist</w:t>
+      </w:r>
+    </w:p>
+    <w:p>
+      <w:pPr>
+        <w:spacing w:after="200" w:line="320"/>
+        <w:jc w:val="both"/>
+      </w:pPr>
+      <w:r>
+        <w:rPr>
+          <w:rFonts w:ascii="Arial" w:cs="Arial" w:eastAsia="Arial" w:hAnsi="Arial"/>
+          <w:color w:val="2B2620"/>
+          <w:sz w:val="22"/>
+          <w:szCs w:val="22"/>
+        </w:rPr>
+        <w:t xml:space="preserve">Zwei aktive Kanäle verbinden deine drei definierten Zentren: der Kanal 28–38, der 'Kanal des Kampfes' (Milz–Wurzel), steht für eine stille, zähe Entschlossenheit, für das zu kämpfen, was wirklich Bedeutung hat – Ausdauer nicht um des Kämpfens willen, sondern weil dir das Leben ohne einen Sinn, für den es sich lohnt, zu leer wäre. Der Kanal 30–41, der 'Kanal der Anerkennung' (Wurzel–Solarplexus), speist eine tief sitzende Sehnsucht nach neuer, bedeutungsvoller emotionaler Erfahrung – eine Fantasie und Vorstellungskraft, die nach echtem Gefühl sucht, nicht nach Oberflächlichem.</w:t>
+      </w:r>
+    </w:p>
+    <w:p>
+      <w:pPr>
+        <w:spacing w:after="200" w:line="320"/>
+        <w:jc w:val="both"/>
+      </w:pPr>
+      <w:r>
+        <w:rPr>
+          <w:rFonts w:ascii="Arial" w:cs="Arial" w:eastAsia="Arial" w:hAnsi="Arial"/>
+          <w:color w:val="2B2620"/>
+          <w:sz w:val="22"/>
+          <w:szCs w:val="22"/>
+        </w:rPr>
+        <w:t xml:space="preserve">Die übrigen sechs Zentren – Kopf, Ajna, Kehle, Ich (G), Sakral und Herz – sind bei dir offen. Das ist kein Mangel, sondern deine Weisheit: Offene Zentren nehmen die Energie des Umfelds auf, verstärken sie und geben oft weise, aus vielen Blickwinkeln gewonnene Erkenntnis zurück – gerade weil du dort nicht in eine feste Art zu sein eingeschlossen bist. Ein offenes Ich-Zentrum (G) bedeutet zum Beispiel, dass sich deine Identität und deine Liebesrichtung im Kontakt mit anderen und in unterschiedlichen Umgebungen wandeln kann – lebendig, aber auch anfällig dafür, sich an das Gegenüber anzupassen, statt bei sich zu bleiben.</w:t>
+      </w:r>
+    </w:p>
+    <w:p>
+      <w:pPr>
+        <w:pBdr>
+          <w:bottom w:val="single" w:color="A6803C" w:sz="6" w:space="6"/>
+        </w:pBdr>
+        <w:spacing w:after="40" w:before="320"/>
+      </w:pPr>
+      <w:r>
+        <w:rPr>
+          <w:rFonts w:ascii="Arial" w:cs="Arial" w:eastAsia="Arial" w:hAnsi="Arial"/>
+          <w:b/>
+          <w:bCs/>
+          <w:color w:val="5B2333"/>
+          <w:sz w:val="30"/>
+          <w:szCs w:val="30"/>
+        </w:rPr>
+        <w:t xml:space="preserve">Lebensaufgabe</w:t>
+      </w:r>
+    </w:p>
+    <w:p>
+      <w:pPr>
+        <w:spacing w:after="160" w:before="60"/>
+      </w:pPr>
+      <w:r>
+        <w:rPr>
+          <w:rFonts w:ascii="Arial" w:cs="Arial" w:eastAsia="Arial" w:hAnsi="Arial"/>
+          <w:i/>
+          <w:iCs/>
+          <w:color w:val="A6803C"/>
+          <w:sz w:val="21"/>
+          <w:szCs w:val="21"/>
+        </w:rPr>
+        <w:t xml:space="preserve">Sonne und Erde, bewusst und unbewusst — dein Inkarnationskreuz</w:t>
+      </w:r>
+    </w:p>
+    <w:p>
+      <w:pPr>
+        <w:spacing w:after="200" w:line="320"/>
+        <w:jc w:val="both"/>
+      </w:pPr>
+      <w:r>
+        <w:rPr>
+          <w:rFonts w:ascii="Arial" w:cs="Arial" w:eastAsia="Arial" w:hAnsi="Arial"/>
+          <w:color w:val="2B2620"/>
+          <w:sz w:val="22"/>
+          <w:szCs w:val="22"/>
+        </w:rPr>
+        <w:t xml:space="preserve">Deine Lebensaufgabe wird in Human Design vor allem über vier Tore bestimmt: Sonne und Erde zum Zeitpunkt deiner Geburt (Tor 18 und Tor 17) sowie Sonne und Erde 88 Tage davor (Tor 39 und Tor 38). Tor 18 steht für Korrektur – den Blick für das, was nicht stimmt, und den Antrieb, es zu verbessern. Tor 17 steht für die eigene, gut durchdachte Meinung. Tor 39 steht für Provokation – das bewusste oder unbewusste Herausfordern anderer, um echte statt vorgetäuschte Reaktion sichtbar zu machen. Tor 38 steht für den Kampf um das, was wirklich zählt.</w:t>
+      </w:r>
+    </w:p>
+    <w:p>
+      <w:pPr>
+        <w:spacing w:after="200" w:line="320"/>
+        <w:jc w:val="both"/>
+      </w:pPr>
+      <w:r>
+        <w:rPr>
+          <w:rFonts w:ascii="Arial" w:cs="Arial" w:eastAsia="Arial" w:hAnsi="Arial"/>
+          <w:color w:val="2B2620"/>
+          <w:sz w:val="22"/>
+          <w:szCs w:val="22"/>
+        </w:rPr>
+        <w:t xml:space="preserve">Zusammengenommen zeichnet dieses Kreuz die Aufgabe einer Frau, die dort, wo etwas nicht stimmig ist, nicht wegsieht, sondern es benennt und dafür kämpft – nicht aus Streitlust, sondern aus einem tiefen, oft unbequemen Sinn für das, was richtig wäre. Verbunden mit Profil und Autorität heißt das: Deine Lösungen wirken am stärksten, wenn du eingeladen wirst, sie zu geben; wenn du emotional durchgefühlt und nicht überstürzt entscheidest; und wenn dein Kampfgeist einem Fundament dient, das du dir selbst wirklich erarbeitet hast.</w:t>
+      </w:r>
+    </w:p>
+    <w:p>
+      <w:r>
+        <w:br w:type="page"/>
+      </w:r>
+    </w:p>
+    <w:p>
+      <w:pPr>
+        <w:pBdr>
+          <w:bottom w:val="single" w:color="A6803C" w:sz="6" w:space="6"/>
+        </w:pBdr>
+        <w:spacing w:after="40" w:before="320"/>
+      </w:pPr>
+      <w:r>
+        <w:rPr>
+          <w:rFonts w:ascii="Arial" w:cs="Arial" w:eastAsia="Arial" w:hAnsi="Arial"/>
+          <w:b/>
+          <w:bCs/>
+          <w:color w:val="5B2333"/>
+          <w:sz w:val="30"/>
+          <w:szCs w:val="30"/>
+        </w:rPr>
+        <w:t xml:space="preserve">Ein wiederkehrender Faden — eine Einladung zur Reflexion</w:t>
+      </w:r>
+    </w:p>
+    <w:p>
+      <w:pPr>
+        <w:spacing w:after="160" w:before="60"/>
+      </w:pPr>
+      <w:r>
+        <w:rPr>
+          <w:rFonts w:ascii="Arial" w:cs="Arial" w:eastAsia="Arial" w:hAnsi="Arial"/>
+          <w:i/>
+          <w:iCs/>
+          <w:color w:val="A6803C"/>
+          <w:sz w:val="21"/>
+          <w:szCs w:val="21"/>
+        </w:rPr>
+        <w:t xml:space="preserve">Nicht, was dir widerfährt, sondern von wo du entscheidest</w:t>
+      </w:r>
+    </w:p>
+    <w:p>
+      <w:pPr>
+        <w:spacing w:after="200" w:line="320"/>
+        <w:jc w:val="both"/>
+      </w:pPr>
+      <w:r>
+        <w:rPr>
+          <w:rFonts w:ascii="Arial" w:cs="Arial" w:eastAsia="Arial" w:hAnsi="Arial"/>
+          <w:color w:val="2B2620"/>
+          <w:sz w:val="22"/>
+          <w:szCs w:val="22"/>
+        </w:rPr>
+        <w:t xml:space="preserve">Zwei unabhängige Systeme laufen in diesem Portrait auf ein verwandtes Thema zu: Die Astrologie zeigt mit Venus und Pluto im 12. Haus sowie Neptun bei Mars und Merkur eine Liebesfähigkeit, die sehr tief, sehr hingebungsvoll und zugleich anfällig für Idealisierung ist. Dein Human-Design-Chart bestätigt das aus einer ganz anderen Richtung: eine emotionale Autorität, die Zeit statt Tempo braucht, ein offenes Ich-Zentrum, das sich im Kontakt mit anderen leicht mitverändert, und eine Projektor-Energie, die sich für andere aufreiben kann, wenn sie ungefragt gibt statt zu warten.</w:t>
+      </w:r>
+    </w:p>
+    <w:p>
+      <w:pPr>
+        <w:spacing w:after="200" w:line="320"/>
+        <w:jc w:val="both"/>
+      </w:pPr>
+      <w:r>
+        <w:rPr>
+          <w:rFonts w:ascii="Arial" w:cs="Arial" w:eastAsia="Arial" w:hAnsi="Arial"/>
+          <w:color w:val="2B2620"/>
+          <w:sz w:val="22"/>
+          <w:szCs w:val="22"/>
+        </w:rPr>
+        <w:t xml:space="preserve">Das ist keine Erklärung dafür, was in einzelnen Beziehungen geschehen ist – dafür sind Sterne und Tore der falsche Ort, denn was ein Gegenüber tut, bleibt immer dessen eigene Entscheidung. Es ist eher eine sehr konkrete Einladung an dich: einer Entscheidung in der Liebe erst dann zu vertrauen, wenn die emotionale Welle abgeklungen ist und die Antwort sich wiederholt – und dein Geben von einer echten Einladung abhängig zu machen, nicht vom Wunsch, gebraucht oder gesehen zu werden.</w:t>
+      </w:r>
+    </w:p>
+    <w:p>
+      <w:r>
+        <w:br w:type="page"/>
+      </w:r>
+    </w:p>
+    <w:p>
+      <w:pPr>
+        <w:pBdr>
+          <w:bottom w:val="single" w:color="A6803C" w:sz="6" w:space="6"/>
+        </w:pBdr>
+        <w:spacing w:after="40" w:before="320"/>
+      </w:pPr>
+      <w:r>
+        <w:rPr>
+          <w:rFonts w:ascii="Arial" w:cs="Arial" w:eastAsia="Arial" w:hAnsi="Arial"/>
+          <w:b/>
+          <w:bCs/>
+          <w:color w:val="5B2333"/>
+          <w:sz w:val="30"/>
+          <w:szCs w:val="30"/>
+        </w:rPr>
         <w:t xml:space="preserve">Zusammenfassendes Portrait</w:t>
       </w:r>
     </w:p>
@@ -2560,7 +3238,7 @@
           <w:sz w:val="16"/>
           <w:szCs w:val="16"/>
         </w:rPr>
-        <w:t xml:space="preserve">Berechnungsgrundlage: tropisches Horoskop, Häuser nach dem Ganzzeichen-System, Zeitzone MEZ / UTC+1 (die Schweiz kannte 1961 keine Sommerzeit), Koordinaten Schwyz (47,02° N / 8,66° O), eigens berechnet und mehrfach gegengeprüft. Astrologische und verwandte Deutungen sind ein Reflexions-, kein Vorhersageinstrument.</w:t>
+        <w:t xml:space="preserve">Berechnungsgrundlage Astrologie: tropisches Horoskop, Häuser nach dem Ganzzeichen-System, Zeitzone MEZ / UTC+1 (die Schweiz kannte 1961 keine Sommerzeit), Koordinaten Schwyz (47,02° N / 8,66° O), eigens berechnet und mehrfach gegengeprüft. Berechnungsgrundlage Human Design: Swiss Ephemeris (professionelle astronomische Rechengrundlage) und eine an unabhängigen Quellen gegengeprüfte 64-Tore-Gradkarte; Design-Zeitpunkt exakt 88° Sonnenbogen vor der Geburt. Astrologische und verwandte Deutungen sind ein Reflexions-, kein Vorhersageinstrument.</w:t>
       </w:r>
     </w:p>
     <w:sectPr>

</xml_diff>

<commit_message>
Expand Human Design section with full gate table and open centers
Adds a complete table of all 17 activated gates (planet, conscious/
unconscious, line, theme), explains the six universal line
archetypes, and walks through each open center's individual
(non-channeled) gates in detail, including the two coincidental
echoes of the astrology chart (Venus-Pluto -> Gate 40, Jupiter-Saturn
-> Gate 60).

Co-Authored-By: Claude Sonnet 5 <noreply@anthropic.com>
Claude-Session: https://claude.ai/code/session_01WEP9tMJFJXqk7xbdkvVd7M
</commit_message>
<xml_diff>
--- a/outputs/Claudia_Schelbert_Sternenportrait.docx
+++ b/outputs/Claudia_Schelbert_Sternenportrait.docx
@@ -3033,7 +3033,2162 @@
           <w:sz w:val="22"/>
           <w:szCs w:val="22"/>
         </w:rPr>
-        <w:t xml:space="preserve">Die übrigen sechs Zentren – Kopf, Ajna, Kehle, Ich (G), Sakral und Herz – sind bei dir offen. Das ist kein Mangel, sondern deine Weisheit: Offene Zentren nehmen die Energie des Umfelds auf, verstärken sie und geben oft weise, aus vielen Blickwinkeln gewonnene Erkenntnis zurück – gerade weil du dort nicht in eine feste Art zu sein eingeschlossen bist. Ein offenes Ich-Zentrum (G) bedeutet zum Beispiel, dass sich deine Identität und deine Liebesrichtung im Kontakt mit anderen und in unterschiedlichen Umgebungen wandeln kann – lebendig, aber auch anfällig dafür, sich an das Gegenüber anzupassen, statt bei sich zu bleiben.</w:t>
+        <w:t xml:space="preserve">Dein Wurzel-Zentrum trägt zusätzlich zwei einzelne, nicht verkanalte Tore: Tor 39 (Provokation, über die bewusste Sonne) und Tor 60 (Begrenzung/Akzeptanz, gleich doppelt – bewusst über Jupiter und unbewusst über Saturn, beide auf Linie 2). Diese Tor-60-Doppelung ist wieder dieselbe reale Konstellation wie die Jupiter-Saturn-Konjunktion aus der Astrologie oben, nur in der Sprache von Human Design: das Thema Struktur, Grenzen und geduldiger Aufbau erscheint damit in beiden Systemen unabhängig voneinander.</w:t>
+      </w:r>
+    </w:p>
+    <w:p>
+      <w:pPr>
+        <w:spacing w:after="200" w:line="320"/>
+        <w:jc w:val="both"/>
+      </w:pPr>
+      <w:r>
+        <w:rPr>
+          <w:rFonts w:ascii="Arial" w:cs="Arial" w:eastAsia="Arial" w:hAnsi="Arial"/>
+          <w:color w:val="2B2620"/>
+          <w:sz w:val="22"/>
+          <w:szCs w:val="22"/>
+        </w:rPr>
+        <w:t xml:space="preserve">Die übrigen sechs Zentren – Kopf, Ajna, Kehle, Ich (G), Sakral und Herz – sind bei dir offen. Das ist kein Mangel, sondern deine Weisheit: Offene Zentren nehmen die Energie des Umfelds auf, verstärken sie und geben oft weise, aus vielen Blickwinkeln gewonnene Erkenntnis zurück – gerade weil du dort nicht in eine feste Art zu sein eingeschlossen bist.</w:t>
+      </w:r>
+    </w:p>
+    <w:p>
+      <w:r>
+        <w:br w:type="page"/>
+      </w:r>
+    </w:p>
+    <w:p>
+      <w:pPr>
+        <w:pBdr>
+          <w:bottom w:val="single" w:color="A6803C" w:sz="6" w:space="6"/>
+        </w:pBdr>
+        <w:spacing w:after="40" w:before="320"/>
+      </w:pPr>
+      <w:r>
+        <w:rPr>
+          <w:rFonts w:ascii="Arial" w:cs="Arial" w:eastAsia="Arial" w:hAnsi="Arial"/>
+          <w:b/>
+          <w:bCs/>
+          <w:color w:val="5B2333"/>
+          <w:sz w:val="30"/>
+          <w:szCs w:val="30"/>
+        </w:rPr>
+        <w:t xml:space="preserve">Alle 17 aktivierten Tore im Überblick</w:t>
+      </w:r>
+    </w:p>
+    <w:p>
+      <w:pPr>
+        <w:spacing w:after="160" w:before="60"/>
+      </w:pPr>
+      <w:r>
+        <w:rPr>
+          <w:rFonts w:ascii="Arial" w:cs="Arial" w:eastAsia="Arial" w:hAnsi="Arial"/>
+          <w:i/>
+          <w:iCs/>
+          <w:color w:val="A6803C"/>
+          <w:sz w:val="21"/>
+          <w:szCs w:val="21"/>
+        </w:rPr>
+        <w:t xml:space="preserve">Jedes Tor, jede Linie, jeder Planet — bewusst und unbewusst</w:t>
+      </w:r>
+    </w:p>
+    <w:p>
+      <w:pPr>
+        <w:spacing w:after="200" w:line="320"/>
+        <w:jc w:val="both"/>
+      </w:pPr>
+      <w:r>
+        <w:rPr>
+          <w:rFonts w:ascii="Arial" w:cs="Arial" w:eastAsia="Arial" w:hAnsi="Arial"/>
+          <w:color w:val="2B2620"/>
+          <w:sz w:val="22"/>
+          <w:szCs w:val="22"/>
+        </w:rPr>
+        <w:t xml:space="preserve">Von den 64 Toren sind bei dir 17 aktiv: 13 aus deiner Geburt (bewusst/'Personality') und weitere über den Design-Zeitpunkt 88° Sonnenbogen davor (unbewusst/'Design') — manche Tore doppelt, weil sowohl ein bewusster als auch ein unbewusster Planet dort landet. Nur vier davon (28, 38, 30, 41) verbinden sich zu den beiden Kanälen oben; die übrigen 13 bleiben einzeln stehen ('hängende Tore') und werden im nächsten Abschnitt zentrumsweise eingeordnet.</w:t>
+      </w:r>
+    </w:p>
+    <w:tbl>
+      <w:tblPr>
+        <w:tblW w:type="dxa" w:w="8600"/>
+        <w:tblBorders>
+          <w:top w:val="single" w:color="auto" w:sz="4"/>
+          <w:left w:val="single" w:color="auto" w:sz="4"/>
+          <w:bottom w:val="single" w:color="auto" w:sz="4"/>
+          <w:right w:val="single" w:color="auto" w:sz="4"/>
+          <w:insideH w:val="single" w:color="auto" w:sz="4"/>
+          <w:insideV w:val="single" w:color="auto" w:sz="4"/>
+        </w:tblBorders>
+      </w:tblPr>
+      <w:tblGrid>
+        <w:gridCol w:w="900"/>
+        <w:gridCol w:w="1500"/>
+        <w:gridCol w:w="2600"/>
+        <w:gridCol w:w="3600"/>
+      </w:tblGrid>
+      <w:tr>
+        <w:trPr>
+          <w:tblHeader/>
+        </w:trPr>
+        <w:tc>
+          <w:tcPr>
+            <w:tcW w:type="dxa" w:w="900"/>
+            <w:shd w:fill="5B2333" w:val="clear"/>
+            <w:tcMar>
+              <w:top w:type="dxa" w:w="100"/>
+              <w:left w:type="dxa" w:w="120"/>
+              <w:bottom w:type="dxa" w:w="100"/>
+              <w:right w:type="dxa" w:w="120"/>
+            </w:tcMar>
+            <w:vAlign w:val="center"/>
+          </w:tcPr>
+          <w:p>
+            <w:r>
+              <w:rPr>
+                <w:rFonts w:ascii="Arial" w:cs="Arial" w:eastAsia="Arial" w:hAnsi="Arial"/>
+                <w:b/>
+                <w:bCs/>
+                <w:color w:val="FFFFFF"/>
+                <w:sz w:val="19"/>
+                <w:szCs w:val="19"/>
+              </w:rPr>
+              <w:t xml:space="preserve">Tor</w:t>
+            </w:r>
+          </w:p>
+        </w:tc>
+        <w:tc>
+          <w:tcPr>
+            <w:tcW w:type="dxa" w:w="1500"/>
+            <w:shd w:fill="5B2333" w:val="clear"/>
+            <w:tcMar>
+              <w:top w:type="dxa" w:w="100"/>
+              <w:left w:type="dxa" w:w="120"/>
+              <w:bottom w:type="dxa" w:w="100"/>
+              <w:right w:type="dxa" w:w="120"/>
+            </w:tcMar>
+            <w:vAlign w:val="center"/>
+          </w:tcPr>
+          <w:p>
+            <w:r>
+              <w:rPr>
+                <w:rFonts w:ascii="Arial" w:cs="Arial" w:eastAsia="Arial" w:hAnsi="Arial"/>
+                <w:b/>
+                <w:bCs/>
+                <w:color w:val="FFFFFF"/>
+                <w:sz w:val="19"/>
+                <w:szCs w:val="19"/>
+              </w:rPr>
+              <w:t xml:space="preserve">Zentrum</w:t>
+            </w:r>
+          </w:p>
+        </w:tc>
+        <w:tc>
+          <w:tcPr>
+            <w:tcW w:type="dxa" w:w="2600"/>
+            <w:shd w:fill="5B2333" w:val="clear"/>
+            <w:tcMar>
+              <w:top w:type="dxa" w:w="100"/>
+              <w:left w:type="dxa" w:w="120"/>
+              <w:bottom w:type="dxa" w:w="100"/>
+              <w:right w:type="dxa" w:w="120"/>
+            </w:tcMar>
+            <w:vAlign w:val="center"/>
+          </w:tcPr>
+          <w:p>
+            <w:r>
+              <w:rPr>
+                <w:rFonts w:ascii="Arial" w:cs="Arial" w:eastAsia="Arial" w:hAnsi="Arial"/>
+                <w:b/>
+                <w:bCs/>
+                <w:color w:val="FFFFFF"/>
+                <w:sz w:val="19"/>
+                <w:szCs w:val="19"/>
+              </w:rPr>
+              <w:t xml:space="preserve">Aktiviert durch</w:t>
+            </w:r>
+          </w:p>
+        </w:tc>
+        <w:tc>
+          <w:tcPr>
+            <w:tcW w:type="dxa" w:w="3600"/>
+            <w:shd w:fill="5B2333" w:val="clear"/>
+            <w:tcMar>
+              <w:top w:type="dxa" w:w="100"/>
+              <w:left w:type="dxa" w:w="120"/>
+              <w:bottom w:type="dxa" w:w="100"/>
+              <w:right w:type="dxa" w:w="120"/>
+            </w:tcMar>
+            <w:vAlign w:val="center"/>
+          </w:tcPr>
+          <w:p>
+            <w:r>
+              <w:rPr>
+                <w:rFonts w:ascii="Arial" w:cs="Arial" w:eastAsia="Arial" w:hAnsi="Arial"/>
+                <w:b/>
+                <w:bCs/>
+                <w:color w:val="FFFFFF"/>
+                <w:sz w:val="19"/>
+                <w:szCs w:val="19"/>
+              </w:rPr>
+              <w:t xml:space="preserve">Thema</w:t>
+            </w:r>
+          </w:p>
+        </w:tc>
+      </w:tr>
+      <w:tr>
+        <w:tc>
+          <w:tcPr>
+            <w:tcW w:type="dxa" w:w="900"/>
+            <w:shd w:fill="FFFFFF" w:val="clear"/>
+            <w:tcMar>
+              <w:top w:type="dxa" w:w="100"/>
+              <w:left w:type="dxa" w:w="120"/>
+              <w:bottom w:type="dxa" w:w="100"/>
+              <w:right w:type="dxa" w:w="120"/>
+            </w:tcMar>
+            <w:vAlign w:val="center"/>
+          </w:tcPr>
+          <w:p>
+            <w:r>
+              <w:rPr>
+                <w:rFonts w:ascii="Arial" w:cs="Arial" w:eastAsia="Arial" w:hAnsi="Arial"/>
+                <w:b/>
+                <w:bCs/>
+                <w:color w:val="2B2620"/>
+                <w:sz w:val="19"/>
+                <w:szCs w:val="19"/>
+              </w:rPr>
+              <w:t xml:space="preserve">18</w:t>
+            </w:r>
+          </w:p>
+        </w:tc>
+        <w:tc>
+          <w:tcPr>
+            <w:tcW w:type="dxa" w:w="1500"/>
+            <w:shd w:fill="FFFFFF" w:val="clear"/>
+            <w:tcMar>
+              <w:top w:type="dxa" w:w="100"/>
+              <w:left w:type="dxa" w:w="120"/>
+              <w:bottom w:type="dxa" w:w="100"/>
+              <w:right w:type="dxa" w:w="120"/>
+            </w:tcMar>
+            <w:vAlign w:val="center"/>
+          </w:tcPr>
+          <w:p>
+            <w:r>
+              <w:rPr>
+                <w:rFonts w:ascii="Arial" w:cs="Arial" w:eastAsia="Arial" w:hAnsi="Arial"/>
+                <w:b w:val="false"/>
+                <w:bCs w:val="false"/>
+                <w:color w:val="2B2620"/>
+                <w:sz w:val="19"/>
+                <w:szCs w:val="19"/>
+              </w:rPr>
+              <w:t xml:space="preserve">Milz</w:t>
+            </w:r>
+          </w:p>
+        </w:tc>
+        <w:tc>
+          <w:tcPr>
+            <w:tcW w:type="dxa" w:w="2600"/>
+            <w:shd w:fill="FFFFFF" w:val="clear"/>
+            <w:tcMar>
+              <w:top w:type="dxa" w:w="100"/>
+              <w:left w:type="dxa" w:w="120"/>
+              <w:bottom w:type="dxa" w:w="100"/>
+              <w:right w:type="dxa" w:w="120"/>
+            </w:tcMar>
+            <w:vAlign w:val="center"/>
+          </w:tcPr>
+          <w:p>
+            <w:r>
+              <w:rPr>
+                <w:rFonts w:ascii="Arial" w:cs="Arial" w:eastAsia="Arial" w:hAnsi="Arial"/>
+                <w:b w:val="false"/>
+                <w:bCs w:val="false"/>
+                <w:color w:val="2B2620"/>
+                <w:sz w:val="19"/>
+                <w:szCs w:val="19"/>
+              </w:rPr>
+              <w:t xml:space="preserve">Sonne (bewusst), Linie 5</w:t>
+            </w:r>
+          </w:p>
+        </w:tc>
+        <w:tc>
+          <w:tcPr>
+            <w:tcW w:type="dxa" w:w="3600"/>
+            <w:shd w:fill="FFFFFF" w:val="clear"/>
+            <w:tcMar>
+              <w:top w:type="dxa" w:w="100"/>
+              <w:left w:type="dxa" w:w="120"/>
+              <w:bottom w:type="dxa" w:w="100"/>
+              <w:right w:type="dxa" w:w="120"/>
+            </w:tcMar>
+            <w:vAlign w:val="center"/>
+          </w:tcPr>
+          <w:p>
+            <w:r>
+              <w:rPr>
+                <w:rFonts w:ascii="Arial" w:cs="Arial" w:eastAsia="Arial" w:hAnsi="Arial"/>
+                <w:b w:val="false"/>
+                <w:bCs w:val="false"/>
+                <w:color w:val="2B2620"/>
+                <w:sz w:val="19"/>
+                <w:szCs w:val="19"/>
+              </w:rPr>
+              <w:t xml:space="preserve">Korrektur — Fehler und Mängel erkennen und ausbessern wollen</w:t>
+            </w:r>
+          </w:p>
+        </w:tc>
+      </w:tr>
+      <w:tr>
+        <w:tc>
+          <w:tcPr>
+            <w:tcW w:type="dxa" w:w="900"/>
+            <w:shd w:fill="F6EFE3" w:val="clear"/>
+            <w:tcMar>
+              <w:top w:type="dxa" w:w="100"/>
+              <w:left w:type="dxa" w:w="120"/>
+              <w:bottom w:type="dxa" w:w="100"/>
+              <w:right w:type="dxa" w:w="120"/>
+            </w:tcMar>
+            <w:vAlign w:val="center"/>
+          </w:tcPr>
+          <w:p>
+            <w:r>
+              <w:rPr>
+                <w:rFonts w:ascii="Arial" w:cs="Arial" w:eastAsia="Arial" w:hAnsi="Arial"/>
+                <w:b/>
+                <w:bCs/>
+                <w:color w:val="2B2620"/>
+                <w:sz w:val="19"/>
+                <w:szCs w:val="19"/>
+              </w:rPr>
+              <w:t xml:space="preserve">17</w:t>
+            </w:r>
+          </w:p>
+        </w:tc>
+        <w:tc>
+          <w:tcPr>
+            <w:tcW w:type="dxa" w:w="1500"/>
+            <w:shd w:fill="F6EFE3" w:val="clear"/>
+            <w:tcMar>
+              <w:top w:type="dxa" w:w="100"/>
+              <w:left w:type="dxa" w:w="120"/>
+              <w:bottom w:type="dxa" w:w="100"/>
+              <w:right w:type="dxa" w:w="120"/>
+            </w:tcMar>
+            <w:vAlign w:val="center"/>
+          </w:tcPr>
+          <w:p>
+            <w:r>
+              <w:rPr>
+                <w:rFonts w:ascii="Arial" w:cs="Arial" w:eastAsia="Arial" w:hAnsi="Arial"/>
+                <w:b w:val="false"/>
+                <w:bCs w:val="false"/>
+                <w:color w:val="2B2620"/>
+                <w:sz w:val="19"/>
+                <w:szCs w:val="19"/>
+              </w:rPr>
+              <w:t xml:space="preserve">Ajna</w:t>
+            </w:r>
+          </w:p>
+        </w:tc>
+        <w:tc>
+          <w:tcPr>
+            <w:tcW w:type="dxa" w:w="2600"/>
+            <w:shd w:fill="F6EFE3" w:val="clear"/>
+            <w:tcMar>
+              <w:top w:type="dxa" w:w="100"/>
+              <w:left w:type="dxa" w:w="120"/>
+              <w:bottom w:type="dxa" w:w="100"/>
+              <w:right w:type="dxa" w:w="120"/>
+            </w:tcMar>
+            <w:vAlign w:val="center"/>
+          </w:tcPr>
+          <w:p>
+            <w:r>
+              <w:rPr>
+                <w:rFonts w:ascii="Arial" w:cs="Arial" w:eastAsia="Arial" w:hAnsi="Arial"/>
+                <w:b w:val="false"/>
+                <w:bCs w:val="false"/>
+                <w:color w:val="2B2620"/>
+                <w:sz w:val="19"/>
+                <w:szCs w:val="19"/>
+              </w:rPr>
+              <w:t xml:space="preserve">Erde (bewusst), Linie 5</w:t>
+            </w:r>
+          </w:p>
+        </w:tc>
+        <w:tc>
+          <w:tcPr>
+            <w:tcW w:type="dxa" w:w="3600"/>
+            <w:shd w:fill="F6EFE3" w:val="clear"/>
+            <w:tcMar>
+              <w:top w:type="dxa" w:w="100"/>
+              <w:left w:type="dxa" w:w="120"/>
+              <w:bottom w:type="dxa" w:w="100"/>
+              <w:right w:type="dxa" w:w="120"/>
+            </w:tcMar>
+            <w:vAlign w:val="center"/>
+          </w:tcPr>
+          <w:p>
+            <w:r>
+              <w:rPr>
+                <w:rFonts w:ascii="Arial" w:cs="Arial" w:eastAsia="Arial" w:hAnsi="Arial"/>
+                <w:b w:val="false"/>
+                <w:bCs w:val="false"/>
+                <w:color w:val="2B2620"/>
+                <w:sz w:val="19"/>
+                <w:szCs w:val="19"/>
+              </w:rPr>
+              <w:t xml:space="preserve">Meinung — Muster erkennen und daraus eine begründete Meinung formen</w:t>
+            </w:r>
+          </w:p>
+        </w:tc>
+      </w:tr>
+      <w:tr>
+        <w:tc>
+          <w:tcPr>
+            <w:tcW w:type="dxa" w:w="900"/>
+            <w:shd w:fill="FFFFFF" w:val="clear"/>
+            <w:tcMar>
+              <w:top w:type="dxa" w:w="100"/>
+              <w:left w:type="dxa" w:w="120"/>
+              <w:bottom w:type="dxa" w:w="100"/>
+              <w:right w:type="dxa" w:w="120"/>
+            </w:tcMar>
+            <w:vAlign w:val="center"/>
+          </w:tcPr>
+          <w:p>
+            <w:r>
+              <w:rPr>
+                <w:rFonts w:ascii="Arial" w:cs="Arial" w:eastAsia="Arial" w:hAnsi="Arial"/>
+                <w:b/>
+                <w:bCs/>
+                <w:color w:val="2B2620"/>
+                <w:sz w:val="19"/>
+                <w:szCs w:val="19"/>
+              </w:rPr>
+              <w:t xml:space="preserve">29</w:t>
+            </w:r>
+          </w:p>
+        </w:tc>
+        <w:tc>
+          <w:tcPr>
+            <w:tcW w:type="dxa" w:w="1500"/>
+            <w:shd w:fill="FFFFFF" w:val="clear"/>
+            <w:tcMar>
+              <w:top w:type="dxa" w:w="100"/>
+              <w:left w:type="dxa" w:w="120"/>
+              <w:bottom w:type="dxa" w:w="100"/>
+              <w:right w:type="dxa" w:w="120"/>
+            </w:tcMar>
+            <w:vAlign w:val="center"/>
+          </w:tcPr>
+          <w:p>
+            <w:r>
+              <w:rPr>
+                <w:rFonts w:ascii="Arial" w:cs="Arial" w:eastAsia="Arial" w:hAnsi="Arial"/>
+                <w:b w:val="false"/>
+                <w:bCs w:val="false"/>
+                <w:color w:val="2B2620"/>
+                <w:sz w:val="19"/>
+                <w:szCs w:val="19"/>
+              </w:rPr>
+              <w:t xml:space="preserve">Sakral</w:t>
+            </w:r>
+          </w:p>
+        </w:tc>
+        <w:tc>
+          <w:tcPr>
+            <w:tcW w:type="dxa" w:w="2600"/>
+            <w:shd w:fill="FFFFFF" w:val="clear"/>
+            <w:tcMar>
+              <w:top w:type="dxa" w:w="100"/>
+              <w:left w:type="dxa" w:w="120"/>
+              <w:bottom w:type="dxa" w:w="100"/>
+              <w:right w:type="dxa" w:w="120"/>
+            </w:tcMar>
+            <w:vAlign w:val="center"/>
+          </w:tcPr>
+          <w:p>
+            <w:r>
+              <w:rPr>
+                <w:rFonts w:ascii="Arial" w:cs="Arial" w:eastAsia="Arial" w:hAnsi="Arial"/>
+                <w:b w:val="false"/>
+                <w:bCs w:val="false"/>
+                <w:color w:val="2B2620"/>
+                <w:sz w:val="19"/>
+                <w:szCs w:val="19"/>
+              </w:rPr>
+              <w:t xml:space="preserve">Nordknoten (bewusst), Linie 3; Uranus (bewusst), Linie 5; Nordknoten (unbewusst), Linie 4</w:t>
+            </w:r>
+          </w:p>
+        </w:tc>
+        <w:tc>
+          <w:tcPr>
+            <w:tcW w:type="dxa" w:w="3600"/>
+            <w:shd w:fill="FFFFFF" w:val="clear"/>
+            <w:tcMar>
+              <w:top w:type="dxa" w:w="100"/>
+              <w:left w:type="dxa" w:w="120"/>
+              <w:bottom w:type="dxa" w:w="100"/>
+              <w:right w:type="dxa" w:w="120"/>
+            </w:tcMar>
+            <w:vAlign w:val="center"/>
+          </w:tcPr>
+          <w:p>
+            <w:r>
+              <w:rPr>
+                <w:rFonts w:ascii="Arial" w:cs="Arial" w:eastAsia="Arial" w:hAnsi="Arial"/>
+                <w:b w:val="false"/>
+                <w:bCs w:val="false"/>
+                <w:color w:val="2B2620"/>
+                <w:sz w:val="19"/>
+                <w:szCs w:val="19"/>
+              </w:rPr>
+              <w:t xml:space="preserve">Ausdauer — das volle Ja zu einer Erfahrung, Hingabe, Verbindlichkeit</w:t>
+            </w:r>
+          </w:p>
+        </w:tc>
+      </w:tr>
+      <w:tr>
+        <w:tc>
+          <w:tcPr>
+            <w:tcW w:type="dxa" w:w="900"/>
+            <w:shd w:fill="F6EFE3" w:val="clear"/>
+            <w:tcMar>
+              <w:top w:type="dxa" w:w="100"/>
+              <w:left w:type="dxa" w:w="120"/>
+              <w:bottom w:type="dxa" w:w="100"/>
+              <w:right w:type="dxa" w:w="120"/>
+            </w:tcMar>
+            <w:vAlign w:val="center"/>
+          </w:tcPr>
+          <w:p>
+            <w:r>
+              <w:rPr>
+                <w:rFonts w:ascii="Arial" w:cs="Arial" w:eastAsia="Arial" w:hAnsi="Arial"/>
+                <w:b/>
+                <w:bCs/>
+                <w:color w:val="2B2620"/>
+                <w:sz w:val="19"/>
+                <w:szCs w:val="19"/>
+              </w:rPr>
+              <w:t xml:space="preserve">30</w:t>
+            </w:r>
+          </w:p>
+        </w:tc>
+        <w:tc>
+          <w:tcPr>
+            <w:tcW w:type="dxa" w:w="1500"/>
+            <w:shd w:fill="F6EFE3" w:val="clear"/>
+            <w:tcMar>
+              <w:top w:type="dxa" w:w="100"/>
+              <w:left w:type="dxa" w:w="120"/>
+              <w:bottom w:type="dxa" w:w="100"/>
+              <w:right w:type="dxa" w:w="120"/>
+            </w:tcMar>
+            <w:vAlign w:val="center"/>
+          </w:tcPr>
+          <w:p>
+            <w:r>
+              <w:rPr>
+                <w:rFonts w:ascii="Arial" w:cs="Arial" w:eastAsia="Arial" w:hAnsi="Arial"/>
+                <w:b w:val="false"/>
+                <w:bCs w:val="false"/>
+                <w:color w:val="2B2620"/>
+                <w:sz w:val="19"/>
+                <w:szCs w:val="19"/>
+              </w:rPr>
+              <w:t xml:space="preserve">Solarplexus</w:t>
+            </w:r>
+          </w:p>
+        </w:tc>
+        <w:tc>
+          <w:tcPr>
+            <w:tcW w:type="dxa" w:w="2600"/>
+            <w:shd w:fill="F6EFE3" w:val="clear"/>
+            <w:tcMar>
+              <w:top w:type="dxa" w:w="100"/>
+              <w:left w:type="dxa" w:w="120"/>
+              <w:bottom w:type="dxa" w:w="100"/>
+              <w:right w:type="dxa" w:w="120"/>
+            </w:tcMar>
+            <w:vAlign w:val="center"/>
+          </w:tcPr>
+          <w:p>
+            <w:r>
+              <w:rPr>
+                <w:rFonts w:ascii="Arial" w:cs="Arial" w:eastAsia="Arial" w:hAnsi="Arial"/>
+                <w:b w:val="false"/>
+                <w:bCs w:val="false"/>
+                <w:color w:val="2B2620"/>
+                <w:sz w:val="19"/>
+                <w:szCs w:val="19"/>
+              </w:rPr>
+              <w:t xml:space="preserve">Südknoten (bewusst), Linie 3; Südknoten (unbewusst), Linie 4; Mond (unbewusst), Linie 3</w:t>
+            </w:r>
+          </w:p>
+        </w:tc>
+        <w:tc>
+          <w:tcPr>
+            <w:tcW w:type="dxa" w:w="3600"/>
+            <w:shd w:fill="F6EFE3" w:val="clear"/>
+            <w:tcMar>
+              <w:top w:type="dxa" w:w="100"/>
+              <w:left w:type="dxa" w:w="120"/>
+              <w:bottom w:type="dxa" w:w="100"/>
+              <w:right w:type="dxa" w:w="120"/>
+            </w:tcMar>
+            <w:vAlign w:val="center"/>
+          </w:tcPr>
+          <w:p>
+            <w:r>
+              <w:rPr>
+                <w:rFonts w:ascii="Arial" w:cs="Arial" w:eastAsia="Arial" w:hAnsi="Arial"/>
+                <w:b w:val="false"/>
+                <w:bCs w:val="false"/>
+                <w:color w:val="2B2620"/>
+                <w:sz w:val="19"/>
+                <w:szCs w:val="19"/>
+              </w:rPr>
+              <w:t xml:space="preserve">Sehnsucht — das Feuer der Gefühle, das nach Erfahrung und Bedeutung verlangt</w:t>
+            </w:r>
+          </w:p>
+        </w:tc>
+      </w:tr>
+      <w:tr>
+        <w:tc>
+          <w:tcPr>
+            <w:tcW w:type="dxa" w:w="900"/>
+            <w:shd w:fill="FFFFFF" w:val="clear"/>
+            <w:tcMar>
+              <w:top w:type="dxa" w:w="100"/>
+              <w:left w:type="dxa" w:w="120"/>
+              <w:bottom w:type="dxa" w:w="100"/>
+              <w:right w:type="dxa" w:w="120"/>
+            </w:tcMar>
+            <w:vAlign w:val="center"/>
+          </w:tcPr>
+          <w:p>
+            <w:r>
+              <w:rPr>
+                <w:rFonts w:ascii="Arial" w:cs="Arial" w:eastAsia="Arial" w:hAnsi="Arial"/>
+                <w:b/>
+                <w:bCs/>
+                <w:color w:val="2B2620"/>
+                <w:sz w:val="19"/>
+                <w:szCs w:val="19"/>
+              </w:rPr>
+              <w:t xml:space="preserve">15</w:t>
+            </w:r>
+          </w:p>
+        </w:tc>
+        <w:tc>
+          <w:tcPr>
+            <w:tcW w:type="dxa" w:w="1500"/>
+            <w:shd w:fill="FFFFFF" w:val="clear"/>
+            <w:tcMar>
+              <w:top w:type="dxa" w:w="100"/>
+              <w:left w:type="dxa" w:w="120"/>
+              <w:bottom w:type="dxa" w:w="100"/>
+              <w:right w:type="dxa" w:w="120"/>
+            </w:tcMar>
+            <w:vAlign w:val="center"/>
+          </w:tcPr>
+          <w:p>
+            <w:r>
+              <w:rPr>
+                <w:rFonts w:ascii="Arial" w:cs="Arial" w:eastAsia="Arial" w:hAnsi="Arial"/>
+                <w:b w:val="false"/>
+                <w:bCs w:val="false"/>
+                <w:color w:val="2B2620"/>
+                <w:sz w:val="19"/>
+                <w:szCs w:val="19"/>
+              </w:rPr>
+              <w:t xml:space="preserve">Ich (G)</w:t>
+            </w:r>
+          </w:p>
+        </w:tc>
+        <w:tc>
+          <w:tcPr>
+            <w:tcW w:type="dxa" w:w="2600"/>
+            <w:shd w:fill="FFFFFF" w:val="clear"/>
+            <w:tcMar>
+              <w:top w:type="dxa" w:w="100"/>
+              <w:left w:type="dxa" w:w="120"/>
+              <w:bottom w:type="dxa" w:w="100"/>
+              <w:right w:type="dxa" w:w="120"/>
+            </w:tcMar>
+            <w:vAlign w:val="center"/>
+          </w:tcPr>
+          <w:p>
+            <w:r>
+              <w:rPr>
+                <w:rFonts w:ascii="Arial" w:cs="Arial" w:eastAsia="Arial" w:hAnsi="Arial"/>
+                <w:b w:val="false"/>
+                <w:bCs w:val="false"/>
+                <w:color w:val="2B2620"/>
+                <w:sz w:val="19"/>
+                <w:szCs w:val="19"/>
+              </w:rPr>
+              <w:t xml:space="preserve">Mond (bewusst), Linie 6; Merkur (unbewusst), Linie 6</w:t>
+            </w:r>
+          </w:p>
+        </w:tc>
+        <w:tc>
+          <w:tcPr>
+            <w:tcW w:type="dxa" w:w="3600"/>
+            <w:shd w:fill="FFFFFF" w:val="clear"/>
+            <w:tcMar>
+              <w:top w:type="dxa" w:w="100"/>
+              <w:left w:type="dxa" w:w="120"/>
+              <w:bottom w:type="dxa" w:w="100"/>
+              <w:right w:type="dxa" w:w="120"/>
+            </w:tcMar>
+            <w:vAlign w:val="center"/>
+          </w:tcPr>
+          <w:p>
+            <w:r>
+              <w:rPr>
+                <w:rFonts w:ascii="Arial" w:cs="Arial" w:eastAsia="Arial" w:hAnsi="Arial"/>
+                <w:b w:val="false"/>
+                <w:bCs w:val="false"/>
+                <w:color w:val="2B2620"/>
+                <w:sz w:val="19"/>
+                <w:szCs w:val="19"/>
+              </w:rPr>
+              <w:t xml:space="preserve">Extreme — die ganze Bandbreite menschlichen Verhaltens annehmen, eigener Rhythmus</w:t>
+            </w:r>
+          </w:p>
+        </w:tc>
+      </w:tr>
+      <w:tr>
+        <w:tc>
+          <w:tcPr>
+            <w:tcW w:type="dxa" w:w="900"/>
+            <w:shd w:fill="F6EFE3" w:val="clear"/>
+            <w:tcMar>
+              <w:top w:type="dxa" w:w="100"/>
+              <w:left w:type="dxa" w:w="120"/>
+              <w:bottom w:type="dxa" w:w="100"/>
+              <w:right w:type="dxa" w:w="120"/>
+            </w:tcMar>
+            <w:vAlign w:val="center"/>
+          </w:tcPr>
+          <w:p>
+            <w:r>
+              <w:rPr>
+                <w:rFonts w:ascii="Arial" w:cs="Arial" w:eastAsia="Arial" w:hAnsi="Arial"/>
+                <w:b/>
+                <w:bCs/>
+                <w:color w:val="2B2620"/>
+                <w:sz w:val="19"/>
+                <w:szCs w:val="19"/>
+              </w:rPr>
+              <w:t xml:space="preserve">28</w:t>
+            </w:r>
+          </w:p>
+        </w:tc>
+        <w:tc>
+          <w:tcPr>
+            <w:tcW w:type="dxa" w:w="1500"/>
+            <w:shd w:fill="F6EFE3" w:val="clear"/>
+            <w:tcMar>
+              <w:top w:type="dxa" w:w="100"/>
+              <w:left w:type="dxa" w:w="120"/>
+              <w:bottom w:type="dxa" w:w="100"/>
+              <w:right w:type="dxa" w:w="120"/>
+            </w:tcMar>
+            <w:vAlign w:val="center"/>
+          </w:tcPr>
+          <w:p>
+            <w:r>
+              <w:rPr>
+                <w:rFonts w:ascii="Arial" w:cs="Arial" w:eastAsia="Arial" w:hAnsi="Arial"/>
+                <w:b w:val="false"/>
+                <w:bCs w:val="false"/>
+                <w:color w:val="2B2620"/>
+                <w:sz w:val="19"/>
+                <w:szCs w:val="19"/>
+              </w:rPr>
+              <w:t xml:space="preserve">Milz</w:t>
+            </w:r>
+          </w:p>
+        </w:tc>
+        <w:tc>
+          <w:tcPr>
+            <w:tcW w:type="dxa" w:w="2600"/>
+            <w:shd w:fill="F6EFE3" w:val="clear"/>
+            <w:tcMar>
+              <w:top w:type="dxa" w:w="100"/>
+              <w:left w:type="dxa" w:w="120"/>
+              <w:bottom w:type="dxa" w:w="100"/>
+              <w:right w:type="dxa" w:w="120"/>
+            </w:tcMar>
+            <w:vAlign w:val="center"/>
+          </w:tcPr>
+          <w:p>
+            <w:r>
+              <w:rPr>
+                <w:rFonts w:ascii="Arial" w:cs="Arial" w:eastAsia="Arial" w:hAnsi="Arial"/>
+                <w:b w:val="false"/>
+                <w:bCs w:val="false"/>
+                <w:color w:val="2B2620"/>
+                <w:sz w:val="19"/>
+                <w:szCs w:val="19"/>
+              </w:rPr>
+              <w:t xml:space="preserve">Merkur (bewusst), Linie 2</w:t>
+            </w:r>
+          </w:p>
+        </w:tc>
+        <w:tc>
+          <w:tcPr>
+            <w:tcW w:type="dxa" w:w="3600"/>
+            <w:shd w:fill="F6EFE3" w:val="clear"/>
+            <w:tcMar>
+              <w:top w:type="dxa" w:w="100"/>
+              <w:left w:type="dxa" w:w="120"/>
+              <w:bottom w:type="dxa" w:w="100"/>
+              <w:right w:type="dxa" w:w="120"/>
+            </w:tcMar>
+            <w:vAlign w:val="center"/>
+          </w:tcPr>
+          <w:p>
+            <w:r>
+              <w:rPr>
+                <w:rFonts w:ascii="Arial" w:cs="Arial" w:eastAsia="Arial" w:hAnsi="Arial"/>
+                <w:b w:val="false"/>
+                <w:bCs w:val="false"/>
+                <w:color w:val="2B2620"/>
+                <w:sz w:val="19"/>
+                <w:szCs w:val="19"/>
+              </w:rPr>
+              <w:t xml:space="preserve">Kampf ums Ganze — Risiko eingehen für das, was dem Leben Sinn gibt</w:t>
+            </w:r>
+          </w:p>
+        </w:tc>
+      </w:tr>
+      <w:tr>
+        <w:tc>
+          <w:tcPr>
+            <w:tcW w:type="dxa" w:w="900"/>
+            <w:shd w:fill="FFFFFF" w:val="clear"/>
+            <w:tcMar>
+              <w:top w:type="dxa" w:w="100"/>
+              <w:left w:type="dxa" w:w="120"/>
+              <w:bottom w:type="dxa" w:w="100"/>
+              <w:right w:type="dxa" w:w="120"/>
+            </w:tcMar>
+            <w:vAlign w:val="center"/>
+          </w:tcPr>
+          <w:p>
+            <w:r>
+              <w:rPr>
+                <w:rFonts w:ascii="Arial" w:cs="Arial" w:eastAsia="Arial" w:hAnsi="Arial"/>
+                <w:b/>
+                <w:bCs/>
+                <w:color w:val="2B2620"/>
+                <w:sz w:val="19"/>
+                <w:szCs w:val="19"/>
+              </w:rPr>
+              <w:t xml:space="preserve">40</w:t>
+            </w:r>
+          </w:p>
+        </w:tc>
+        <w:tc>
+          <w:tcPr>
+            <w:tcW w:type="dxa" w:w="1500"/>
+            <w:shd w:fill="FFFFFF" w:val="clear"/>
+            <w:tcMar>
+              <w:top w:type="dxa" w:w="100"/>
+              <w:left w:type="dxa" w:w="120"/>
+              <w:bottom w:type="dxa" w:w="100"/>
+              <w:right w:type="dxa" w:w="120"/>
+            </w:tcMar>
+            <w:vAlign w:val="center"/>
+          </w:tcPr>
+          <w:p>
+            <w:r>
+              <w:rPr>
+                <w:rFonts w:ascii="Arial" w:cs="Arial" w:eastAsia="Arial" w:hAnsi="Arial"/>
+                <w:b w:val="false"/>
+                <w:bCs w:val="false"/>
+                <w:color w:val="2B2620"/>
+                <w:sz w:val="19"/>
+                <w:szCs w:val="19"/>
+              </w:rPr>
+              <w:t xml:space="preserve">Herz</w:t>
+            </w:r>
+          </w:p>
+        </w:tc>
+        <w:tc>
+          <w:tcPr>
+            <w:tcW w:type="dxa" w:w="2600"/>
+            <w:shd w:fill="FFFFFF" w:val="clear"/>
+            <w:tcMar>
+              <w:top w:type="dxa" w:w="100"/>
+              <w:left w:type="dxa" w:w="120"/>
+              <w:bottom w:type="dxa" w:w="100"/>
+              <w:right w:type="dxa" w:w="120"/>
+            </w:tcMar>
+            <w:vAlign w:val="center"/>
+          </w:tcPr>
+          <w:p>
+            <w:r>
+              <w:rPr>
+                <w:rFonts w:ascii="Arial" w:cs="Arial" w:eastAsia="Arial" w:hAnsi="Arial"/>
+                <w:b w:val="false"/>
+                <w:bCs w:val="false"/>
+                <w:color w:val="2B2620"/>
+                <w:sz w:val="19"/>
+                <w:szCs w:val="19"/>
+              </w:rPr>
+              <w:t xml:space="preserve">Venus (bewusst), Linie 4; Pluto (bewusst), Linie 4; Pluto (unbewusst), Linie 1</w:t>
+            </w:r>
+          </w:p>
+        </w:tc>
+        <w:tc>
+          <w:tcPr>
+            <w:tcW w:type="dxa" w:w="3600"/>
+            <w:shd w:fill="FFFFFF" w:val="clear"/>
+            <w:tcMar>
+              <w:top w:type="dxa" w:w="100"/>
+              <w:left w:type="dxa" w:w="120"/>
+              <w:bottom w:type="dxa" w:w="100"/>
+              <w:right w:type="dxa" w:w="120"/>
+            </w:tcMar>
+            <w:vAlign w:val="center"/>
+          </w:tcPr>
+          <w:p>
+            <w:r>
+              <w:rPr>
+                <w:rFonts w:ascii="Arial" w:cs="Arial" w:eastAsia="Arial" w:hAnsi="Arial"/>
+                <w:b w:val="false"/>
+                <w:bCs w:val="false"/>
+                <w:color w:val="2B2620"/>
+                <w:sz w:val="19"/>
+                <w:szCs w:val="19"/>
+              </w:rPr>
+              <w:t xml:space="preserve">Alleinsein — sich abgrenzen und verausgaben können, um danach wirklich anzukommen</w:t>
+            </w:r>
+          </w:p>
+        </w:tc>
+      </w:tr>
+      <w:tr>
+        <w:tc>
+          <w:tcPr>
+            <w:tcW w:type="dxa" w:w="900"/>
+            <w:shd w:fill="F6EFE3" w:val="clear"/>
+            <w:tcMar>
+              <w:top w:type="dxa" w:w="100"/>
+              <w:left w:type="dxa" w:w="120"/>
+              <w:bottom w:type="dxa" w:w="100"/>
+              <w:right w:type="dxa" w:w="120"/>
+            </w:tcMar>
+            <w:vAlign w:val="center"/>
+          </w:tcPr>
+          <w:p>
+            <w:r>
+              <w:rPr>
+                <w:rFonts w:ascii="Arial" w:cs="Arial" w:eastAsia="Arial" w:hAnsi="Arial"/>
+                <w:b/>
+                <w:bCs/>
+                <w:color w:val="2B2620"/>
+                <w:sz w:val="19"/>
+                <w:szCs w:val="19"/>
+              </w:rPr>
+              <w:t xml:space="preserve">50</w:t>
+            </w:r>
+          </w:p>
+        </w:tc>
+        <w:tc>
+          <w:tcPr>
+            <w:tcW w:type="dxa" w:w="1500"/>
+            <w:shd w:fill="F6EFE3" w:val="clear"/>
+            <w:tcMar>
+              <w:top w:type="dxa" w:w="100"/>
+              <w:left w:type="dxa" w:w="120"/>
+              <w:bottom w:type="dxa" w:w="100"/>
+              <w:right w:type="dxa" w:w="120"/>
+            </w:tcMar>
+            <w:vAlign w:val="center"/>
+          </w:tcPr>
+          <w:p>
+            <w:r>
+              <w:rPr>
+                <w:rFonts w:ascii="Arial" w:cs="Arial" w:eastAsia="Arial" w:hAnsi="Arial"/>
+                <w:b w:val="false"/>
+                <w:bCs w:val="false"/>
+                <w:color w:val="2B2620"/>
+                <w:sz w:val="19"/>
+                <w:szCs w:val="19"/>
+              </w:rPr>
+              <w:t xml:space="preserve">Milz</w:t>
+            </w:r>
+          </w:p>
+        </w:tc>
+        <w:tc>
+          <w:tcPr>
+            <w:tcW w:type="dxa" w:w="2600"/>
+            <w:shd w:fill="F6EFE3" w:val="clear"/>
+            <w:tcMar>
+              <w:top w:type="dxa" w:w="100"/>
+              <w:left w:type="dxa" w:w="120"/>
+              <w:bottom w:type="dxa" w:w="100"/>
+              <w:right w:type="dxa" w:w="120"/>
+            </w:tcMar>
+            <w:vAlign w:val="center"/>
+          </w:tcPr>
+          <w:p>
+            <w:r>
+              <w:rPr>
+                <w:rFonts w:ascii="Arial" w:cs="Arial" w:eastAsia="Arial" w:hAnsi="Arial"/>
+                <w:b w:val="false"/>
+                <w:bCs w:val="false"/>
+                <w:color w:val="2B2620"/>
+                <w:sz w:val="19"/>
+                <w:szCs w:val="19"/>
+              </w:rPr>
+              <w:t xml:space="preserve">Mars (bewusst), Linie 4</w:t>
+            </w:r>
+          </w:p>
+        </w:tc>
+        <w:tc>
+          <w:tcPr>
+            <w:tcW w:type="dxa" w:w="3600"/>
+            <w:shd w:fill="F6EFE3" w:val="clear"/>
+            <w:tcMar>
+              <w:top w:type="dxa" w:w="100"/>
+              <w:left w:type="dxa" w:w="120"/>
+              <w:bottom w:type="dxa" w:w="100"/>
+              <w:right w:type="dxa" w:w="120"/>
+            </w:tcMar>
+            <w:vAlign w:val="center"/>
+          </w:tcPr>
+          <w:p>
+            <w:r>
+              <w:rPr>
+                <w:rFonts w:ascii="Arial" w:cs="Arial" w:eastAsia="Arial" w:hAnsi="Arial"/>
+                <w:b w:val="false"/>
+                <w:bCs w:val="false"/>
+                <w:color w:val="2B2620"/>
+                <w:sz w:val="19"/>
+                <w:szCs w:val="19"/>
+              </w:rPr>
+              <w:t xml:space="preserve">Werte — Gespür für Normen, Verantwortung und Fürsorge für eine Gemeinschaft</w:t>
+            </w:r>
+          </w:p>
+        </w:tc>
+      </w:tr>
+      <w:tr>
+        <w:tc>
+          <w:tcPr>
+            <w:tcW w:type="dxa" w:w="900"/>
+            <w:shd w:fill="FFFFFF" w:val="clear"/>
+            <w:tcMar>
+              <w:top w:type="dxa" w:w="100"/>
+              <w:left w:type="dxa" w:w="120"/>
+              <w:bottom w:type="dxa" w:w="100"/>
+              <w:right w:type="dxa" w:w="120"/>
+            </w:tcMar>
+            <w:vAlign w:val="center"/>
+          </w:tcPr>
+          <w:p>
+            <w:r>
+              <w:rPr>
+                <w:rFonts w:ascii="Arial" w:cs="Arial" w:eastAsia="Arial" w:hAnsi="Arial"/>
+                <w:b/>
+                <w:bCs/>
+                <w:color w:val="2B2620"/>
+                <w:sz w:val="19"/>
+                <w:szCs w:val="19"/>
+              </w:rPr>
+              <w:t xml:space="preserve">60</w:t>
+            </w:r>
+          </w:p>
+        </w:tc>
+        <w:tc>
+          <w:tcPr>
+            <w:tcW w:type="dxa" w:w="1500"/>
+            <w:shd w:fill="FFFFFF" w:val="clear"/>
+            <w:tcMar>
+              <w:top w:type="dxa" w:w="100"/>
+              <w:left w:type="dxa" w:w="120"/>
+              <w:bottom w:type="dxa" w:w="100"/>
+              <w:right w:type="dxa" w:w="120"/>
+            </w:tcMar>
+            <w:vAlign w:val="center"/>
+          </w:tcPr>
+          <w:p>
+            <w:r>
+              <w:rPr>
+                <w:rFonts w:ascii="Arial" w:cs="Arial" w:eastAsia="Arial" w:hAnsi="Arial"/>
+                <w:b w:val="false"/>
+                <w:bCs w:val="false"/>
+                <w:color w:val="2B2620"/>
+                <w:sz w:val="19"/>
+                <w:szCs w:val="19"/>
+              </w:rPr>
+              <w:t xml:space="preserve">Wurzel</w:t>
+            </w:r>
+          </w:p>
+        </w:tc>
+        <w:tc>
+          <w:tcPr>
+            <w:tcW w:type="dxa" w:w="2600"/>
+            <w:shd w:fill="FFFFFF" w:val="clear"/>
+            <w:tcMar>
+              <w:top w:type="dxa" w:w="100"/>
+              <w:left w:type="dxa" w:w="120"/>
+              <w:bottom w:type="dxa" w:w="100"/>
+              <w:right w:type="dxa" w:w="120"/>
+            </w:tcMar>
+            <w:vAlign w:val="center"/>
+          </w:tcPr>
+          <w:p>
+            <w:r>
+              <w:rPr>
+                <w:rFonts w:ascii="Arial" w:cs="Arial" w:eastAsia="Arial" w:hAnsi="Arial"/>
+                <w:b w:val="false"/>
+                <w:bCs w:val="false"/>
+                <w:color w:val="2B2620"/>
+                <w:sz w:val="19"/>
+                <w:szCs w:val="19"/>
+              </w:rPr>
+              <w:t xml:space="preserve">Jupiter (bewusst), Linie 2; Saturn (unbewusst), Linie 2</w:t>
+            </w:r>
+          </w:p>
+        </w:tc>
+        <w:tc>
+          <w:tcPr>
+            <w:tcW w:type="dxa" w:w="3600"/>
+            <w:shd w:fill="FFFFFF" w:val="clear"/>
+            <w:tcMar>
+              <w:top w:type="dxa" w:w="100"/>
+              <w:left w:type="dxa" w:w="120"/>
+              <w:bottom w:type="dxa" w:w="100"/>
+              <w:right w:type="dxa" w:w="120"/>
+            </w:tcMar>
+            <w:vAlign w:val="center"/>
+          </w:tcPr>
+          <w:p>
+            <w:r>
+              <w:rPr>
+                <w:rFonts w:ascii="Arial" w:cs="Arial" w:eastAsia="Arial" w:hAnsi="Arial"/>
+                <w:b w:val="false"/>
+                <w:bCs w:val="false"/>
+                <w:color w:val="2B2620"/>
+                <w:sz w:val="19"/>
+                <w:szCs w:val="19"/>
+              </w:rPr>
+              <w:t xml:space="preserve">Begrenzung — Grenzen als Grundlage für Struktur und Wandel akzeptieren</w:t>
+            </w:r>
+          </w:p>
+        </w:tc>
+      </w:tr>
+      <w:tr>
+        <w:tc>
+          <w:tcPr>
+            <w:tcW w:type="dxa" w:w="900"/>
+            <w:shd w:fill="F6EFE3" w:val="clear"/>
+            <w:tcMar>
+              <w:top w:type="dxa" w:w="100"/>
+              <w:left w:type="dxa" w:w="120"/>
+              <w:bottom w:type="dxa" w:w="100"/>
+              <w:right w:type="dxa" w:w="120"/>
+            </w:tcMar>
+            <w:vAlign w:val="center"/>
+          </w:tcPr>
+          <w:p>
+            <w:r>
+              <w:rPr>
+                <w:rFonts w:ascii="Arial" w:cs="Arial" w:eastAsia="Arial" w:hAnsi="Arial"/>
+                <w:b/>
+                <w:bCs/>
+                <w:color w:val="2B2620"/>
+                <w:sz w:val="19"/>
+                <w:szCs w:val="19"/>
+              </w:rPr>
+              <w:t xml:space="preserve">61</w:t>
+            </w:r>
+          </w:p>
+        </w:tc>
+        <w:tc>
+          <w:tcPr>
+            <w:tcW w:type="dxa" w:w="1500"/>
+            <w:shd w:fill="F6EFE3" w:val="clear"/>
+            <w:tcMar>
+              <w:top w:type="dxa" w:w="100"/>
+              <w:left w:type="dxa" w:w="120"/>
+              <w:bottom w:type="dxa" w:w="100"/>
+              <w:right w:type="dxa" w:w="120"/>
+            </w:tcMar>
+            <w:vAlign w:val="center"/>
+          </w:tcPr>
+          <w:p>
+            <w:r>
+              <w:rPr>
+                <w:rFonts w:ascii="Arial" w:cs="Arial" w:eastAsia="Arial" w:hAnsi="Arial"/>
+                <w:b w:val="false"/>
+                <w:bCs w:val="false"/>
+                <w:color w:val="2B2620"/>
+                <w:sz w:val="19"/>
+                <w:szCs w:val="19"/>
+              </w:rPr>
+              <w:t xml:space="preserve">Kopf</w:t>
+            </w:r>
+          </w:p>
+        </w:tc>
+        <w:tc>
+          <w:tcPr>
+            <w:tcW w:type="dxa" w:w="2600"/>
+            <w:shd w:fill="F6EFE3" w:val="clear"/>
+            <w:tcMar>
+              <w:top w:type="dxa" w:w="100"/>
+              <w:left w:type="dxa" w:w="120"/>
+              <w:bottom w:type="dxa" w:w="100"/>
+              <w:right w:type="dxa" w:w="120"/>
+            </w:tcMar>
+            <w:vAlign w:val="center"/>
+          </w:tcPr>
+          <w:p>
+            <w:r>
+              <w:rPr>
+                <w:rFonts w:ascii="Arial" w:cs="Arial" w:eastAsia="Arial" w:hAnsi="Arial"/>
+                <w:b w:val="false"/>
+                <w:bCs w:val="false"/>
+                <w:color w:val="2B2620"/>
+                <w:sz w:val="19"/>
+                <w:szCs w:val="19"/>
+              </w:rPr>
+              <w:t xml:space="preserve">Saturn (bewusst), Linie 3</w:t>
+            </w:r>
+          </w:p>
+        </w:tc>
+        <w:tc>
+          <w:tcPr>
+            <w:tcW w:type="dxa" w:w="3600"/>
+            <w:shd w:fill="F6EFE3" w:val="clear"/>
+            <w:tcMar>
+              <w:top w:type="dxa" w:w="100"/>
+              <w:left w:type="dxa" w:w="120"/>
+              <w:bottom w:type="dxa" w:w="100"/>
+              <w:right w:type="dxa" w:w="120"/>
+            </w:tcMar>
+            <w:vAlign w:val="center"/>
+          </w:tcPr>
+          <w:p>
+            <w:r>
+              <w:rPr>
+                <w:rFonts w:ascii="Arial" w:cs="Arial" w:eastAsia="Arial" w:hAnsi="Arial"/>
+                <w:b w:val="false"/>
+                <w:bCs w:val="false"/>
+                <w:color w:val="2B2620"/>
+                <w:sz w:val="19"/>
+                <w:szCs w:val="19"/>
+              </w:rPr>
+              <w:t xml:space="preserve">Inneres Wissen — die leise, unerklärbare Ahnung, die nach Ausdruck sucht</w:t>
+            </w:r>
+          </w:p>
+        </w:tc>
+      </w:tr>
+      <w:tr>
+        <w:tc>
+          <w:tcPr>
+            <w:tcW w:type="dxa" w:w="900"/>
+            <w:shd w:fill="FFFFFF" w:val="clear"/>
+            <w:tcMar>
+              <w:top w:type="dxa" w:w="100"/>
+              <w:left w:type="dxa" w:w="120"/>
+              <w:bottom w:type="dxa" w:w="100"/>
+              <w:right w:type="dxa" w:w="120"/>
+            </w:tcMar>
+            <w:vAlign w:val="center"/>
+          </w:tcPr>
+          <w:p>
+            <w:r>
+              <w:rPr>
+                <w:rFonts w:ascii="Arial" w:cs="Arial" w:eastAsia="Arial" w:hAnsi="Arial"/>
+                <w:b/>
+                <w:bCs/>
+                <w:color w:val="2B2620"/>
+                <w:sz w:val="19"/>
+                <w:szCs w:val="19"/>
+              </w:rPr>
+              <w:t xml:space="preserve">44</w:t>
+            </w:r>
+          </w:p>
+        </w:tc>
+        <w:tc>
+          <w:tcPr>
+            <w:tcW w:type="dxa" w:w="1500"/>
+            <w:shd w:fill="FFFFFF" w:val="clear"/>
+            <w:tcMar>
+              <w:top w:type="dxa" w:w="100"/>
+              <w:left w:type="dxa" w:w="120"/>
+              <w:bottom w:type="dxa" w:w="100"/>
+              <w:right w:type="dxa" w:w="120"/>
+            </w:tcMar>
+            <w:vAlign w:val="center"/>
+          </w:tcPr>
+          <w:p>
+            <w:r>
+              <w:rPr>
+                <w:rFonts w:ascii="Arial" w:cs="Arial" w:eastAsia="Arial" w:hAnsi="Arial"/>
+                <w:b w:val="false"/>
+                <w:bCs w:val="false"/>
+                <w:color w:val="2B2620"/>
+                <w:sz w:val="19"/>
+                <w:szCs w:val="19"/>
+              </w:rPr>
+              <w:t xml:space="preserve">Milz</w:t>
+            </w:r>
+          </w:p>
+        </w:tc>
+        <w:tc>
+          <w:tcPr>
+            <w:tcW w:type="dxa" w:w="2600"/>
+            <w:shd w:fill="FFFFFF" w:val="clear"/>
+            <w:tcMar>
+              <w:top w:type="dxa" w:w="100"/>
+              <w:left w:type="dxa" w:w="120"/>
+              <w:bottom w:type="dxa" w:w="100"/>
+              <w:right w:type="dxa" w:w="120"/>
+            </w:tcMar>
+            <w:vAlign w:val="center"/>
+          </w:tcPr>
+          <w:p>
+            <w:r>
+              <w:rPr>
+                <w:rFonts w:ascii="Arial" w:cs="Arial" w:eastAsia="Arial" w:hAnsi="Arial"/>
+                <w:b w:val="false"/>
+                <w:bCs w:val="false"/>
+                <w:color w:val="2B2620"/>
+                <w:sz w:val="19"/>
+                <w:szCs w:val="19"/>
+              </w:rPr>
+              <w:t xml:space="preserve">Neptun (bewusst), Linie 3; Neptun (unbewusst), Linie 2</w:t>
+            </w:r>
+          </w:p>
+        </w:tc>
+        <w:tc>
+          <w:tcPr>
+            <w:tcW w:type="dxa" w:w="3600"/>
+            <w:shd w:fill="FFFFFF" w:val="clear"/>
+            <w:tcMar>
+              <w:top w:type="dxa" w:w="100"/>
+              <w:left w:type="dxa" w:w="120"/>
+              <w:bottom w:type="dxa" w:w="100"/>
+              <w:right w:type="dxa" w:w="120"/>
+            </w:tcMar>
+            <w:vAlign w:val="center"/>
+          </w:tcPr>
+          <w:p>
+            <w:r>
+              <w:rPr>
+                <w:rFonts w:ascii="Arial" w:cs="Arial" w:eastAsia="Arial" w:hAnsi="Arial"/>
+                <w:b w:val="false"/>
+                <w:bCs w:val="false"/>
+                <w:color w:val="2B2620"/>
+                <w:sz w:val="19"/>
+                <w:szCs w:val="19"/>
+              </w:rPr>
+              <w:t xml:space="preserve">Wachsamkeit — instinktives Erkennen von Mustern aus der Vergangenheit</w:t>
+            </w:r>
+          </w:p>
+        </w:tc>
+      </w:tr>
+      <w:tr>
+        <w:tc>
+          <w:tcPr>
+            <w:tcW w:type="dxa" w:w="900"/>
+            <w:shd w:fill="F6EFE3" w:val="clear"/>
+            <w:tcMar>
+              <w:top w:type="dxa" w:w="100"/>
+              <w:left w:type="dxa" w:w="120"/>
+              <w:bottom w:type="dxa" w:w="100"/>
+              <w:right w:type="dxa" w:w="120"/>
+            </w:tcMar>
+            <w:vAlign w:val="center"/>
+          </w:tcPr>
+          <w:p>
+            <w:r>
+              <w:rPr>
+                <w:rFonts w:ascii="Arial" w:cs="Arial" w:eastAsia="Arial" w:hAnsi="Arial"/>
+                <w:b/>
+                <w:bCs/>
+                <w:color w:val="2B2620"/>
+                <w:sz w:val="19"/>
+                <w:szCs w:val="19"/>
+              </w:rPr>
+              <w:t xml:space="preserve">38</w:t>
+            </w:r>
+          </w:p>
+        </w:tc>
+        <w:tc>
+          <w:tcPr>
+            <w:tcW w:type="dxa" w:w="1500"/>
+            <w:shd w:fill="F6EFE3" w:val="clear"/>
+            <w:tcMar>
+              <w:top w:type="dxa" w:w="100"/>
+              <w:left w:type="dxa" w:w="120"/>
+              <w:bottom w:type="dxa" w:w="100"/>
+              <w:right w:type="dxa" w:w="120"/>
+            </w:tcMar>
+            <w:vAlign w:val="center"/>
+          </w:tcPr>
+          <w:p>
+            <w:r>
+              <w:rPr>
+                <w:rFonts w:ascii="Arial" w:cs="Arial" w:eastAsia="Arial" w:hAnsi="Arial"/>
+                <w:b w:val="false"/>
+                <w:bCs w:val="false"/>
+                <w:color w:val="2B2620"/>
+                <w:sz w:val="19"/>
+                <w:szCs w:val="19"/>
+              </w:rPr>
+              <w:t xml:space="preserve">Wurzel</w:t>
+            </w:r>
+          </w:p>
+        </w:tc>
+        <w:tc>
+          <w:tcPr>
+            <w:tcW w:type="dxa" w:w="2600"/>
+            <w:shd w:fill="F6EFE3" w:val="clear"/>
+            <w:tcMar>
+              <w:top w:type="dxa" w:w="100"/>
+              <w:left w:type="dxa" w:w="120"/>
+              <w:bottom w:type="dxa" w:w="100"/>
+              <w:right w:type="dxa" w:w="120"/>
+            </w:tcMar>
+            <w:vAlign w:val="center"/>
+          </w:tcPr>
+          <w:p>
+            <w:r>
+              <w:rPr>
+                <w:rFonts w:ascii="Arial" w:cs="Arial" w:eastAsia="Arial" w:hAnsi="Arial"/>
+                <w:b w:val="false"/>
+                <w:bCs w:val="false"/>
+                <w:color w:val="2B2620"/>
+                <w:sz w:val="19"/>
+                <w:szCs w:val="19"/>
+              </w:rPr>
+              <w:t xml:space="preserve">Erde (unbewusst), Linie 1</w:t>
+            </w:r>
+          </w:p>
+        </w:tc>
+        <w:tc>
+          <w:tcPr>
+            <w:tcW w:type="dxa" w:w="3600"/>
+            <w:shd w:fill="F6EFE3" w:val="clear"/>
+            <w:tcMar>
+              <w:top w:type="dxa" w:w="100"/>
+              <w:left w:type="dxa" w:w="120"/>
+              <w:bottom w:type="dxa" w:w="100"/>
+              <w:right w:type="dxa" w:w="120"/>
+            </w:tcMar>
+            <w:vAlign w:val="center"/>
+          </w:tcPr>
+          <w:p>
+            <w:r>
+              <w:rPr>
+                <w:rFonts w:ascii="Arial" w:cs="Arial" w:eastAsia="Arial" w:hAnsi="Arial"/>
+                <w:b w:val="false"/>
+                <w:bCs w:val="false"/>
+                <w:color w:val="2B2620"/>
+                <w:sz w:val="19"/>
+                <w:szCs w:val="19"/>
+              </w:rPr>
+              <w:t xml:space="preserve">Kämpferin — der Kampf um das, was es wirklich wert ist</w:t>
+            </w:r>
+          </w:p>
+        </w:tc>
+      </w:tr>
+      <w:tr>
+        <w:tc>
+          <w:tcPr>
+            <w:tcW w:type="dxa" w:w="900"/>
+            <w:shd w:fill="FFFFFF" w:val="clear"/>
+            <w:tcMar>
+              <w:top w:type="dxa" w:w="100"/>
+              <w:left w:type="dxa" w:w="120"/>
+              <w:bottom w:type="dxa" w:w="100"/>
+              <w:right w:type="dxa" w:w="120"/>
+            </w:tcMar>
+            <w:vAlign w:val="center"/>
+          </w:tcPr>
+          <w:p>
+            <w:r>
+              <w:rPr>
+                <w:rFonts w:ascii="Arial" w:cs="Arial" w:eastAsia="Arial" w:hAnsi="Arial"/>
+                <w:b/>
+                <w:bCs/>
+                <w:color w:val="2B2620"/>
+                <w:sz w:val="19"/>
+                <w:szCs w:val="19"/>
+              </w:rPr>
+              <w:t xml:space="preserve">39</w:t>
+            </w:r>
+          </w:p>
+        </w:tc>
+        <w:tc>
+          <w:tcPr>
+            <w:tcW w:type="dxa" w:w="1500"/>
+            <w:shd w:fill="FFFFFF" w:val="clear"/>
+            <w:tcMar>
+              <w:top w:type="dxa" w:w="100"/>
+              <w:left w:type="dxa" w:w="120"/>
+              <w:bottom w:type="dxa" w:w="100"/>
+              <w:right w:type="dxa" w:w="120"/>
+            </w:tcMar>
+            <w:vAlign w:val="center"/>
+          </w:tcPr>
+          <w:p>
+            <w:r>
+              <w:rPr>
+                <w:rFonts w:ascii="Arial" w:cs="Arial" w:eastAsia="Arial" w:hAnsi="Arial"/>
+                <w:b w:val="false"/>
+                <w:bCs w:val="false"/>
+                <w:color w:val="2B2620"/>
+                <w:sz w:val="19"/>
+                <w:szCs w:val="19"/>
+              </w:rPr>
+              <w:t xml:space="preserve">Wurzel</w:t>
+            </w:r>
+          </w:p>
+        </w:tc>
+        <w:tc>
+          <w:tcPr>
+            <w:tcW w:type="dxa" w:w="2600"/>
+            <w:shd w:fill="FFFFFF" w:val="clear"/>
+            <w:tcMar>
+              <w:top w:type="dxa" w:w="100"/>
+              <w:left w:type="dxa" w:w="120"/>
+              <w:bottom w:type="dxa" w:w="100"/>
+              <w:right w:type="dxa" w:w="120"/>
+            </w:tcMar>
+            <w:vAlign w:val="center"/>
+          </w:tcPr>
+          <w:p>
+            <w:r>
+              <w:rPr>
+                <w:rFonts w:ascii="Arial" w:cs="Arial" w:eastAsia="Arial" w:hAnsi="Arial"/>
+                <w:b w:val="false"/>
+                <w:bCs w:val="false"/>
+                <w:color w:val="2B2620"/>
+                <w:sz w:val="19"/>
+                <w:szCs w:val="19"/>
+              </w:rPr>
+              <w:t xml:space="preserve">Sonne (unbewusst), Linie 1</w:t>
+            </w:r>
+          </w:p>
+        </w:tc>
+        <w:tc>
+          <w:tcPr>
+            <w:tcW w:type="dxa" w:w="3600"/>
+            <w:shd w:fill="FFFFFF" w:val="clear"/>
+            <w:tcMar>
+              <w:top w:type="dxa" w:w="100"/>
+              <w:left w:type="dxa" w:w="120"/>
+              <w:bottom w:type="dxa" w:w="100"/>
+              <w:right w:type="dxa" w:w="120"/>
+            </w:tcMar>
+            <w:vAlign w:val="center"/>
+          </w:tcPr>
+          <w:p>
+            <w:r>
+              <w:rPr>
+                <w:rFonts w:ascii="Arial" w:cs="Arial" w:eastAsia="Arial" w:hAnsi="Arial"/>
+                <w:b w:val="false"/>
+                <w:bCs w:val="false"/>
+                <w:color w:val="2B2620"/>
+                <w:sz w:val="19"/>
+                <w:szCs w:val="19"/>
+              </w:rPr>
+              <w:t xml:space="preserve">Provokation — durch Reibung echte Reaktion und echtes Gefühl sichtbar machen</w:t>
+            </w:r>
+          </w:p>
+        </w:tc>
+      </w:tr>
+      <w:tr>
+        <w:tc>
+          <w:tcPr>
+            <w:tcW w:type="dxa" w:w="900"/>
+            <w:shd w:fill="F6EFE3" w:val="clear"/>
+            <w:tcMar>
+              <w:top w:type="dxa" w:w="100"/>
+              <w:left w:type="dxa" w:w="120"/>
+              <w:bottom w:type="dxa" w:w="100"/>
+              <w:right w:type="dxa" w:w="120"/>
+            </w:tcMar>
+            <w:vAlign w:val="center"/>
+          </w:tcPr>
+          <w:p>
+            <w:r>
+              <w:rPr>
+                <w:rFonts w:ascii="Arial" w:cs="Arial" w:eastAsia="Arial" w:hAnsi="Arial"/>
+                <w:b/>
+                <w:bCs/>
+                <w:color w:val="2B2620"/>
+                <w:sz w:val="19"/>
+                <w:szCs w:val="19"/>
+              </w:rPr>
+              <w:t xml:space="preserve">8</w:t>
+            </w:r>
+          </w:p>
+        </w:tc>
+        <w:tc>
+          <w:tcPr>
+            <w:tcW w:type="dxa" w:w="1500"/>
+            <w:shd w:fill="F6EFE3" w:val="clear"/>
+            <w:tcMar>
+              <w:top w:type="dxa" w:w="100"/>
+              <w:left w:type="dxa" w:w="120"/>
+              <w:bottom w:type="dxa" w:w="100"/>
+              <w:right w:type="dxa" w:w="120"/>
+            </w:tcMar>
+            <w:vAlign w:val="center"/>
+          </w:tcPr>
+          <w:p>
+            <w:r>
+              <w:rPr>
+                <w:rFonts w:ascii="Arial" w:cs="Arial" w:eastAsia="Arial" w:hAnsi="Arial"/>
+                <w:b w:val="false"/>
+                <w:bCs w:val="false"/>
+                <w:color w:val="2B2620"/>
+                <w:sz w:val="19"/>
+                <w:szCs w:val="19"/>
+              </w:rPr>
+              <w:t xml:space="preserve">Kehle</w:t>
+            </w:r>
+          </w:p>
+        </w:tc>
+        <w:tc>
+          <w:tcPr>
+            <w:tcW w:type="dxa" w:w="2600"/>
+            <w:shd w:fill="F6EFE3" w:val="clear"/>
+            <w:tcMar>
+              <w:top w:type="dxa" w:w="100"/>
+              <w:left w:type="dxa" w:w="120"/>
+              <w:bottom w:type="dxa" w:w="100"/>
+              <w:right w:type="dxa" w:w="120"/>
+            </w:tcMar>
+            <w:vAlign w:val="center"/>
+          </w:tcPr>
+          <w:p>
+            <w:r>
+              <w:rPr>
+                <w:rFonts w:ascii="Arial" w:cs="Arial" w:eastAsia="Arial" w:hAnsi="Arial"/>
+                <w:b w:val="false"/>
+                <w:bCs w:val="false"/>
+                <w:color w:val="2B2620"/>
+                <w:sz w:val="19"/>
+                <w:szCs w:val="19"/>
+              </w:rPr>
+              <w:t xml:space="preserve">Venus (unbewusst), Linie 1</w:t>
+            </w:r>
+          </w:p>
+        </w:tc>
+        <w:tc>
+          <w:tcPr>
+            <w:tcW w:type="dxa" w:w="3600"/>
+            <w:shd w:fill="F6EFE3" w:val="clear"/>
+            <w:tcMar>
+              <w:top w:type="dxa" w:w="100"/>
+              <w:left w:type="dxa" w:w="120"/>
+              <w:bottom w:type="dxa" w:w="100"/>
+              <w:right w:type="dxa" w:w="120"/>
+            </w:tcMar>
+            <w:vAlign w:val="center"/>
+          </w:tcPr>
+          <w:p>
+            <w:r>
+              <w:rPr>
+                <w:rFonts w:ascii="Arial" w:cs="Arial" w:eastAsia="Arial" w:hAnsi="Arial"/>
+                <w:b w:val="false"/>
+                <w:bCs w:val="false"/>
+                <w:color w:val="2B2620"/>
+                <w:sz w:val="19"/>
+                <w:szCs w:val="19"/>
+              </w:rPr>
+              <w:t xml:space="preserve">Beitrag — der eigene, unverwechselbare kreative Stil</w:t>
+            </w:r>
+          </w:p>
+        </w:tc>
+      </w:tr>
+      <w:tr>
+        <w:tc>
+          <w:tcPr>
+            <w:tcW w:type="dxa" w:w="900"/>
+            <w:shd w:fill="FFFFFF" w:val="clear"/>
+            <w:tcMar>
+              <w:top w:type="dxa" w:w="100"/>
+              <w:left w:type="dxa" w:w="120"/>
+              <w:bottom w:type="dxa" w:w="100"/>
+              <w:right w:type="dxa" w:w="120"/>
+            </w:tcMar>
+            <w:vAlign w:val="center"/>
+          </w:tcPr>
+          <w:p>
+            <w:r>
+              <w:rPr>
+                <w:rFonts w:ascii="Arial" w:cs="Arial" w:eastAsia="Arial" w:hAnsi="Arial"/>
+                <w:b/>
+                <w:bCs/>
+                <w:color w:val="2B2620"/>
+                <w:sz w:val="19"/>
+                <w:szCs w:val="19"/>
+              </w:rPr>
+              <w:t xml:space="preserve">59</w:t>
+            </w:r>
+          </w:p>
+        </w:tc>
+        <w:tc>
+          <w:tcPr>
+            <w:tcW w:type="dxa" w:w="1500"/>
+            <w:shd w:fill="FFFFFF" w:val="clear"/>
+            <w:tcMar>
+              <w:top w:type="dxa" w:w="100"/>
+              <w:left w:type="dxa" w:w="120"/>
+              <w:bottom w:type="dxa" w:w="100"/>
+              <w:right w:type="dxa" w:w="120"/>
+            </w:tcMar>
+            <w:vAlign w:val="center"/>
+          </w:tcPr>
+          <w:p>
+            <w:r>
+              <w:rPr>
+                <w:rFonts w:ascii="Arial" w:cs="Arial" w:eastAsia="Arial" w:hAnsi="Arial"/>
+                <w:b w:val="false"/>
+                <w:bCs w:val="false"/>
+                <w:color w:val="2B2620"/>
+                <w:sz w:val="19"/>
+                <w:szCs w:val="19"/>
+              </w:rPr>
+              <w:t xml:space="preserve">Sakral</w:t>
+            </w:r>
+          </w:p>
+        </w:tc>
+        <w:tc>
+          <w:tcPr>
+            <w:tcW w:type="dxa" w:w="2600"/>
+            <w:shd w:fill="FFFFFF" w:val="clear"/>
+            <w:tcMar>
+              <w:top w:type="dxa" w:w="100"/>
+              <w:left w:type="dxa" w:w="120"/>
+              <w:bottom w:type="dxa" w:w="100"/>
+              <w:right w:type="dxa" w:w="120"/>
+            </w:tcMar>
+            <w:vAlign w:val="center"/>
+          </w:tcPr>
+          <w:p>
+            <w:r>
+              <w:rPr>
+                <w:rFonts w:ascii="Arial" w:cs="Arial" w:eastAsia="Arial" w:hAnsi="Arial"/>
+                <w:b w:val="false"/>
+                <w:bCs w:val="false"/>
+                <w:color w:val="2B2620"/>
+                <w:sz w:val="19"/>
+                <w:szCs w:val="19"/>
+              </w:rPr>
+              <w:t xml:space="preserve">Mars (unbewusst), Linie 2</w:t>
+            </w:r>
+          </w:p>
+        </w:tc>
+        <w:tc>
+          <w:tcPr>
+            <w:tcW w:type="dxa" w:w="3600"/>
+            <w:shd w:fill="FFFFFF" w:val="clear"/>
+            <w:tcMar>
+              <w:top w:type="dxa" w:w="100"/>
+              <w:left w:type="dxa" w:w="120"/>
+              <w:bottom w:type="dxa" w:w="100"/>
+              <w:right w:type="dxa" w:w="120"/>
+            </w:tcMar>
+            <w:vAlign w:val="center"/>
+          </w:tcPr>
+          <w:p>
+            <w:r>
+              <w:rPr>
+                <w:rFonts w:ascii="Arial" w:cs="Arial" w:eastAsia="Arial" w:hAnsi="Arial"/>
+                <w:b w:val="false"/>
+                <w:bCs w:val="false"/>
+                <w:color w:val="2B2620"/>
+                <w:sz w:val="19"/>
+                <w:szCs w:val="19"/>
+              </w:rPr>
+              <w:t xml:space="preserve">Verschmelzung — Barrieren auflösen, um wirkliche Nähe möglich zu machen</w:t>
+            </w:r>
+          </w:p>
+        </w:tc>
+      </w:tr>
+      <w:tr>
+        <w:tc>
+          <w:tcPr>
+            <w:tcW w:type="dxa" w:w="900"/>
+            <w:shd w:fill="F6EFE3" w:val="clear"/>
+            <w:tcMar>
+              <w:top w:type="dxa" w:w="100"/>
+              <w:left w:type="dxa" w:w="120"/>
+              <w:bottom w:type="dxa" w:w="100"/>
+              <w:right w:type="dxa" w:w="120"/>
+            </w:tcMar>
+            <w:vAlign w:val="center"/>
+          </w:tcPr>
+          <w:p>
+            <w:r>
+              <w:rPr>
+                <w:rFonts w:ascii="Arial" w:cs="Arial" w:eastAsia="Arial" w:hAnsi="Arial"/>
+                <w:b/>
+                <w:bCs/>
+                <w:color w:val="2B2620"/>
+                <w:sz w:val="19"/>
+                <w:szCs w:val="19"/>
+              </w:rPr>
+              <w:t xml:space="preserve">41</w:t>
+            </w:r>
+          </w:p>
+        </w:tc>
+        <w:tc>
+          <w:tcPr>
+            <w:tcW w:type="dxa" w:w="1500"/>
+            <w:shd w:fill="F6EFE3" w:val="clear"/>
+            <w:tcMar>
+              <w:top w:type="dxa" w:w="100"/>
+              <w:left w:type="dxa" w:w="120"/>
+              <w:bottom w:type="dxa" w:w="100"/>
+              <w:right w:type="dxa" w:w="120"/>
+            </w:tcMar>
+            <w:vAlign w:val="center"/>
+          </w:tcPr>
+          <w:p>
+            <w:r>
+              <w:rPr>
+                <w:rFonts w:ascii="Arial" w:cs="Arial" w:eastAsia="Arial" w:hAnsi="Arial"/>
+                <w:b w:val="false"/>
+                <w:bCs w:val="false"/>
+                <w:color w:val="2B2620"/>
+                <w:sz w:val="19"/>
+                <w:szCs w:val="19"/>
+              </w:rPr>
+              <w:t xml:space="preserve">Wurzel</w:t>
+            </w:r>
+          </w:p>
+        </w:tc>
+        <w:tc>
+          <w:tcPr>
+            <w:tcW w:type="dxa" w:w="2600"/>
+            <w:shd w:fill="F6EFE3" w:val="clear"/>
+            <w:tcMar>
+              <w:top w:type="dxa" w:w="100"/>
+              <w:left w:type="dxa" w:w="120"/>
+              <w:bottom w:type="dxa" w:w="100"/>
+              <w:right w:type="dxa" w:w="120"/>
+            </w:tcMar>
+            <w:vAlign w:val="center"/>
+          </w:tcPr>
+          <w:p>
+            <w:r>
+              <w:rPr>
+                <w:rFonts w:ascii="Arial" w:cs="Arial" w:eastAsia="Arial" w:hAnsi="Arial"/>
+                <w:b w:val="false"/>
+                <w:bCs w:val="false"/>
+                <w:color w:val="2B2620"/>
+                <w:sz w:val="19"/>
+                <w:szCs w:val="19"/>
+              </w:rPr>
+              <w:t xml:space="preserve">Jupiter (unbewusst), Linie 4</w:t>
+            </w:r>
+          </w:p>
+        </w:tc>
+        <w:tc>
+          <w:tcPr>
+            <w:tcW w:type="dxa" w:w="3600"/>
+            <w:shd w:fill="F6EFE3" w:val="clear"/>
+            <w:tcMar>
+              <w:top w:type="dxa" w:w="100"/>
+              <w:left w:type="dxa" w:w="120"/>
+              <w:bottom w:type="dxa" w:w="100"/>
+              <w:right w:type="dxa" w:w="120"/>
+            </w:tcMar>
+            <w:vAlign w:val="center"/>
+          </w:tcPr>
+          <w:p>
+            <w:r>
+              <w:rPr>
+                <w:rFonts w:ascii="Arial" w:cs="Arial" w:eastAsia="Arial" w:hAnsi="Arial"/>
+                <w:b w:val="false"/>
+                <w:bCs w:val="false"/>
+                <w:color w:val="2B2620"/>
+                <w:sz w:val="19"/>
+                <w:szCs w:val="19"/>
+              </w:rPr>
+              <w:t xml:space="preserve">Fantasie — der erste Impuls von Vorstellungskraft, der nach Erfüllung sucht</w:t>
+            </w:r>
+          </w:p>
+        </w:tc>
+      </w:tr>
+      <w:tr>
+        <w:tc>
+          <w:tcPr>
+            <w:tcW w:type="dxa" w:w="900"/>
+            <w:shd w:fill="FFFFFF" w:val="clear"/>
+            <w:tcMar>
+              <w:top w:type="dxa" w:w="100"/>
+              <w:left w:type="dxa" w:w="120"/>
+              <w:bottom w:type="dxa" w:w="100"/>
+              <w:right w:type="dxa" w:w="120"/>
+            </w:tcMar>
+            <w:vAlign w:val="center"/>
+          </w:tcPr>
+          <w:p>
+            <w:r>
+              <w:rPr>
+                <w:rFonts w:ascii="Arial" w:cs="Arial" w:eastAsia="Arial" w:hAnsi="Arial"/>
+                <w:b/>
+                <w:bCs/>
+                <w:color w:val="2B2620"/>
+                <w:sz w:val="19"/>
+                <w:szCs w:val="19"/>
+              </w:rPr>
+              <w:t xml:space="preserve">4</w:t>
+            </w:r>
+          </w:p>
+        </w:tc>
+        <w:tc>
+          <w:tcPr>
+            <w:tcW w:type="dxa" w:w="1500"/>
+            <w:shd w:fill="FFFFFF" w:val="clear"/>
+            <w:tcMar>
+              <w:top w:type="dxa" w:w="100"/>
+              <w:left w:type="dxa" w:w="120"/>
+              <w:bottom w:type="dxa" w:w="100"/>
+              <w:right w:type="dxa" w:w="120"/>
+            </w:tcMar>
+            <w:vAlign w:val="center"/>
+          </w:tcPr>
+          <w:p>
+            <w:r>
+              <w:rPr>
+                <w:rFonts w:ascii="Arial" w:cs="Arial" w:eastAsia="Arial" w:hAnsi="Arial"/>
+                <w:b w:val="false"/>
+                <w:bCs w:val="false"/>
+                <w:color w:val="2B2620"/>
+                <w:sz w:val="19"/>
+                <w:szCs w:val="19"/>
+              </w:rPr>
+              <w:t xml:space="preserve">Ajna</w:t>
+            </w:r>
+          </w:p>
+        </w:tc>
+        <w:tc>
+          <w:tcPr>
+            <w:tcW w:type="dxa" w:w="2600"/>
+            <w:shd w:fill="FFFFFF" w:val="clear"/>
+            <w:tcMar>
+              <w:top w:type="dxa" w:w="100"/>
+              <w:left w:type="dxa" w:w="120"/>
+              <w:bottom w:type="dxa" w:w="100"/>
+              <w:right w:type="dxa" w:w="120"/>
+            </w:tcMar>
+            <w:vAlign w:val="center"/>
+          </w:tcPr>
+          <w:p>
+            <w:r>
+              <w:rPr>
+                <w:rFonts w:ascii="Arial" w:cs="Arial" w:eastAsia="Arial" w:hAnsi="Arial"/>
+                <w:b w:val="false"/>
+                <w:bCs w:val="false"/>
+                <w:color w:val="2B2620"/>
+                <w:sz w:val="19"/>
+                <w:szCs w:val="19"/>
+              </w:rPr>
+              <w:t xml:space="preserve">Uranus (unbewusst), Linie 5</w:t>
+            </w:r>
+          </w:p>
+        </w:tc>
+        <w:tc>
+          <w:tcPr>
+            <w:tcW w:type="dxa" w:w="3600"/>
+            <w:shd w:fill="FFFFFF" w:val="clear"/>
+            <w:tcMar>
+              <w:top w:type="dxa" w:w="100"/>
+              <w:left w:type="dxa" w:w="120"/>
+              <w:bottom w:type="dxa" w:w="100"/>
+              <w:right w:type="dxa" w:w="120"/>
+            </w:tcMar>
+            <w:vAlign w:val="center"/>
+          </w:tcPr>
+          <w:p>
+            <w:r>
+              <w:rPr>
+                <w:rFonts w:ascii="Arial" w:cs="Arial" w:eastAsia="Arial" w:hAnsi="Arial"/>
+                <w:b w:val="false"/>
+                <w:bCs w:val="false"/>
+                <w:color w:val="2B2620"/>
+                <w:sz w:val="19"/>
+                <w:szCs w:val="19"/>
+              </w:rPr>
+              <w:t xml:space="preserve">Formalisierung — feste, logische Antworten auf wiederkehrende Fragen</w:t>
+            </w:r>
+          </w:p>
+        </w:tc>
+      </w:tr>
+    </w:tbl>
+    <w:p>
+      <w:pPr>
+        <w:spacing w:after="200"/>
+      </w:pPr>
+    </w:p>
+    <w:p>
+      <w:pPr>
+        <w:spacing w:after="200" w:line="320"/>
+        <w:jc w:val="both"/>
+      </w:pPr>
+      <w:r>
+        <w:rPr>
+          <w:rFonts w:ascii="Arial" w:cs="Arial" w:eastAsia="Arial" w:hAnsi="Arial"/>
+          <w:color w:val="2B2620"/>
+          <w:sz w:val="22"/>
+          <w:szCs w:val="22"/>
+        </w:rPr>
+        <w:t xml:space="preserve">Zur Einordnung der Liniennummern: Jedes Tor wird in sechs Linien unterteilt, die unabhängig vom jeweiligen Tor immer dieselbe Grundfärbung tragen. Linie 1 (Forscherin) sucht Sicherheit durch Wissen und Fundament. Linie 2 (Einsiedlerin) hat eine natürliche Begabung, die am besten aus dem Rückzug heraus und dann auf Einladung hin gezeigt wird. Linie 3 (Bindungsprüferin) lernt durch Versuch, Irrtum und das Erleben, was in der Praxis wirklich funktioniert. Linie 4 (Netzwerkerin) wirkt über persönliche Beziehungen und ein stabiles Freundes- und Beziehungsfundament. Linie 5 (Ketzerin) wird von anderen pragmatisch für Lösungen und Führung beansprucht, oft projizierend. Linie 6 (Vorbild) durchläuft drei Lebensphasen — Versuch und Irrtum, Rückzug zur Beobachtung, dann eine beispielhafte Vorbildrolle — und lebt zunehmend als Vorbild statt im Klein-Klein. Jede Linienangabe in der Tabelle oben zeigt also nicht nur, welches Thema (Tor) aktiv ist, sondern auch, in welcher dieser sechs Grundfarben es bei dir gelebt wird.</w:t>
+      </w:r>
+    </w:p>
+    <w:p>
+      <w:r>
+        <w:br w:type="page"/>
+      </w:r>
+    </w:p>
+    <w:p>
+      <w:pPr>
+        <w:pBdr>
+          <w:bottom w:val="single" w:color="A6803C" w:sz="6" w:space="6"/>
+        </w:pBdr>
+        <w:spacing w:after="40" w:before="320"/>
+      </w:pPr>
+      <w:r>
+        <w:rPr>
+          <w:rFonts w:ascii="Arial" w:cs="Arial" w:eastAsia="Arial" w:hAnsi="Arial"/>
+          <w:b/>
+          <w:bCs/>
+          <w:color w:val="5B2333"/>
+          <w:sz w:val="30"/>
+          <w:szCs w:val="30"/>
+        </w:rPr>
+        <w:t xml:space="preserve">Die offenen Zentren im Detail</w:t>
+      </w:r>
+    </w:p>
+    <w:p>
+      <w:pPr>
+        <w:spacing w:after="160" w:before="60"/>
+      </w:pPr>
+      <w:r>
+        <w:rPr>
+          <w:rFonts w:ascii="Arial" w:cs="Arial" w:eastAsia="Arial" w:hAnsi="Arial"/>
+          <w:i/>
+          <w:iCs/>
+          <w:color w:val="A6803C"/>
+          <w:sz w:val="21"/>
+          <w:szCs w:val="21"/>
+        </w:rPr>
+        <w:t xml:space="preserve">Kopf, Ajna, Kehle, Ich (G), Sakral und Herz — mit ihren einzelnen Toren</w:t>
+      </w:r>
+    </w:p>
+    <w:p>
+      <w:pPr>
+        <w:spacing w:after="200" w:line="320"/>
+        <w:jc w:val="both"/>
+      </w:pPr>
+      <w:r>
+        <w:rPr>
+          <w:rFonts w:ascii="Arial" w:cs="Arial" w:eastAsia="Arial" w:hAnsi="Arial"/>
+          <w:color w:val="2B2620"/>
+          <w:sz w:val="22"/>
+          <w:szCs w:val="22"/>
+        </w:rPr>
+        <w:t xml:space="preserve">Kopf (Tor 61, bewusst über Saturn, Linie 3): Ein leises, nicht immer erklärbares inneres Wissen drängt nach Ausdruck — verstärkt durch die Bindungsprüferin-Linie 3, das heißt: Diese Ahnungen bewähren sich bei dir eher in der praktischen Erprobung als in der reinen Theorie. Da das Kopf-Zentrum insgesamt offen ist, nimmst du den Denk- und Inspirationsdruck deiner Umgebung leicht auf, ohne ihn selbst zu erzeugen — eine Stärke, wenn du dir bewusst machst, dass nicht jede drängende Frage deine eigene ist.</w:t>
+      </w:r>
+    </w:p>
+    <w:p>
+      <w:pPr>
+        <w:spacing w:after="200" w:line="320"/>
+        <w:jc w:val="both"/>
+      </w:pPr>
+      <w:r>
+        <w:rPr>
+          <w:rFonts w:ascii="Arial" w:cs="Arial" w:eastAsia="Arial" w:hAnsi="Arial"/>
+          <w:color w:val="2B2620"/>
+          <w:sz w:val="22"/>
+          <w:szCs w:val="22"/>
+        </w:rPr>
+        <w:t xml:space="preserve">Ajna (Tore 17 und 4): Tor 17 (bewusst, Erde, Linie 5) gibt dir eine klare, oft gefragte Meinung; Tor 4 (unbewusst, Uranus, Linie 5) liefert im Hintergrund feste, logische Antworten auf wiederkehrende Fragen. Beide tragen die Fünfer-Linie: Deine Meinungen und Antworten werden von außen leicht als praktische Lösung eingefordert. Weil Ajna insgesamt offen bleibt, ist keine dieser Meinungen in Stein gemeißelt — du kannst, anders als bei einer definierten Ajna, mehrere Blickwinkel gleichzeitig einnehmen, was Weisheit ermöglicht, aber auch verunsichern kann, wenn zu viele fremde Meinungen gleichzeitig einströmen.</w:t>
+      </w:r>
+    </w:p>
+    <w:p>
+      <w:pPr>
+        <w:spacing w:after="200" w:line="320"/>
+        <w:jc w:val="both"/>
+      </w:pPr>
+      <w:r>
+        <w:rPr>
+          <w:rFonts w:ascii="Arial" w:cs="Arial" w:eastAsia="Arial" w:hAnsi="Arial"/>
+          <w:color w:val="2B2620"/>
+          <w:sz w:val="22"/>
+          <w:szCs w:val="22"/>
+        </w:rPr>
+        <w:t xml:space="preserve">Kehle (Tor 8, unbewusst über Venus, Linie 1): Ein unbewusster Drang, dich mit einem eigenen, unverwechselbaren Stil einzubringen — hier über die Forscherin-Linie 1, also getragen von echtem, selbst erarbeitetem Fundament statt von Show. Da die Kehle als Ganzes offen ist, ist dieser Beitrag nicht ständig verfügbar, sondern situativ: Du bist nicht dafür gebaut, immer im Rampenlicht zu performen, sondern dann, wenn Umstände und Publikum wirklich passen.</w:t>
+      </w:r>
+    </w:p>
+    <w:p>
+      <w:pPr>
+        <w:spacing w:after="200" w:line="320"/>
+        <w:jc w:val="both"/>
+      </w:pPr>
+      <w:r>
+        <w:rPr>
+          <w:rFonts w:ascii="Arial" w:cs="Arial" w:eastAsia="Arial" w:hAnsi="Arial"/>
+          <w:color w:val="2B2620"/>
+          <w:sz w:val="22"/>
+          <w:szCs w:val="22"/>
+        </w:rPr>
+        <w:t xml:space="preserve">Ich / G (Tor 15, doppelt: bewusst über den Mond UND unbewusst über Merkur, jeweils Linie 6): Eine besonders verstärkte Aktivierung — Tor 15, 'Extreme', erscheint bei dir gleich zweimal auf derselben Linie. Das Thema, die ganze Bandbreite menschlichen Verhaltens anzunehmen und einen eigenen, unabhängigen Rhythmus zu finden statt sich fremden Zeitplänen zu unterwerfen, ist bei dir also doppelt unterstrichen — passend zur Vorbild-Linie 6, die diesen eigenen Rhythmus zunehmend beispielhaft nach außen trägt. Da das Ich-Zentrum insgesamt offen ist, bleibt deine Identität und deine Liebesrichtung wandelbar und kontextabhängig: lebendig und anpassungsfähig, aber eben auch leicht beeinflussbar durch das Gegenüber, wenn du nicht bei dir bleibst.</w:t>
+      </w:r>
+    </w:p>
+    <w:p>
+      <w:pPr>
+        <w:spacing w:after="200" w:line="320"/>
+        <w:jc w:val="both"/>
+      </w:pPr>
+      <w:r>
+        <w:rPr>
+          <w:rFonts w:ascii="Arial" w:cs="Arial" w:eastAsia="Arial" w:hAnsi="Arial"/>
+          <w:color w:val="2B2620"/>
+          <w:sz w:val="22"/>
+          <w:szCs w:val="22"/>
+        </w:rPr>
+        <w:t xml:space="preserve">Sakral (Tore 29 und 59): Tor 29 ist bei dir gleich dreifach aktiv — bewusst über den Nordknoten (Linie 3) und Uranus (Linie 5), unbewusst über den Südknoten (Linie 4) — ein ungewöhnlich starkes Echo des Themas 'Ausdauer': das volle, verbindliche Ja zu einer Erfahrung. Tor 59 (unbewusst über Mars, Linie 2) bringt zusätzlich den Impuls, Barrieren zwischen Menschen aufzulösen, um echte Nähe zu ermöglichen. Weil dein Sakral-Zentrum insgesamt offen ist — du bist kein Generator-Typ —, ist diese Ausdauer- und Verbindungskraft nicht endlos verfügbar: Sie will bewusst dosiert werden, statt sich (dem eigenen Ja-Sagen-Reflex folgend) in Erfahrungen zu erschöpfen, für die eigentlich keine nachhaltige Energie da ist.</w:t>
+      </w:r>
+    </w:p>
+    <w:p>
+      <w:pPr>
+        <w:spacing w:after="200" w:line="320"/>
+        <w:jc w:val="both"/>
+      </w:pPr>
+      <w:r>
+        <w:rPr>
+          <w:rFonts w:ascii="Arial" w:cs="Arial" w:eastAsia="Arial" w:hAnsi="Arial"/>
+          <w:color w:val="2B2620"/>
+          <w:sz w:val="22"/>
+          <w:szCs w:val="22"/>
+        </w:rPr>
+        <w:t xml:space="preserve">Herz (Tor 40, dreifach: bewusst über Venus UND Pluto, beide Linie 4, unbewusst über Pluto, Linie 1): Bemerkenswert ist hier die exakte Übereinstimmung mit der Venus-Pluto-Konjunktion aus dem astrologischen Teil oben — dieselbe reale Planetenkonstellation zeigt sich in Human Design als doppelte Aktivierung von Tor 40, 'Alleinsein'. Das Thema: sich für andere verausgaben können, aber ebenso das Recht und die Notwendigkeit, sich danach bewusst abzugrenzen, um wirklich anzukommen — over-give und Rückzug im Wechsel. Da das Herz-Zentrum offen ist, ist Wille und Selbstwert bei dir kein Dauerzustand, sondern schwankt mit dem Umfeld; die eigene Verausgabung an Bedingungen zu knüpfen (siehe die Reflexion zu Venus/Pluto oben) ist auch hier der Schlüssel.</w:t>
+      </w:r>
+    </w:p>
+    <w:p>
+      <w:r>
+        <w:br w:type="page"/>
       </w:r>
     </w:p>
     <w:p>

</xml_diff>

<commit_message>
Give Sternenportrait a warmer, more colorful design
Adds a rose/blush accent palette alongside the existing plum and
gold: rose section headings for the Human Design chapters, warm gold
for Chinese zodiac/numerology, a lilac-shaded subtitle band and
decorative ornaments on the title page, blush alternating table
rows, and rose-colored headers on the two Human Design tables.

Co-Authored-By: Claude Sonnet 5 <noreply@anthropic.com>
Claude-Session: https://claude.ai/code/session_01WEP9tMJFJXqk7xbdkvVd7M
</commit_message>
<xml_diff>
--- a/outputs/Claudia_Schelbert_Sternenportrait.docx
+++ b/outputs/Claudia_Schelbert_Sternenportrait.docx
@@ -4,7 +4,7 @@
   <w:body>
     <w:p>
       <w:pPr>
-        <w:spacing w:before="1600"/>
+        <w:spacing w:before="900"/>
       </w:pPr>
     </w:p>
     <w:p>
@@ -14,11 +14,27 @@
       </w:pPr>
       <w:r>
         <w:rPr>
-          <w:color w:val="A6803C"/>
+          <w:color w:val="C97B95"/>
           <w:sz w:val="40"/>
           <w:szCs w:val="40"/>
         </w:rPr>
-        <w:t xml:space="preserve">✦</w:t>
+        <w:t xml:space="preserve">✦ </w:t>
+      </w:r>
+      <w:r>
+        <w:rPr>
+          <w:color w:val="A6803C"/>
+          <w:sz w:val="36"/>
+          <w:szCs w:val="36"/>
+        </w:rPr>
+        <w:t xml:space="preserve">❀</w:t>
+      </w:r>
+      <w:r>
+        <w:rPr>
+          <w:color w:val="C97B95"/>
+          <w:sz w:val="40"/>
+          <w:szCs w:val="40"/>
+        </w:rPr>
+        <w:t xml:space="preserve"> ✦</w:t>
       </w:r>
     </w:p>
     <w:p>
@@ -40,7 +56,8 @@
     </w:p>
     <w:p>
       <w:pPr>
-        <w:spacing w:after="500"/>
+        <w:shd w:fill="EDE3F2" w:val="clear"/>
+        <w:spacing w:after="120" w:before="120"/>
         <w:jc w:val="center"/>
       </w:pPr>
       <w:r>
@@ -48,7 +65,7 @@
           <w:rFonts w:ascii="Arial" w:cs="Arial" w:eastAsia="Arial" w:hAnsi="Arial"/>
           <w:i/>
           <w:iCs/>
-          <w:color w:val="A6803C"/>
+          <w:color w:val="AD4B6E"/>
           <w:sz w:val="30"/>
           <w:szCs w:val="30"/>
         </w:rPr>
@@ -60,7 +77,7 @@
         <w:pBdr>
           <w:top w:val="single" w:color="D9C48F" w:sz="4" w:space="12"/>
         </w:pBdr>
-        <w:spacing w:after="500"/>
+        <w:spacing w:after="500" w:before="380"/>
         <w:jc w:val="center"/>
       </w:pPr>
     </w:p>
@@ -87,7 +104,7 @@
       <w:r>
         <w:rPr>
           <w:rFonts w:ascii="Arial" w:cs="Arial" w:eastAsia="Arial" w:hAnsi="Arial"/>
-          <w:color w:val="2B2620"/>
+          <w:color w:val="AD4B6E"/>
           <w:sz w:val="24"/>
           <w:szCs w:val="24"/>
         </w:rPr>
@@ -101,11 +118,65 @@
       <w:r>
         <w:rPr>
           <w:rFonts w:ascii="Arial" w:cs="Arial" w:eastAsia="Arial" w:hAnsi="Arial"/>
-          <w:color w:val="8A8377"/>
+          <w:color w:val="5B2333"/>
           <w:sz w:val="18"/>
           <w:szCs w:val="18"/>
         </w:rPr>
-        <w:t xml:space="preserve">Astrologie · Chinesisches Sternzeichen · Numerologie · Human Design</w:t>
+        <w:t xml:space="preserve">Astrologie </w:t>
+      </w:r>
+      <w:r>
+        <w:rPr>
+          <w:rFonts w:ascii="Arial" w:cs="Arial" w:eastAsia="Arial" w:hAnsi="Arial"/>
+          <w:color w:val="D9C48F"/>
+          <w:sz w:val="18"/>
+          <w:szCs w:val="18"/>
+        </w:rPr>
+        <w:t xml:space="preserve">· </w:t>
+      </w:r>
+      <w:r>
+        <w:rPr>
+          <w:rFonts w:ascii="Arial" w:cs="Arial" w:eastAsia="Arial" w:hAnsi="Arial"/>
+          <w:color w:val="8C6A1F"/>
+          <w:sz w:val="18"/>
+          <w:szCs w:val="18"/>
+        </w:rPr>
+        <w:t xml:space="preserve">Chinesisches Sternzeichen </w:t>
+      </w:r>
+      <w:r>
+        <w:rPr>
+          <w:rFonts w:ascii="Arial" w:cs="Arial" w:eastAsia="Arial" w:hAnsi="Arial"/>
+          <w:color w:val="D9C48F"/>
+          <w:sz w:val="18"/>
+          <w:szCs w:val="18"/>
+        </w:rPr>
+        <w:t xml:space="preserve">· </w:t>
+      </w:r>
+      <w:r>
+        <w:rPr>
+          <w:rFonts w:ascii="Arial" w:cs="Arial" w:eastAsia="Arial" w:hAnsi="Arial"/>
+          <w:color w:val="8C6A1F"/>
+          <w:sz w:val="18"/>
+          <w:szCs w:val="18"/>
+        </w:rPr>
+        <w:t xml:space="preserve">Numerologie </w:t>
+      </w:r>
+      <w:r>
+        <w:rPr>
+          <w:rFonts w:ascii="Arial" w:cs="Arial" w:eastAsia="Arial" w:hAnsi="Arial"/>
+          <w:color w:val="D9C48F"/>
+          <w:sz w:val="18"/>
+          <w:szCs w:val="18"/>
+        </w:rPr>
+        <w:t xml:space="preserve">· </w:t>
+      </w:r>
+      <w:r>
+        <w:rPr>
+          <w:rFonts w:ascii="Arial" w:cs="Arial" w:eastAsia="Arial" w:hAnsi="Arial"/>
+          <w:color w:val="AD4B6E"/>
+          <w:sz w:val="18"/>
+          <w:szCs w:val="18"/>
+        </w:rPr>
+        <w:t xml:space="preserve">Human Design</w:t>
       </w:r>
     </w:p>
     <w:p>
@@ -120,6 +191,17 @@
         </w:pBdr>
         <w:spacing w:after="40" w:before="320"/>
       </w:pPr>
+      <w:r>
+        <w:rPr>
+          <w:rFonts w:ascii="Arial" w:cs="Arial" w:eastAsia="Arial" w:hAnsi="Arial"/>
+          <w:b/>
+          <w:bCs/>
+          <w:color w:val="C97B95"/>
+          <w:sz w:val="30"/>
+          <w:szCs w:val="30"/>
+        </w:rPr>
+        <w:t xml:space="preserve">✦ </w:t>
+      </w:r>
       <w:r>
         <w:rPr>
           <w:rFonts w:ascii="Arial" w:cs="Arial" w:eastAsia="Arial" w:hAnsi="Arial"/>
@@ -189,6 +271,17 @@
         </w:pBdr>
         <w:spacing w:after="40" w:before="320"/>
       </w:pPr>
+      <w:r>
+        <w:rPr>
+          <w:rFonts w:ascii="Arial" w:cs="Arial" w:eastAsia="Arial" w:hAnsi="Arial"/>
+          <w:b/>
+          <w:bCs/>
+          <w:color w:val="C97B95"/>
+          <w:sz w:val="30"/>
+          <w:szCs w:val="30"/>
+        </w:rPr>
+        <w:t xml:space="preserve">✦ </w:t>
+      </w:r>
       <w:r>
         <w:rPr>
           <w:rFonts w:ascii="Arial" w:cs="Arial" w:eastAsia="Arial" w:hAnsi="Arial"/>
@@ -458,7 +551,7 @@
         <w:tc>
           <w:tcPr>
             <w:tcW w:type="dxa" w:w="3200"/>
-            <w:shd w:fill="F6EFE3" w:val="clear"/>
+            <w:shd w:fill="FBE9EC" w:val="clear"/>
             <w:tcMar>
               <w:top w:type="dxa" w:w="100"/>
               <w:left w:type="dxa" w:w="120"/>
@@ -484,7 +577,7 @@
         <w:tc>
           <w:tcPr>
             <w:tcW w:type="dxa" w:w="2200"/>
-            <w:shd w:fill="F6EFE3" w:val="clear"/>
+            <w:shd w:fill="FBE9EC" w:val="clear"/>
             <w:tcMar>
               <w:top w:type="dxa" w:w="100"/>
               <w:left w:type="dxa" w:w="120"/>
@@ -510,7 +603,7 @@
         <w:tc>
           <w:tcPr>
             <w:tcW w:type="dxa" w:w="1600"/>
-            <w:shd w:fill="F6EFE3" w:val="clear"/>
+            <w:shd w:fill="FBE9EC" w:val="clear"/>
             <w:tcMar>
               <w:top w:type="dxa" w:w="100"/>
               <w:left w:type="dxa" w:w="120"/>
@@ -536,7 +629,7 @@
         <w:tc>
           <w:tcPr>
             <w:tcW w:type="dxa" w:w="1600"/>
-            <w:shd w:fill="F6EFE3" w:val="clear"/>
+            <w:shd w:fill="FBE9EC" w:val="clear"/>
             <w:tcMar>
               <w:top w:type="dxa" w:w="100"/>
               <w:left w:type="dxa" w:w="120"/>
@@ -670,7 +763,7 @@
         <w:tc>
           <w:tcPr>
             <w:tcW w:type="dxa" w:w="3200"/>
-            <w:shd w:fill="F6EFE3" w:val="clear"/>
+            <w:shd w:fill="FBE9EC" w:val="clear"/>
             <w:tcMar>
               <w:top w:type="dxa" w:w="100"/>
               <w:left w:type="dxa" w:w="120"/>
@@ -696,7 +789,7 @@
         <w:tc>
           <w:tcPr>
             <w:tcW w:type="dxa" w:w="2200"/>
-            <w:shd w:fill="F6EFE3" w:val="clear"/>
+            <w:shd w:fill="FBE9EC" w:val="clear"/>
             <w:tcMar>
               <w:top w:type="dxa" w:w="100"/>
               <w:left w:type="dxa" w:w="120"/>
@@ -722,7 +815,7 @@
         <w:tc>
           <w:tcPr>
             <w:tcW w:type="dxa" w:w="1600"/>
-            <w:shd w:fill="F6EFE3" w:val="clear"/>
+            <w:shd w:fill="FBE9EC" w:val="clear"/>
             <w:tcMar>
               <w:top w:type="dxa" w:w="100"/>
               <w:left w:type="dxa" w:w="120"/>
@@ -748,7 +841,7 @@
         <w:tc>
           <w:tcPr>
             <w:tcW w:type="dxa" w:w="1600"/>
-            <w:shd w:fill="F6EFE3" w:val="clear"/>
+            <w:shd w:fill="FBE9EC" w:val="clear"/>
             <w:tcMar>
               <w:top w:type="dxa" w:w="100"/>
               <w:left w:type="dxa" w:w="120"/>
@@ -882,7 +975,7 @@
         <w:tc>
           <w:tcPr>
             <w:tcW w:type="dxa" w:w="3200"/>
-            <w:shd w:fill="F6EFE3" w:val="clear"/>
+            <w:shd w:fill="FBE9EC" w:val="clear"/>
             <w:tcMar>
               <w:top w:type="dxa" w:w="100"/>
               <w:left w:type="dxa" w:w="120"/>
@@ -908,7 +1001,7 @@
         <w:tc>
           <w:tcPr>
             <w:tcW w:type="dxa" w:w="2200"/>
-            <w:shd w:fill="F6EFE3" w:val="clear"/>
+            <w:shd w:fill="FBE9EC" w:val="clear"/>
             <w:tcMar>
               <w:top w:type="dxa" w:w="100"/>
               <w:left w:type="dxa" w:w="120"/>
@@ -934,7 +1027,7 @@
         <w:tc>
           <w:tcPr>
             <w:tcW w:type="dxa" w:w="1600"/>
-            <w:shd w:fill="F6EFE3" w:val="clear"/>
+            <w:shd w:fill="FBE9EC" w:val="clear"/>
             <w:tcMar>
               <w:top w:type="dxa" w:w="100"/>
               <w:left w:type="dxa" w:w="120"/>
@@ -960,7 +1053,7 @@
         <w:tc>
           <w:tcPr>
             <w:tcW w:type="dxa" w:w="1600"/>
-            <w:shd w:fill="F6EFE3" w:val="clear"/>
+            <w:shd w:fill="FBE9EC" w:val="clear"/>
             <w:tcMar>
               <w:top w:type="dxa" w:w="100"/>
               <w:left w:type="dxa" w:w="120"/>
@@ -1094,7 +1187,7 @@
         <w:tc>
           <w:tcPr>
             <w:tcW w:type="dxa" w:w="3200"/>
-            <w:shd w:fill="F6EFE3" w:val="clear"/>
+            <w:shd w:fill="FBE9EC" w:val="clear"/>
             <w:tcMar>
               <w:top w:type="dxa" w:w="100"/>
               <w:left w:type="dxa" w:w="120"/>
@@ -1120,7 +1213,7 @@
         <w:tc>
           <w:tcPr>
             <w:tcW w:type="dxa" w:w="2200"/>
-            <w:shd w:fill="F6EFE3" w:val="clear"/>
+            <w:shd w:fill="FBE9EC" w:val="clear"/>
             <w:tcMar>
               <w:top w:type="dxa" w:w="100"/>
               <w:left w:type="dxa" w:w="120"/>
@@ -1146,7 +1239,7 @@
         <w:tc>
           <w:tcPr>
             <w:tcW w:type="dxa" w:w="1600"/>
-            <w:shd w:fill="F6EFE3" w:val="clear"/>
+            <w:shd w:fill="FBE9EC" w:val="clear"/>
             <w:tcMar>
               <w:top w:type="dxa" w:w="100"/>
               <w:left w:type="dxa" w:w="120"/>
@@ -1172,7 +1265,7 @@
         <w:tc>
           <w:tcPr>
             <w:tcW w:type="dxa" w:w="1600"/>
-            <w:shd w:fill="F6EFE3" w:val="clear"/>
+            <w:shd w:fill="FBE9EC" w:val="clear"/>
             <w:tcMar>
               <w:top w:type="dxa" w:w="100"/>
               <w:left w:type="dxa" w:w="120"/>
@@ -1306,7 +1399,7 @@
         <w:tc>
           <w:tcPr>
             <w:tcW w:type="dxa" w:w="3200"/>
-            <w:shd w:fill="F6EFE3" w:val="clear"/>
+            <w:shd w:fill="FBE9EC" w:val="clear"/>
             <w:tcMar>
               <w:top w:type="dxa" w:w="100"/>
               <w:left w:type="dxa" w:w="120"/>
@@ -1332,7 +1425,7 @@
         <w:tc>
           <w:tcPr>
             <w:tcW w:type="dxa" w:w="2200"/>
-            <w:shd w:fill="F6EFE3" w:val="clear"/>
+            <w:shd w:fill="FBE9EC" w:val="clear"/>
             <w:tcMar>
               <w:top w:type="dxa" w:w="100"/>
               <w:left w:type="dxa" w:w="120"/>
@@ -1358,7 +1451,7 @@
         <w:tc>
           <w:tcPr>
             <w:tcW w:type="dxa" w:w="1600"/>
-            <w:shd w:fill="F6EFE3" w:val="clear"/>
+            <w:shd w:fill="FBE9EC" w:val="clear"/>
             <w:tcMar>
               <w:top w:type="dxa" w:w="100"/>
               <w:left w:type="dxa" w:w="120"/>
@@ -1384,7 +1477,7 @@
         <w:tc>
           <w:tcPr>
             <w:tcW w:type="dxa" w:w="1600"/>
-            <w:shd w:fill="F6EFE3" w:val="clear"/>
+            <w:shd w:fill="FBE9EC" w:val="clear"/>
             <w:tcMar>
               <w:top w:type="dxa" w:w="100"/>
               <w:left w:type="dxa" w:w="120"/>
@@ -1518,7 +1611,7 @@
         <w:tc>
           <w:tcPr>
             <w:tcW w:type="dxa" w:w="3200"/>
-            <w:shd w:fill="F6EFE3" w:val="clear"/>
+            <w:shd w:fill="FBE9EC" w:val="clear"/>
             <w:tcMar>
               <w:top w:type="dxa" w:w="100"/>
               <w:left w:type="dxa" w:w="120"/>
@@ -1544,7 +1637,7 @@
         <w:tc>
           <w:tcPr>
             <w:tcW w:type="dxa" w:w="2200"/>
-            <w:shd w:fill="F6EFE3" w:val="clear"/>
+            <w:shd w:fill="FBE9EC" w:val="clear"/>
             <w:tcMar>
               <w:top w:type="dxa" w:w="100"/>
               <w:left w:type="dxa" w:w="120"/>
@@ -1570,7 +1663,7 @@
         <w:tc>
           <w:tcPr>
             <w:tcW w:type="dxa" w:w="1600"/>
-            <w:shd w:fill="F6EFE3" w:val="clear"/>
+            <w:shd w:fill="FBE9EC" w:val="clear"/>
             <w:tcMar>
               <w:top w:type="dxa" w:w="100"/>
               <w:left w:type="dxa" w:w="120"/>
@@ -1596,7 +1689,7 @@
         <w:tc>
           <w:tcPr>
             <w:tcW w:type="dxa" w:w="1600"/>
-            <w:shd w:fill="F6EFE3" w:val="clear"/>
+            <w:shd w:fill="FBE9EC" w:val="clear"/>
             <w:tcMar>
               <w:top w:type="dxa" w:w="100"/>
               <w:left w:type="dxa" w:w="120"/>
@@ -1730,7 +1823,7 @@
         <w:tc>
           <w:tcPr>
             <w:tcW w:type="dxa" w:w="3200"/>
-            <w:shd w:fill="F6EFE3" w:val="clear"/>
+            <w:shd w:fill="FBE9EC" w:val="clear"/>
             <w:tcMar>
               <w:top w:type="dxa" w:w="100"/>
               <w:left w:type="dxa" w:w="120"/>
@@ -1756,7 +1849,7 @@
         <w:tc>
           <w:tcPr>
             <w:tcW w:type="dxa" w:w="2200"/>
-            <w:shd w:fill="F6EFE3" w:val="clear"/>
+            <w:shd w:fill="FBE9EC" w:val="clear"/>
             <w:tcMar>
               <w:top w:type="dxa" w:w="100"/>
               <w:left w:type="dxa" w:w="120"/>
@@ -1782,7 +1875,7 @@
         <w:tc>
           <w:tcPr>
             <w:tcW w:type="dxa" w:w="1600"/>
-            <w:shd w:fill="F6EFE3" w:val="clear"/>
+            <w:shd w:fill="FBE9EC" w:val="clear"/>
             <w:tcMar>
               <w:top w:type="dxa" w:w="100"/>
               <w:left w:type="dxa" w:w="120"/>
@@ -1808,7 +1901,7 @@
         <w:tc>
           <w:tcPr>
             <w:tcW w:type="dxa" w:w="1600"/>
-            <w:shd w:fill="F6EFE3" w:val="clear"/>
+            <w:shd w:fill="FBE9EC" w:val="clear"/>
             <w:tcMar>
               <w:top w:type="dxa" w:w="100"/>
               <w:left w:type="dxa" w:w="120"/>
@@ -1845,6 +1938,17 @@
         </w:pBdr>
         <w:spacing w:after="40" w:before="320"/>
       </w:pPr>
+      <w:r>
+        <w:rPr>
+          <w:rFonts w:ascii="Arial" w:cs="Arial" w:eastAsia="Arial" w:hAnsi="Arial"/>
+          <w:b/>
+          <w:bCs/>
+          <w:color w:val="C97B95"/>
+          <w:sz w:val="30"/>
+          <w:szCs w:val="30"/>
+        </w:rPr>
+        <w:t xml:space="preserve">✦ </w:t>
+      </w:r>
       <w:r>
         <w:rPr>
           <w:rFonts w:ascii="Arial" w:cs="Arial" w:eastAsia="Arial" w:hAnsi="Arial"/>
@@ -1866,7 +1970,7 @@
           <w:rFonts w:ascii="Arial" w:cs="Arial" w:eastAsia="Arial" w:hAnsi="Arial"/>
           <w:i/>
           <w:iCs/>
-          <w:color w:val="A6803C"/>
+          <w:color w:val="AD4B6E"/>
           <w:sz w:val="21"/>
           <w:szCs w:val="21"/>
         </w:rPr>
@@ -1895,6 +1999,17 @@
         </w:pBdr>
         <w:spacing w:after="40" w:before="320"/>
       </w:pPr>
+      <w:r>
+        <w:rPr>
+          <w:rFonts w:ascii="Arial" w:cs="Arial" w:eastAsia="Arial" w:hAnsi="Arial"/>
+          <w:b/>
+          <w:bCs/>
+          <w:color w:val="C97B95"/>
+          <w:sz w:val="30"/>
+          <w:szCs w:val="30"/>
+        </w:rPr>
+        <w:t xml:space="preserve">✦ </w:t>
+      </w:r>
       <w:r>
         <w:rPr>
           <w:rFonts w:ascii="Arial" w:cs="Arial" w:eastAsia="Arial" w:hAnsi="Arial"/>
@@ -1916,7 +2031,7 @@
           <w:rFonts w:ascii="Arial" w:cs="Arial" w:eastAsia="Arial" w:hAnsi="Arial"/>
           <w:i/>
           <w:iCs/>
-          <w:color w:val="A6803C"/>
+          <w:color w:val="AD4B6E"/>
           <w:sz w:val="21"/>
           <w:szCs w:val="21"/>
         </w:rPr>
@@ -1945,6 +2060,17 @@
         </w:pBdr>
         <w:spacing w:after="40" w:before="320"/>
       </w:pPr>
+      <w:r>
+        <w:rPr>
+          <w:rFonts w:ascii="Arial" w:cs="Arial" w:eastAsia="Arial" w:hAnsi="Arial"/>
+          <w:b/>
+          <w:bCs/>
+          <w:color w:val="C97B95"/>
+          <w:sz w:val="30"/>
+          <w:szCs w:val="30"/>
+        </w:rPr>
+        <w:t xml:space="preserve">✦ </w:t>
+      </w:r>
       <w:r>
         <w:rPr>
           <w:rFonts w:ascii="Arial" w:cs="Arial" w:eastAsia="Arial" w:hAnsi="Arial"/>
@@ -1966,7 +2092,7 @@
           <w:rFonts w:ascii="Arial" w:cs="Arial" w:eastAsia="Arial" w:hAnsi="Arial"/>
           <w:i/>
           <w:iCs/>
-          <w:color w:val="A6803C"/>
+          <w:color w:val="AD4B6E"/>
           <w:sz w:val="21"/>
           <w:szCs w:val="21"/>
         </w:rPr>
@@ -1995,6 +2121,17 @@
         </w:pBdr>
         <w:spacing w:after="40" w:before="320"/>
       </w:pPr>
+      <w:r>
+        <w:rPr>
+          <w:rFonts w:ascii="Arial" w:cs="Arial" w:eastAsia="Arial" w:hAnsi="Arial"/>
+          <w:b/>
+          <w:bCs/>
+          <w:color w:val="C97B95"/>
+          <w:sz w:val="30"/>
+          <w:szCs w:val="30"/>
+        </w:rPr>
+        <w:t xml:space="preserve">✦ </w:t>
+      </w:r>
       <w:r>
         <w:rPr>
           <w:rFonts w:ascii="Arial" w:cs="Arial" w:eastAsia="Arial" w:hAnsi="Arial"/>
@@ -2016,7 +2153,7 @@
           <w:rFonts w:ascii="Arial" w:cs="Arial" w:eastAsia="Arial" w:hAnsi="Arial"/>
           <w:i/>
           <w:iCs/>
-          <w:color w:val="A6803C"/>
+          <w:color w:val="AD4B6E"/>
           <w:sz w:val="21"/>
           <w:szCs w:val="21"/>
         </w:rPr>
@@ -2060,6 +2197,17 @@
         </w:pBdr>
         <w:spacing w:after="40" w:before="320"/>
       </w:pPr>
+      <w:r>
+        <w:rPr>
+          <w:rFonts w:ascii="Arial" w:cs="Arial" w:eastAsia="Arial" w:hAnsi="Arial"/>
+          <w:b/>
+          <w:bCs/>
+          <w:color w:val="C97B95"/>
+          <w:sz w:val="30"/>
+          <w:szCs w:val="30"/>
+        </w:rPr>
+        <w:t xml:space="preserve">✦ </w:t>
+      </w:r>
       <w:r>
         <w:rPr>
           <w:rFonts w:ascii="Arial" w:cs="Arial" w:eastAsia="Arial" w:hAnsi="Arial"/>
@@ -2081,7 +2229,7 @@
           <w:rFonts w:ascii="Arial" w:cs="Arial" w:eastAsia="Arial" w:hAnsi="Arial"/>
           <w:i/>
           <w:iCs/>
-          <w:color w:val="A6803C"/>
+          <w:color w:val="AD4B6E"/>
           <w:sz w:val="21"/>
           <w:szCs w:val="21"/>
         </w:rPr>
@@ -2110,6 +2258,17 @@
         </w:pBdr>
         <w:spacing w:after="40" w:before="320"/>
       </w:pPr>
+      <w:r>
+        <w:rPr>
+          <w:rFonts w:ascii="Arial" w:cs="Arial" w:eastAsia="Arial" w:hAnsi="Arial"/>
+          <w:b/>
+          <w:bCs/>
+          <w:color w:val="C97B95"/>
+          <w:sz w:val="30"/>
+          <w:szCs w:val="30"/>
+        </w:rPr>
+        <w:t xml:space="preserve">✦ </w:t>
+      </w:r>
       <w:r>
         <w:rPr>
           <w:rFonts w:ascii="Arial" w:cs="Arial" w:eastAsia="Arial" w:hAnsi="Arial"/>
@@ -2131,7 +2290,7 @@
           <w:rFonts w:ascii="Arial" w:cs="Arial" w:eastAsia="Arial" w:hAnsi="Arial"/>
           <w:i/>
           <w:iCs/>
-          <w:color w:val="A6803C"/>
+          <w:color w:val="AD4B6E"/>
           <w:sz w:val="21"/>
           <w:szCs w:val="21"/>
         </w:rPr>
@@ -2165,6 +2324,310 @@
         </w:pBdr>
         <w:spacing w:after="40" w:before="320"/>
       </w:pPr>
+      <w:r>
+        <w:rPr>
+          <w:rFonts w:ascii="Arial" w:cs="Arial" w:eastAsia="Arial" w:hAnsi="Arial"/>
+          <w:b/>
+          <w:bCs/>
+          <w:color w:val="C97B95"/>
+          <w:sz w:val="30"/>
+          <w:szCs w:val="30"/>
+        </w:rPr>
+        <w:t xml:space="preserve">✦ </w:t>
+      </w:r>
+      <w:r>
+        <w:rPr>
+          <w:rFonts w:ascii="Arial" w:cs="Arial" w:eastAsia="Arial" w:hAnsi="Arial"/>
+          <w:b/>
+          <w:bCs/>
+          <w:color w:val="8C6A1F"/>
+          <w:sz w:val="30"/>
+          <w:szCs w:val="30"/>
+        </w:rPr>
+        <w:t xml:space="preserve">Chinesisches Sternzeichen — Metall-Büffel</w:t>
+      </w:r>
+    </w:p>
+    <w:p>
+      <w:pPr>
+        <w:spacing w:after="160" w:before="60"/>
+      </w:pPr>
+      <w:r>
+        <w:rPr>
+          <w:rFonts w:ascii="Arial" w:cs="Arial" w:eastAsia="Arial" w:hAnsi="Arial"/>
+          <w:i/>
+          <w:iCs/>
+          <w:color w:val="A6803C"/>
+          <w:sz w:val="21"/>
+          <w:szCs w:val="21"/>
+        </w:rPr>
+        <w:t xml:space="preserve">Ausdauer, Ehrlichkeit, stille Stärke</w:t>
+      </w:r>
+    </w:p>
+    <w:p>
+      <w:pPr>
+        <w:spacing w:after="200" w:line="320"/>
+        <w:jc w:val="both"/>
+      </w:pPr>
+      <w:r>
+        <w:rPr>
+          <w:rFonts w:ascii="Arial" w:cs="Arial" w:eastAsia="Arial" w:hAnsi="Arial"/>
+          <w:color w:val="2B2620"/>
+          <w:sz w:val="22"/>
+          <w:szCs w:val="22"/>
+        </w:rPr>
+        <w:t xml:space="preserve">Nach dem chinesischen Kalender bist du im Jahr des Büffels geboren, genauer: des Metall-Büffels (辛丑, 'Xin Chou') – da du nach dem chinesischen Neujahr 1961 (15. Februar) zur Welt kamst.</w:t>
+      </w:r>
+    </w:p>
+    <w:p>
+      <w:pPr>
+        <w:spacing w:after="200" w:line="320"/>
+        <w:jc w:val="both"/>
+      </w:pPr>
+      <w:r>
+        <w:rPr>
+          <w:rFonts w:ascii="Arial" w:cs="Arial" w:eastAsia="Arial" w:hAnsi="Arial"/>
+          <w:color w:val="2B2620"/>
+          <w:sz w:val="22"/>
+          <w:szCs w:val="22"/>
+        </w:rPr>
+        <w:t xml:space="preserve">Der Büffel gilt als Zeichen der Ausdauer, Ehrlichkeit und stillen Stärke. Büffel-Menschen werden traditionell als fleißig, verlässlich, bodenständig und loyal beschrieben – sie reden nicht viel, wenn sie handeln können, und man kann sich auf ihr Wort verlassen. Die Komponente Metall verstärkt Entschlossenheit, einen klaren eigenen Willen und einen ausgeprägten Sinn für Werte und Prinzipien: Ein Metall-Büffel weiß, wofür er steht, und weicht davon nicht leicht ab.</w:t>
+      </w:r>
+    </w:p>
+    <w:p>
+      <w:pPr>
+        <w:spacing w:after="200" w:line="320"/>
+        <w:jc w:val="both"/>
+      </w:pPr>
+      <w:r>
+        <w:rPr>
+          <w:rFonts w:ascii="Arial" w:cs="Arial" w:eastAsia="Arial" w:hAnsi="Arial"/>
+          <w:color w:val="2B2620"/>
+          <w:sz w:val="22"/>
+          <w:szCs w:val="22"/>
+        </w:rPr>
+        <w:t xml:space="preserve">Das passt bemerkenswert gut zur westlich-astrologischen Steinbock-Konjunktion aus Jupiter und Saturn: Beständigkeit ist, aus zwei unabhängigen Systemen gelesen, eine deiner tiefsten Qualitäten.</w:t>
+      </w:r>
+    </w:p>
+    <w:p>
+      <w:pPr>
+        <w:pBdr>
+          <w:bottom w:val="single" w:color="A6803C" w:sz="6" w:space="6"/>
+        </w:pBdr>
+        <w:spacing w:after="40" w:before="320"/>
+      </w:pPr>
+      <w:r>
+        <w:rPr>
+          <w:rFonts w:ascii="Arial" w:cs="Arial" w:eastAsia="Arial" w:hAnsi="Arial"/>
+          <w:b/>
+          <w:bCs/>
+          <w:color w:val="C97B95"/>
+          <w:sz w:val="30"/>
+          <w:szCs w:val="30"/>
+        </w:rPr>
+        <w:t xml:space="preserve">✦ </w:t>
+      </w:r>
+      <w:r>
+        <w:rPr>
+          <w:rFonts w:ascii="Arial" w:cs="Arial" w:eastAsia="Arial" w:hAnsi="Arial"/>
+          <w:b/>
+          <w:bCs/>
+          <w:color w:val="8C6A1F"/>
+          <w:sz w:val="30"/>
+          <w:szCs w:val="30"/>
+        </w:rPr>
+        <w:t xml:space="preserve">Numerologie — Lebenszahl 1</w:t>
+      </w:r>
+    </w:p>
+    <w:p>
+      <w:pPr>
+        <w:spacing w:after="160" w:before="60"/>
+      </w:pPr>
+      <w:r>
+        <w:rPr>
+          <w:rFonts w:ascii="Arial" w:cs="Arial" w:eastAsia="Arial" w:hAnsi="Arial"/>
+          <w:i/>
+          <w:iCs/>
+          <w:color w:val="A6803C"/>
+          <w:sz w:val="21"/>
+          <w:szCs w:val="21"/>
+        </w:rPr>
+        <w:t xml:space="preserve">1 + 10 + 1961 → 1 + 9 = 10 → 1</w:t>
+      </w:r>
+    </w:p>
+    <w:p>
+      <w:pPr>
+        <w:spacing w:after="200" w:line="320"/>
+        <w:jc w:val="both"/>
+      </w:pPr>
+      <w:r>
+        <w:rPr>
+          <w:rFonts w:ascii="Arial" w:cs="Arial" w:eastAsia="Arial" w:hAnsi="Arial"/>
+          <w:color w:val="2B2620"/>
+          <w:sz w:val="22"/>
+          <w:szCs w:val="22"/>
+        </w:rPr>
+        <w:t xml:space="preserve">Aus deinem Geburtsdatum (1.10.1961) ergibt sich in der Numerologie die Lebenszahl 1 (0+1+1+0+1+9+6+1 = 19 → 1+9 = 10 → 1+0 = 1).</w:t>
+      </w:r>
+    </w:p>
+    <w:p>
+      <w:pPr>
+        <w:spacing w:after="200" w:line="320"/>
+        <w:jc w:val="both"/>
+      </w:pPr>
+      <w:r>
+        <w:rPr>
+          <w:rFonts w:ascii="Arial" w:cs="Arial" w:eastAsia="Arial" w:hAnsi="Arial"/>
+          <w:color w:val="2B2620"/>
+          <w:sz w:val="22"/>
+          <w:szCs w:val="22"/>
+        </w:rPr>
+        <w:t xml:space="preserve">Die 1 steht für Anfang, Eigenständigkeit und Führung. Menschen mit dieser Zahl haben oft die Aufgabe, eigene Wege zu gehen statt vorgezeichneten Pfaden zu folgen – auch wenn das, wie bei dir, mit einem starken Bedürfnis nach Miteinander (Waage) kombiniert sein kann. Die 1 ist die Zahl der Pionierin: Sie beginnt gern etwas Neues und lässt sich davon nicht leicht abbringen.</w:t>
+      </w:r>
+    </w:p>
+    <w:p>
+      <w:r>
+        <w:br w:type="page"/>
+      </w:r>
+    </w:p>
+    <w:p>
+      <w:pPr>
+        <w:pBdr>
+          <w:bottom w:val="single" w:color="C97B95" w:sz="6" w:space="6"/>
+        </w:pBdr>
+        <w:spacing w:after="40" w:before="320"/>
+      </w:pPr>
+      <w:r>
+        <w:rPr>
+          <w:rFonts w:ascii="Arial" w:cs="Arial" w:eastAsia="Arial" w:hAnsi="Arial"/>
+          <w:b/>
+          <w:bCs/>
+          <w:color w:val="C97B95"/>
+          <w:sz w:val="30"/>
+          <w:szCs w:val="30"/>
+        </w:rPr>
+        <w:t xml:space="preserve">✦ </w:t>
+      </w:r>
+      <w:r>
+        <w:rPr>
+          <w:rFonts w:ascii="Arial" w:cs="Arial" w:eastAsia="Arial" w:hAnsi="Arial"/>
+          <w:b/>
+          <w:bCs/>
+          <w:color w:val="AD4B6E"/>
+          <w:sz w:val="30"/>
+          <w:szCs w:val="30"/>
+        </w:rPr>
+        <w:t xml:space="preserve">Human Design</w:t>
+      </w:r>
+    </w:p>
+    <w:p>
+      <w:pPr>
+        <w:spacing w:after="160" w:before="60"/>
+      </w:pPr>
+      <w:r>
+        <w:rPr>
+          <w:rFonts w:ascii="Arial" w:cs="Arial" w:eastAsia="Arial" w:hAnsi="Arial"/>
+          <w:i/>
+          <w:iCs/>
+          <w:color w:val="AD4B6E"/>
+          <w:sz w:val="21"/>
+          <w:szCs w:val="21"/>
+        </w:rPr>
+        <w:t xml:space="preserve">Eine vertiefte Einführung — und eine ehrliche Einschränkung</w:t>
+      </w:r>
+    </w:p>
+    <w:p>
+      <w:pPr>
+        <w:spacing w:after="200" w:line="320"/>
+        <w:jc w:val="both"/>
+      </w:pPr>
+      <w:r>
+        <w:rPr>
+          <w:rFonts w:ascii="Arial" w:cs="Arial" w:eastAsia="Arial" w:hAnsi="Arial"/>
+          <w:color w:val="2B2620"/>
+          <w:sz w:val="22"/>
+          <w:szCs w:val="22"/>
+        </w:rPr>
+        <w:t xml:space="preserve">Human Design ist ein jüngeres System, in den 1990er-Jahren von Ra Uru Hu entwickelt, das westliche Astrologie, das chinesische I Ging, die Kabbala und die Chakren-Lehre miteinander verbindet. Aus dem exakten Geburtszeitpunkt und einem zweiten Zeitpunkt, der rechnerisch rund 88 Tage davor liegt (dem sogenannten 'Design'-Datum), werden 64 'Tore' aktiviert. Daraus ergeben sich ein Energietyp, eine innere Autorität für Entscheidungen und ein sogenanntes Profil – gemeinsam bilden sie den 'Bodygraph', die Landkarte der eigenen Energie.</w:t>
+      </w:r>
+    </w:p>
+    <w:p>
+      <w:pPr>
+        <w:spacing w:after="200" w:line="320"/>
+        <w:jc w:val="both"/>
+      </w:pPr>
+      <w:r>
+        <w:rPr>
+          <w:rFonts w:ascii="Arial" w:cs="Arial" w:eastAsia="Arial" w:hAnsi="Arial"/>
+          <w:color w:val="2B2620"/>
+          <w:sz w:val="22"/>
+          <w:szCs w:val="22"/>
+        </w:rPr>
+        <w:t xml:space="preserve">Die fünf Energietypen: Generatoren (rund 37 % aller Menschen) und Manifestierende Generatoren (rund 33 %) tragen eine beständige, sakrale Lebenskraft in sich; ihre Strategie ist, auf etwas zu reagieren, statt selbst zu initiieren – ihr 'Ja' oder 'Nein' entsteht als spontane Körperreaktion, nicht im Kopf. Projektoren (rund 20 %) sind für ihre Umgebung erkennende, führende Energie da; ihre Strategie ist, auf echte Einladung zu warten, statt sich von sich aus zu beweisen. Manifestoren (rund 9 %) haben die Kraft, aus sich selbst heraus etwas in Bewegung zu setzen; ihre Strategie ist, andere zu informieren, bevor sie handeln. Reflektoren (unter 1 %) schließlich sind ganz offen für ihre Umgebung und spiegeln sie – ihre Strategie ist, bei großen Entscheidungen einen vollen Mondzyklus, also bis zu 28 Tage, verstreichen zu lassen.</w:t>
+      </w:r>
+    </w:p>
+    <w:p>
+      <w:pPr>
+        <w:spacing w:after="200" w:line="320"/>
+        <w:jc w:val="both"/>
+      </w:pPr>
+      <w:r>
+        <w:rPr>
+          <w:rFonts w:ascii="Arial" w:cs="Arial" w:eastAsia="Arial" w:hAnsi="Arial"/>
+          <w:color w:val="2B2620"/>
+          <w:sz w:val="22"/>
+          <w:szCs w:val="22"/>
+        </w:rPr>
+        <w:t xml:space="preserve">Die innere Autorität beschreibt, wo im Körper – nicht im Kopf – eine stimmige Entscheidung eigentlich getroffen wird: emotional (über Wellen aus Hoch und Tief, die erst mit etwas Abstand Klarheit bringen), sakral, über die Milz (leise, spontane, aber flüchtige Intuition), über den Solarplexus, das Ego oder – seltener – rein durch lautes Aussprechen im Gespräch mit anderen. Jede Autorität braucht ihren eigenen Rhythmus, um zu einer echten Antwort zu kommen.</w:t>
+      </w:r>
+    </w:p>
+    <w:p>
+      <w:pPr>
+        <w:spacing w:after="200" w:line="320"/>
+        <w:jc w:val="both"/>
+      </w:pPr>
+      <w:r>
+        <w:rPr>
+          <w:rFonts w:ascii="Arial" w:cs="Arial" w:eastAsia="Arial" w:hAnsi="Arial"/>
+          <w:color w:val="2B2620"/>
+          <w:sz w:val="22"/>
+          <w:szCs w:val="22"/>
+        </w:rPr>
+        <w:t xml:space="preserve">Der zentrale Gedanke von Human Design, unabhängig vom exakten Typ, ist der Unterschied zwischen dem 'Selbst' und dem 'Nicht-Selbst': Lebt ein Mensch nach seiner eigenen Strategie und Autorität, fühlt sich das stimmig und erleichtert an. Entscheidet er stattdessen aus Angst, aus Anpassungsdruck oder aus dem Kopf heraus – etwa, weil ein 'Nein' unhöflich erschiene, weil man etwas nicht verpassen will, oder weil man es allen recht machen möchte – entstehen typische 'Nicht-Selbst'-Gefühle: bei reagierenden Typen Frustration, bei Projektoren Verbitterung, bei Manifestoren Wut, bei Reflektoren Enttäuschung. Genau diese Entscheidungen unter Druck sind es, die in der Human-Design-Lehre besonders häufig zu Bindungen führen, die sich im Nachhinein falsch anfühlen – nicht, weil ein Mensch etwas 'anzieht', sondern weil eine Entscheidung nicht aus der eigenen, verkörperten Autorität heraus getroffen wurde, sondern aus Kopf oder Angst.</w:t>
+      </w:r>
+    </w:p>
+    <w:p>
+      <w:pPr>
+        <w:spacing w:after="200" w:line="320"/>
+        <w:jc w:val="both"/>
+      </w:pPr>
+      <w:r>
+        <w:rPr>
+          <w:rFonts w:ascii="Arial" w:cs="Arial" w:eastAsia="Arial" w:hAnsi="Arial"/>
+          <w:color w:val="2B2620"/>
+          <w:sz w:val="22"/>
+          <w:szCs w:val="22"/>
+        </w:rPr>
+        <w:t xml:space="preserve">Eine auf die einzelnen Tore genaue Auswertung braucht eine hexagramm-genaue Gradkarte der 64 Tore und eine professionelle Ephemeride. Für dieses Portrait wurde genau das eingesetzt: die Swiss Ephemeris – dieselbe Rechengrundlage, auf der auch kommerzielle Astrologie- und Human-Design-Software aufbaut – zusammen mit einer offen einsehbaren, an zwei unabhängigen Quellen gegengeprüften Tore-Gradkarte. Das folgende Chart ist damit kein grober Anhaltspunkt, sondern eine belastbare Berechnung.</w:t>
+      </w:r>
+    </w:p>
+    <w:p>
+      <w:pPr>
+        <w:pBdr>
+          <w:bottom w:val="single" w:color="A6803C" w:sz="6" w:space="6"/>
+        </w:pBdr>
+        <w:spacing w:after="40" w:before="320"/>
+      </w:pPr>
+      <w:r>
+        <w:rPr>
+          <w:rFonts w:ascii="Arial" w:cs="Arial" w:eastAsia="Arial" w:hAnsi="Arial"/>
+          <w:b/>
+          <w:bCs/>
+          <w:color w:val="C97B95"/>
+          <w:sz w:val="30"/>
+          <w:szCs w:val="30"/>
+        </w:rPr>
+        <w:t xml:space="preserve">✦ </w:t>
+      </w:r>
       <w:r>
         <w:rPr>
           <w:rFonts w:ascii="Arial" w:cs="Arial" w:eastAsia="Arial" w:hAnsi="Arial"/>
@@ -2174,7 +2637,7 @@
           <w:sz w:val="30"/>
           <w:szCs w:val="30"/>
         </w:rPr>
-        <w:t xml:space="preserve">Chinesisches Sternzeichen — Metall-Büffel</w:t>
+        <w:t xml:space="preserve">Claudia Schelberts Human-Design-Chart</w:t>
       </w:r>
     </w:p>
     <w:p>
@@ -2186,267 +2649,7 @@
           <w:rFonts w:ascii="Arial" w:cs="Arial" w:eastAsia="Arial" w:hAnsi="Arial"/>
           <w:i/>
           <w:iCs/>
-          <w:color w:val="A6803C"/>
-          <w:sz w:val="21"/>
-          <w:szCs w:val="21"/>
-        </w:rPr>
-        <w:t xml:space="preserve">Ausdauer, Ehrlichkeit, stille Stärke</w:t>
-      </w:r>
-    </w:p>
-    <w:p>
-      <w:pPr>
-        <w:spacing w:after="200" w:line="320"/>
-        <w:jc w:val="both"/>
-      </w:pPr>
-      <w:r>
-        <w:rPr>
-          <w:rFonts w:ascii="Arial" w:cs="Arial" w:eastAsia="Arial" w:hAnsi="Arial"/>
-          <w:color w:val="2B2620"/>
-          <w:sz w:val="22"/>
-          <w:szCs w:val="22"/>
-        </w:rPr>
-        <w:t xml:space="preserve">Nach dem chinesischen Kalender bist du im Jahr des Büffels geboren, genauer: des Metall-Büffels (辛丑, 'Xin Chou') – da du nach dem chinesischen Neujahr 1961 (15. Februar) zur Welt kamst.</w:t>
-      </w:r>
-    </w:p>
-    <w:p>
-      <w:pPr>
-        <w:spacing w:after="200" w:line="320"/>
-        <w:jc w:val="both"/>
-      </w:pPr>
-      <w:r>
-        <w:rPr>
-          <w:rFonts w:ascii="Arial" w:cs="Arial" w:eastAsia="Arial" w:hAnsi="Arial"/>
-          <w:color w:val="2B2620"/>
-          <w:sz w:val="22"/>
-          <w:szCs w:val="22"/>
-        </w:rPr>
-        <w:t xml:space="preserve">Der Büffel gilt als Zeichen der Ausdauer, Ehrlichkeit und stillen Stärke. Büffel-Menschen werden traditionell als fleißig, verlässlich, bodenständig und loyal beschrieben – sie reden nicht viel, wenn sie handeln können, und man kann sich auf ihr Wort verlassen. Die Komponente Metall verstärkt Entschlossenheit, einen klaren eigenen Willen und einen ausgeprägten Sinn für Werte und Prinzipien: Ein Metall-Büffel weiß, wofür er steht, und weicht davon nicht leicht ab.</w:t>
-      </w:r>
-    </w:p>
-    <w:p>
-      <w:pPr>
-        <w:spacing w:after="200" w:line="320"/>
-        <w:jc w:val="both"/>
-      </w:pPr>
-      <w:r>
-        <w:rPr>
-          <w:rFonts w:ascii="Arial" w:cs="Arial" w:eastAsia="Arial" w:hAnsi="Arial"/>
-          <w:color w:val="2B2620"/>
-          <w:sz w:val="22"/>
-          <w:szCs w:val="22"/>
-        </w:rPr>
-        <w:t xml:space="preserve">Das passt bemerkenswert gut zur westlich-astrologischen Steinbock-Konjunktion aus Jupiter und Saturn: Beständigkeit ist, aus zwei unabhängigen Systemen gelesen, eine deiner tiefsten Qualitäten.</w:t>
-      </w:r>
-    </w:p>
-    <w:p>
-      <w:pPr>
-        <w:pBdr>
-          <w:bottom w:val="single" w:color="A6803C" w:sz="6" w:space="6"/>
-        </w:pBdr>
-        <w:spacing w:after="40" w:before="320"/>
-      </w:pPr>
-      <w:r>
-        <w:rPr>
-          <w:rFonts w:ascii="Arial" w:cs="Arial" w:eastAsia="Arial" w:hAnsi="Arial"/>
-          <w:b/>
-          <w:bCs/>
-          <w:color w:val="5B2333"/>
-          <w:sz w:val="30"/>
-          <w:szCs w:val="30"/>
-        </w:rPr>
-        <w:t xml:space="preserve">Numerologie — Lebenszahl 1</w:t>
-      </w:r>
-    </w:p>
-    <w:p>
-      <w:pPr>
-        <w:spacing w:after="160" w:before="60"/>
-      </w:pPr>
-      <w:r>
-        <w:rPr>
-          <w:rFonts w:ascii="Arial" w:cs="Arial" w:eastAsia="Arial" w:hAnsi="Arial"/>
-          <w:i/>
-          <w:iCs/>
-          <w:color w:val="A6803C"/>
-          <w:sz w:val="21"/>
-          <w:szCs w:val="21"/>
-        </w:rPr>
-        <w:t xml:space="preserve">1 + 10 + 1961 → 1 + 9 = 10 → 1</w:t>
-      </w:r>
-    </w:p>
-    <w:p>
-      <w:pPr>
-        <w:spacing w:after="200" w:line="320"/>
-        <w:jc w:val="both"/>
-      </w:pPr>
-      <w:r>
-        <w:rPr>
-          <w:rFonts w:ascii="Arial" w:cs="Arial" w:eastAsia="Arial" w:hAnsi="Arial"/>
-          <w:color w:val="2B2620"/>
-          <w:sz w:val="22"/>
-          <w:szCs w:val="22"/>
-        </w:rPr>
-        <w:t xml:space="preserve">Aus deinem Geburtsdatum (1.10.1961) ergibt sich in der Numerologie die Lebenszahl 1 (0+1+1+0+1+9+6+1 = 19 → 1+9 = 10 → 1+0 = 1).</w:t>
-      </w:r>
-    </w:p>
-    <w:p>
-      <w:pPr>
-        <w:spacing w:after="200" w:line="320"/>
-        <w:jc w:val="both"/>
-      </w:pPr>
-      <w:r>
-        <w:rPr>
-          <w:rFonts w:ascii="Arial" w:cs="Arial" w:eastAsia="Arial" w:hAnsi="Arial"/>
-          <w:color w:val="2B2620"/>
-          <w:sz w:val="22"/>
-          <w:szCs w:val="22"/>
-        </w:rPr>
-        <w:t xml:space="preserve">Die 1 steht für Anfang, Eigenständigkeit und Führung. Menschen mit dieser Zahl haben oft die Aufgabe, eigene Wege zu gehen statt vorgezeichneten Pfaden zu folgen – auch wenn das, wie bei dir, mit einem starken Bedürfnis nach Miteinander (Waage) kombiniert sein kann. Die 1 ist die Zahl der Pionierin: Sie beginnt gern etwas Neues und lässt sich davon nicht leicht abbringen.</w:t>
-      </w:r>
-    </w:p>
-    <w:p>
-      <w:r>
-        <w:br w:type="page"/>
-      </w:r>
-    </w:p>
-    <w:p>
-      <w:pPr>
-        <w:pBdr>
-          <w:bottom w:val="single" w:color="A6803C" w:sz="6" w:space="6"/>
-        </w:pBdr>
-        <w:spacing w:after="40" w:before="320"/>
-      </w:pPr>
-      <w:r>
-        <w:rPr>
-          <w:rFonts w:ascii="Arial" w:cs="Arial" w:eastAsia="Arial" w:hAnsi="Arial"/>
-          <w:b/>
-          <w:bCs/>
-          <w:color w:val="5B2333"/>
-          <w:sz w:val="30"/>
-          <w:szCs w:val="30"/>
-        </w:rPr>
-        <w:t xml:space="preserve">Human Design</w:t>
-      </w:r>
-    </w:p>
-    <w:p>
-      <w:pPr>
-        <w:spacing w:after="160" w:before="60"/>
-      </w:pPr>
-      <w:r>
-        <w:rPr>
-          <w:rFonts w:ascii="Arial" w:cs="Arial" w:eastAsia="Arial" w:hAnsi="Arial"/>
-          <w:i/>
-          <w:iCs/>
-          <w:color w:val="A6803C"/>
-          <w:sz w:val="21"/>
-          <w:szCs w:val="21"/>
-        </w:rPr>
-        <w:t xml:space="preserve">Eine vertiefte Einführung — und eine ehrliche Einschränkung</w:t>
-      </w:r>
-    </w:p>
-    <w:p>
-      <w:pPr>
-        <w:spacing w:after="200" w:line="320"/>
-        <w:jc w:val="both"/>
-      </w:pPr>
-      <w:r>
-        <w:rPr>
-          <w:rFonts w:ascii="Arial" w:cs="Arial" w:eastAsia="Arial" w:hAnsi="Arial"/>
-          <w:color w:val="2B2620"/>
-          <w:sz w:val="22"/>
-          <w:szCs w:val="22"/>
-        </w:rPr>
-        <w:t xml:space="preserve">Human Design ist ein jüngeres System, in den 1990er-Jahren von Ra Uru Hu entwickelt, das westliche Astrologie, das chinesische I Ging, die Kabbala und die Chakren-Lehre miteinander verbindet. Aus dem exakten Geburtszeitpunkt und einem zweiten Zeitpunkt, der rechnerisch rund 88 Tage davor liegt (dem sogenannten 'Design'-Datum), werden 64 'Tore' aktiviert. Daraus ergeben sich ein Energietyp, eine innere Autorität für Entscheidungen und ein sogenanntes Profil – gemeinsam bilden sie den 'Bodygraph', die Landkarte der eigenen Energie.</w:t>
-      </w:r>
-    </w:p>
-    <w:p>
-      <w:pPr>
-        <w:spacing w:after="200" w:line="320"/>
-        <w:jc w:val="both"/>
-      </w:pPr>
-      <w:r>
-        <w:rPr>
-          <w:rFonts w:ascii="Arial" w:cs="Arial" w:eastAsia="Arial" w:hAnsi="Arial"/>
-          <w:color w:val="2B2620"/>
-          <w:sz w:val="22"/>
-          <w:szCs w:val="22"/>
-        </w:rPr>
-        <w:t xml:space="preserve">Die fünf Energietypen: Generatoren (rund 37 % aller Menschen) und Manifestierende Generatoren (rund 33 %) tragen eine beständige, sakrale Lebenskraft in sich; ihre Strategie ist, auf etwas zu reagieren, statt selbst zu initiieren – ihr 'Ja' oder 'Nein' entsteht als spontane Körperreaktion, nicht im Kopf. Projektoren (rund 20 %) sind für ihre Umgebung erkennende, führende Energie da; ihre Strategie ist, auf echte Einladung zu warten, statt sich von sich aus zu beweisen. Manifestoren (rund 9 %) haben die Kraft, aus sich selbst heraus etwas in Bewegung zu setzen; ihre Strategie ist, andere zu informieren, bevor sie handeln. Reflektoren (unter 1 %) schließlich sind ganz offen für ihre Umgebung und spiegeln sie – ihre Strategie ist, bei großen Entscheidungen einen vollen Mondzyklus, also bis zu 28 Tage, verstreichen zu lassen.</w:t>
-      </w:r>
-    </w:p>
-    <w:p>
-      <w:pPr>
-        <w:spacing w:after="200" w:line="320"/>
-        <w:jc w:val="both"/>
-      </w:pPr>
-      <w:r>
-        <w:rPr>
-          <w:rFonts w:ascii="Arial" w:cs="Arial" w:eastAsia="Arial" w:hAnsi="Arial"/>
-          <w:color w:val="2B2620"/>
-          <w:sz w:val="22"/>
-          <w:szCs w:val="22"/>
-        </w:rPr>
-        <w:t xml:space="preserve">Die innere Autorität beschreibt, wo im Körper – nicht im Kopf – eine stimmige Entscheidung eigentlich getroffen wird: emotional (über Wellen aus Hoch und Tief, die erst mit etwas Abstand Klarheit bringen), sakral, über die Milz (leise, spontane, aber flüchtige Intuition), über den Solarplexus, das Ego oder – seltener – rein durch lautes Aussprechen im Gespräch mit anderen. Jede Autorität braucht ihren eigenen Rhythmus, um zu einer echten Antwort zu kommen.</w:t>
-      </w:r>
-    </w:p>
-    <w:p>
-      <w:pPr>
-        <w:spacing w:after="200" w:line="320"/>
-        <w:jc w:val="both"/>
-      </w:pPr>
-      <w:r>
-        <w:rPr>
-          <w:rFonts w:ascii="Arial" w:cs="Arial" w:eastAsia="Arial" w:hAnsi="Arial"/>
-          <w:color w:val="2B2620"/>
-          <w:sz w:val="22"/>
-          <w:szCs w:val="22"/>
-        </w:rPr>
-        <w:t xml:space="preserve">Der zentrale Gedanke von Human Design, unabhängig vom exakten Typ, ist der Unterschied zwischen dem 'Selbst' und dem 'Nicht-Selbst': Lebt ein Mensch nach seiner eigenen Strategie und Autorität, fühlt sich das stimmig und erleichtert an. Entscheidet er stattdessen aus Angst, aus Anpassungsdruck oder aus dem Kopf heraus – etwa, weil ein 'Nein' unhöflich erschiene, weil man etwas nicht verpassen will, oder weil man es allen recht machen möchte – entstehen typische 'Nicht-Selbst'-Gefühle: bei reagierenden Typen Frustration, bei Projektoren Verbitterung, bei Manifestoren Wut, bei Reflektoren Enttäuschung. Genau diese Entscheidungen unter Druck sind es, die in der Human-Design-Lehre besonders häufig zu Bindungen führen, die sich im Nachhinein falsch anfühlen – nicht, weil ein Mensch etwas 'anzieht', sondern weil eine Entscheidung nicht aus der eigenen, verkörperten Autorität heraus getroffen wurde, sondern aus Kopf oder Angst.</w:t>
-      </w:r>
-    </w:p>
-    <w:p>
-      <w:pPr>
-        <w:spacing w:after="200" w:line="320"/>
-        <w:jc w:val="both"/>
-      </w:pPr>
-      <w:r>
-        <w:rPr>
-          <w:rFonts w:ascii="Arial" w:cs="Arial" w:eastAsia="Arial" w:hAnsi="Arial"/>
-          <w:color w:val="2B2620"/>
-          <w:sz w:val="22"/>
-          <w:szCs w:val="22"/>
-        </w:rPr>
-        <w:t xml:space="preserve">Eine auf die einzelnen Tore genaue Auswertung braucht eine hexagramm-genaue Gradkarte der 64 Tore und eine professionelle Ephemeride. Für dieses Portrait wurde genau das eingesetzt: die Swiss Ephemeris – dieselbe Rechengrundlage, auf der auch kommerzielle Astrologie- und Human-Design-Software aufbaut – zusammen mit einer offen einsehbaren, an zwei unabhängigen Quellen gegengeprüften Tore-Gradkarte. Das folgende Chart ist damit kein grober Anhaltspunkt, sondern eine belastbare Berechnung.</w:t>
-      </w:r>
-    </w:p>
-    <w:p>
-      <w:pPr>
-        <w:pBdr>
-          <w:bottom w:val="single" w:color="A6803C" w:sz="6" w:space="6"/>
-        </w:pBdr>
-        <w:spacing w:after="40" w:before="320"/>
-      </w:pPr>
-      <w:r>
-        <w:rPr>
-          <w:rFonts w:ascii="Arial" w:cs="Arial" w:eastAsia="Arial" w:hAnsi="Arial"/>
-          <w:b/>
-          <w:bCs/>
-          <w:color w:val="5B2333"/>
-          <w:sz w:val="30"/>
-          <w:szCs w:val="30"/>
-        </w:rPr>
-        <w:t xml:space="preserve">Claudia Schelberts Human-Design-Chart</w:t>
-      </w:r>
-    </w:p>
-    <w:p>
-      <w:pPr>
-        <w:spacing w:after="160" w:before="60"/>
-      </w:pPr>
-      <w:r>
-        <w:rPr>
-          <w:rFonts w:ascii="Arial" w:cs="Arial" w:eastAsia="Arial" w:hAnsi="Arial"/>
-          <w:i/>
-          <w:iCs/>
-          <w:color w:val="A6803C"/>
+          <w:color w:val="AD4B6E"/>
           <w:sz w:val="21"/>
           <w:szCs w:val="21"/>
         </w:rPr>
@@ -2476,7 +2679,7 @@
         <w:tc>
           <w:tcPr>
             <w:tcW w:type="dxa" w:w="3200"/>
-            <w:shd w:fill="5B2333" w:val="clear"/>
+            <w:shd w:fill="AD4B6E" w:val="clear"/>
             <w:tcMar>
               <w:top w:type="dxa" w:w="100"/>
               <w:left w:type="dxa" w:w="120"/>
@@ -2502,7 +2705,7 @@
         <w:tc>
           <w:tcPr>
             <w:tcW w:type="dxa" w:w="5400"/>
-            <w:shd w:fill="5B2333" w:val="clear"/>
+            <w:shd w:fill="AD4B6E" w:val="clear"/>
             <w:tcMar>
               <w:top w:type="dxa" w:w="100"/>
               <w:left w:type="dxa" w:w="120"/>
@@ -2584,7 +2787,7 @@
         <w:tc>
           <w:tcPr>
             <w:tcW w:type="dxa" w:w="3200"/>
-            <w:shd w:fill="F6EFE3" w:val="clear"/>
+            <w:shd w:fill="FBE9EC" w:val="clear"/>
             <w:tcMar>
               <w:top w:type="dxa" w:w="100"/>
               <w:left w:type="dxa" w:w="120"/>
@@ -2610,7 +2813,7 @@
         <w:tc>
           <w:tcPr>
             <w:tcW w:type="dxa" w:w="5400"/>
-            <w:shd w:fill="F6EFE3" w:val="clear"/>
+            <w:shd w:fill="FBE9EC" w:val="clear"/>
             <w:tcMar>
               <w:top w:type="dxa" w:w="100"/>
               <w:left w:type="dxa" w:w="120"/>
@@ -2692,7 +2895,7 @@
         <w:tc>
           <w:tcPr>
             <w:tcW w:type="dxa" w:w="3200"/>
-            <w:shd w:fill="F6EFE3" w:val="clear"/>
+            <w:shd w:fill="FBE9EC" w:val="clear"/>
             <w:tcMar>
               <w:top w:type="dxa" w:w="100"/>
               <w:left w:type="dxa" w:w="120"/>
@@ -2718,7 +2921,7 @@
         <w:tc>
           <w:tcPr>
             <w:tcW w:type="dxa" w:w="5400"/>
-            <w:shd w:fill="F6EFE3" w:val="clear"/>
+            <w:shd w:fill="FBE9EC" w:val="clear"/>
             <w:tcMar>
               <w:top w:type="dxa" w:w="100"/>
               <w:left w:type="dxa" w:w="120"/>
@@ -2800,7 +3003,7 @@
         <w:tc>
           <w:tcPr>
             <w:tcW w:type="dxa" w:w="3200"/>
-            <w:shd w:fill="F6EFE3" w:val="clear"/>
+            <w:shd w:fill="FBE9EC" w:val="clear"/>
             <w:tcMar>
               <w:top w:type="dxa" w:w="100"/>
               <w:left w:type="dxa" w:w="120"/>
@@ -2826,7 +3029,7 @@
         <w:tc>
           <w:tcPr>
             <w:tcW w:type="dxa" w:w="5400"/>
-            <w:shd w:fill="F6EFE3" w:val="clear"/>
+            <w:shd w:fill="FBE9EC" w:val="clear"/>
             <w:tcMar>
               <w:top w:type="dxa" w:w="100"/>
               <w:left w:type="dxa" w:w="120"/>
@@ -2855,6 +3058,239 @@
       <w:pPr>
         <w:spacing w:after="300"/>
       </w:pPr>
+    </w:p>
+    <w:p>
+      <w:pPr>
+        <w:pBdr>
+          <w:bottom w:val="single" w:color="C97B95" w:sz="6" w:space="6"/>
+        </w:pBdr>
+        <w:spacing w:after="40" w:before="320"/>
+      </w:pPr>
+      <w:r>
+        <w:rPr>
+          <w:rFonts w:ascii="Arial" w:cs="Arial" w:eastAsia="Arial" w:hAnsi="Arial"/>
+          <w:b/>
+          <w:bCs/>
+          <w:color w:val="C97B95"/>
+          <w:sz w:val="30"/>
+          <w:szCs w:val="30"/>
+        </w:rPr>
+        <w:t xml:space="preserve">✦ </w:t>
+      </w:r>
+      <w:r>
+        <w:rPr>
+          <w:rFonts w:ascii="Arial" w:cs="Arial" w:eastAsia="Arial" w:hAnsi="Arial"/>
+          <w:b/>
+          <w:bCs/>
+          <w:color w:val="AD4B6E"/>
+          <w:sz w:val="30"/>
+          <w:szCs w:val="30"/>
+        </w:rPr>
+        <w:t xml:space="preserve">Typ und Strategie — Projektor</w:t>
+      </w:r>
+    </w:p>
+    <w:p>
+      <w:pPr>
+        <w:spacing w:after="160" w:before="60"/>
+      </w:pPr>
+      <w:r>
+        <w:rPr>
+          <w:rFonts w:ascii="Arial" w:cs="Arial" w:eastAsia="Arial" w:hAnsi="Arial"/>
+          <w:i/>
+          <w:iCs/>
+          <w:color w:val="AD4B6E"/>
+          <w:sz w:val="21"/>
+          <w:szCs w:val="21"/>
+        </w:rPr>
+        <w:t xml:space="preserve">Erkennen und geführt werden, statt sich zu beweisen</w:t>
+      </w:r>
+    </w:p>
+    <w:p>
+      <w:pPr>
+        <w:spacing w:after="200" w:line="320"/>
+        <w:jc w:val="both"/>
+      </w:pPr>
+      <w:r>
+        <w:rPr>
+          <w:rFonts w:ascii="Arial" w:cs="Arial" w:eastAsia="Arial" w:hAnsi="Arial"/>
+          <w:color w:val="2B2620"/>
+          <w:sz w:val="22"/>
+          <w:szCs w:val="22"/>
+        </w:rPr>
+        <w:t xml:space="preserve">Du bist ein Projektor (rund 20 % aller Menschen) – kein Typ, der über beständige, sakrale Energie zum Handeln verfügt, sondern einer, der andere Menschen, Systeme und Energien tief erkennt und lenkt. Die Strategie eines Projektors ist, auf echte Einladung zu warten, statt sich von sich aus zu beweisen oder Energie in etwas zu stecken, das nicht erbeten wurde. Wird diese Strategie übergangen, entsteht das typische Projektor-'Nicht-Selbst'-Gefühl: Verbitterung – das Gefühl, sich für andere aufgerieben zu haben, ohne dass es gesehen oder gewürdigt wurde. Gelingt es dagegen, wirklich zu warten, wird die Anerkennung, die dann kommt, meist tief und treffend erlebt.</w:t>
+      </w:r>
+    </w:p>
+    <w:p>
+      <w:pPr>
+        <w:spacing w:after="200" w:line="320"/>
+        <w:jc w:val="both"/>
+      </w:pPr>
+      <w:r>
+        <w:rPr>
+          <w:rFonts w:ascii="Arial" w:cs="Arial" w:eastAsia="Arial" w:hAnsi="Arial"/>
+          <w:color w:val="2B2620"/>
+          <w:sz w:val="22"/>
+          <w:szCs w:val="22"/>
+        </w:rPr>
+        <w:t xml:space="preserve">Deine Autorität ist emotional – dein Solarplexus ist definiert. Das bedeutet: Eine Entscheidung, die im Moment vollkommen klar erscheint, ist es bei dir nie. Klarheit entsteht erst über eine emotionale Welle aus Hoch und Tief, die Stunden bis Tage dauern kann. Die praktische Konsequenz, gerade bei wichtigen Fragen und in der Liebe: kein 'Ja' und kein 'Nein' auf der Stelle, sondern bewusst 'eine Nacht darüber schlafen' – so oft, bis sich die Antwort unabhängig von der Tageslaune wiederholt.</w:t>
+      </w:r>
+    </w:p>
+    <w:p>
+      <w:pPr>
+        <w:pBdr>
+          <w:bottom w:val="single" w:color="C97B95" w:sz="6" w:space="6"/>
+        </w:pBdr>
+        <w:spacing w:after="40" w:before="320"/>
+      </w:pPr>
+      <w:r>
+        <w:rPr>
+          <w:rFonts w:ascii="Arial" w:cs="Arial" w:eastAsia="Arial" w:hAnsi="Arial"/>
+          <w:b/>
+          <w:bCs/>
+          <w:color w:val="C97B95"/>
+          <w:sz w:val="30"/>
+          <w:szCs w:val="30"/>
+        </w:rPr>
+        <w:t xml:space="preserve">✦ </w:t>
+      </w:r>
+      <w:r>
+        <w:rPr>
+          <w:rFonts w:ascii="Arial" w:cs="Arial" w:eastAsia="Arial" w:hAnsi="Arial"/>
+          <w:b/>
+          <w:bCs/>
+          <w:color w:val="AD4B6E"/>
+          <w:sz w:val="30"/>
+          <w:szCs w:val="30"/>
+        </w:rPr>
+        <w:t xml:space="preserve">Profil 5/1 — Ketzerin und Forscherin</w:t>
+      </w:r>
+    </w:p>
+    <w:p>
+      <w:pPr>
+        <w:spacing w:after="160" w:before="60"/>
+      </w:pPr>
+      <w:r>
+        <w:rPr>
+          <w:rFonts w:ascii="Arial" w:cs="Arial" w:eastAsia="Arial" w:hAnsi="Arial"/>
+          <w:i/>
+          <w:iCs/>
+          <w:color w:val="AD4B6E"/>
+          <w:sz w:val="21"/>
+          <w:szCs w:val="21"/>
+        </w:rPr>
+        <w:t xml:space="preserve">Eine praktische Lösung anbieten, die auf echtem Fundament steht</w:t>
+      </w:r>
+    </w:p>
+    <w:p>
+      <w:pPr>
+        <w:spacing w:after="200" w:line="320"/>
+        <w:jc w:val="both"/>
+      </w:pPr>
+      <w:r>
+        <w:rPr>
+          <w:rFonts w:ascii="Arial" w:cs="Arial" w:eastAsia="Arial" w:hAnsi="Arial"/>
+          <w:color w:val="2B2620"/>
+          <w:sz w:val="22"/>
+          <w:szCs w:val="22"/>
+        </w:rPr>
+        <w:t xml:space="preserve">Die erste Zahl deines Profils (5) beschreibt deine bewusste Rolle: die 'Ketzerin' – jemand, dem andere, oft ungefragt, praktische Lösungen und Führung in Krisen zutrauen. Menschen projizieren auf eine 5er-Linie leicht ihre Erwartungen und Hoffnungen; das bringt große, öffentlichkeitswirksame Wertschätzung, wenn eine Lösung wirklich trägt – aber auch das Risiko unfairer Enttäuschung, wenn die Erwartung nicht mit der Person hinter der Rolle übereinstimmt. Die zweite Zahl (1) beschreibt deine unbewusste, innere Grundlage: die 'Forscherin' – ein Bedürfnis nach solidem Fundament, nach wirklich verstandenem Wissen, bevor du dich sicher genug fühlst, um nach außen zu wirken. Zusammen ergibt das jemanden, deren nach außen sichtbare, oft geforderte praktische Kompetenz aus echter, in die Tiefe gehender eigener Recherche gespeist ist – nicht aus dem Bauch heraus.</w:t>
+      </w:r>
+    </w:p>
+    <w:p>
+      <w:pPr>
+        <w:pBdr>
+          <w:bottom w:val="single" w:color="C97B95" w:sz="6" w:space="6"/>
+        </w:pBdr>
+        <w:spacing w:after="40" w:before="320"/>
+      </w:pPr>
+      <w:r>
+        <w:rPr>
+          <w:rFonts w:ascii="Arial" w:cs="Arial" w:eastAsia="Arial" w:hAnsi="Arial"/>
+          <w:b/>
+          <w:bCs/>
+          <w:color w:val="C97B95"/>
+          <w:sz w:val="30"/>
+          <w:szCs w:val="30"/>
+        </w:rPr>
+        <w:t xml:space="preserve">✦ </w:t>
+      </w:r>
+      <w:r>
+        <w:rPr>
+          <w:rFonts w:ascii="Arial" w:cs="Arial" w:eastAsia="Arial" w:hAnsi="Arial"/>
+          <w:b/>
+          <w:bCs/>
+          <w:color w:val="AD4B6E"/>
+          <w:sz w:val="30"/>
+          <w:szCs w:val="30"/>
+        </w:rPr>
+        <w:t xml:space="preserve">Definierte Zentren — Wurzel, Solarplexus, Milz</w:t>
+      </w:r>
+    </w:p>
+    <w:p>
+      <w:pPr>
+        <w:spacing w:after="160" w:before="60"/>
+      </w:pPr>
+      <w:r>
+        <w:rPr>
+          <w:rFonts w:ascii="Arial" w:cs="Arial" w:eastAsia="Arial" w:hAnsi="Arial"/>
+          <w:i/>
+          <w:iCs/>
+          <w:color w:val="AD4B6E"/>
+          <w:sz w:val="21"/>
+          <w:szCs w:val="21"/>
+        </w:rPr>
+        <w:t xml:space="preserve">Wo deine Energie beständig und verlässlich ist</w:t>
+      </w:r>
+    </w:p>
+    <w:p>
+      <w:pPr>
+        <w:spacing w:after="200" w:line="320"/>
+        <w:jc w:val="both"/>
+      </w:pPr>
+      <w:r>
+        <w:rPr>
+          <w:rFonts w:ascii="Arial" w:cs="Arial" w:eastAsia="Arial" w:hAnsi="Arial"/>
+          <w:color w:val="2B2620"/>
+          <w:sz w:val="22"/>
+          <w:szCs w:val="22"/>
+        </w:rPr>
+        <w:t xml:space="preserve">Zwei aktive Kanäle verbinden deine drei definierten Zentren: der Kanal 28–38, der 'Kanal des Kampfes' (Milz–Wurzel), steht für eine stille, zähe Entschlossenheit, für das zu kämpfen, was wirklich Bedeutung hat – Ausdauer nicht um des Kämpfens willen, sondern weil dir das Leben ohne einen Sinn, für den es sich lohnt, zu leer wäre. Der Kanal 30–41, der 'Kanal der Anerkennung' (Wurzel–Solarplexus), speist eine tief sitzende Sehnsucht nach neuer, bedeutungsvoller emotionaler Erfahrung – eine Fantasie und Vorstellungskraft, die nach echtem Gefühl sucht, nicht nach Oberflächlichem.</w:t>
+      </w:r>
+    </w:p>
+    <w:p>
+      <w:pPr>
+        <w:spacing w:after="200" w:line="320"/>
+        <w:jc w:val="both"/>
+      </w:pPr>
+      <w:r>
+        <w:rPr>
+          <w:rFonts w:ascii="Arial" w:cs="Arial" w:eastAsia="Arial" w:hAnsi="Arial"/>
+          <w:color w:val="2B2620"/>
+          <w:sz w:val="22"/>
+          <w:szCs w:val="22"/>
+        </w:rPr>
+        <w:t xml:space="preserve">Dein Wurzel-Zentrum trägt zusätzlich zwei einzelne, nicht verkanalte Tore: Tor 39 (Provokation, über die bewusste Sonne) und Tor 60 (Begrenzung/Akzeptanz, gleich doppelt – bewusst über Jupiter und unbewusst über Saturn, beide auf Linie 2). Diese Tor-60-Doppelung ist wieder dieselbe reale Konstellation wie die Jupiter-Saturn-Konjunktion aus der Astrologie oben, nur in der Sprache von Human Design: das Thema Struktur, Grenzen und geduldiger Aufbau erscheint damit in beiden Systemen unabhängig voneinander.</w:t>
+      </w:r>
+    </w:p>
+    <w:p>
+      <w:pPr>
+        <w:spacing w:after="200" w:line="320"/>
+        <w:jc w:val="both"/>
+      </w:pPr>
+      <w:r>
+        <w:rPr>
+          <w:rFonts w:ascii="Arial" w:cs="Arial" w:eastAsia="Arial" w:hAnsi="Arial"/>
+          <w:color w:val="2B2620"/>
+          <w:sz w:val="22"/>
+          <w:szCs w:val="22"/>
+        </w:rPr>
+        <w:t xml:space="preserve">Die übrigen sechs Zentren – Kopf, Ajna, Kehle, Ich (G), Sakral und Herz – sind bei dir offen. Das ist kein Mangel, sondern deine Weisheit: Offene Zentren nehmen die Energie des Umfelds auf, verstärken sie und geben oft weise, aus vielen Blickwinkeln gewonnene Erkenntnis zurück – gerade weil du dort nicht in eine feste Art zu sein eingeschlossen bist.</w:t>
+      </w:r>
+    </w:p>
+    <w:p>
+      <w:r>
+        <w:br w:type="page"/>
+      </w:r>
     </w:p>
     <w:p>
       <w:pPr>
@@ -2863,6 +3299,17 @@
         </w:pBdr>
         <w:spacing w:after="40" w:before="320"/>
       </w:pPr>
+      <w:r>
+        <w:rPr>
+          <w:rFonts w:ascii="Arial" w:cs="Arial" w:eastAsia="Arial" w:hAnsi="Arial"/>
+          <w:b/>
+          <w:bCs/>
+          <w:color w:val="C97B95"/>
+          <w:sz w:val="30"/>
+          <w:szCs w:val="30"/>
+        </w:rPr>
+        <w:t xml:space="preserve">✦ </w:t>
+      </w:r>
       <w:r>
         <w:rPr>
           <w:rFonts w:ascii="Arial" w:cs="Arial" w:eastAsia="Arial" w:hAnsi="Arial"/>
@@ -2872,7 +3319,7 @@
           <w:sz w:val="30"/>
           <w:szCs w:val="30"/>
         </w:rPr>
-        <w:t xml:space="preserve">Typ und Strategie — Projektor</w:t>
+        <w:t xml:space="preserve">Alle 17 aktivierten Tore im Überblick</w:t>
       </w:r>
     </w:p>
     <w:p>
@@ -2884,207 +3331,7 @@
           <w:rFonts w:ascii="Arial" w:cs="Arial" w:eastAsia="Arial" w:hAnsi="Arial"/>
           <w:i/>
           <w:iCs/>
-          <w:color w:val="A6803C"/>
-          <w:sz w:val="21"/>
-          <w:szCs w:val="21"/>
-        </w:rPr>
-        <w:t xml:space="preserve">Erkennen und geführt werden, statt sich zu beweisen</w:t>
-      </w:r>
-    </w:p>
-    <w:p>
-      <w:pPr>
-        <w:spacing w:after="200" w:line="320"/>
-        <w:jc w:val="both"/>
-      </w:pPr>
-      <w:r>
-        <w:rPr>
-          <w:rFonts w:ascii="Arial" w:cs="Arial" w:eastAsia="Arial" w:hAnsi="Arial"/>
-          <w:color w:val="2B2620"/>
-          <w:sz w:val="22"/>
-          <w:szCs w:val="22"/>
-        </w:rPr>
-        <w:t xml:space="preserve">Du bist ein Projektor (rund 20 % aller Menschen) – kein Typ, der über beständige, sakrale Energie zum Handeln verfügt, sondern einer, der andere Menschen, Systeme und Energien tief erkennt und lenkt. Die Strategie eines Projektors ist, auf echte Einladung zu warten, statt sich von sich aus zu beweisen oder Energie in etwas zu stecken, das nicht erbeten wurde. Wird diese Strategie übergangen, entsteht das typische Projektor-'Nicht-Selbst'-Gefühl: Verbitterung – das Gefühl, sich für andere aufgerieben zu haben, ohne dass es gesehen oder gewürdigt wurde. Gelingt es dagegen, wirklich zu warten, wird die Anerkennung, die dann kommt, meist tief und treffend erlebt.</w:t>
-      </w:r>
-    </w:p>
-    <w:p>
-      <w:pPr>
-        <w:spacing w:after="200" w:line="320"/>
-        <w:jc w:val="both"/>
-      </w:pPr>
-      <w:r>
-        <w:rPr>
-          <w:rFonts w:ascii="Arial" w:cs="Arial" w:eastAsia="Arial" w:hAnsi="Arial"/>
-          <w:color w:val="2B2620"/>
-          <w:sz w:val="22"/>
-          <w:szCs w:val="22"/>
-        </w:rPr>
-        <w:t xml:space="preserve">Deine Autorität ist emotional – dein Solarplexus ist definiert. Das bedeutet: Eine Entscheidung, die im Moment vollkommen klar erscheint, ist es bei dir nie. Klarheit entsteht erst über eine emotionale Welle aus Hoch und Tief, die Stunden bis Tage dauern kann. Die praktische Konsequenz, gerade bei wichtigen Fragen und in der Liebe: kein 'Ja' und kein 'Nein' auf der Stelle, sondern bewusst 'eine Nacht darüber schlafen' – so oft, bis sich die Antwort unabhängig von der Tageslaune wiederholt.</w:t>
-      </w:r>
-    </w:p>
-    <w:p>
-      <w:pPr>
-        <w:pBdr>
-          <w:bottom w:val="single" w:color="A6803C" w:sz="6" w:space="6"/>
-        </w:pBdr>
-        <w:spacing w:after="40" w:before="320"/>
-      </w:pPr>
-      <w:r>
-        <w:rPr>
-          <w:rFonts w:ascii="Arial" w:cs="Arial" w:eastAsia="Arial" w:hAnsi="Arial"/>
-          <w:b/>
-          <w:bCs/>
-          <w:color w:val="5B2333"/>
-          <w:sz w:val="30"/>
-          <w:szCs w:val="30"/>
-        </w:rPr>
-        <w:t xml:space="preserve">Profil 5/1 — Ketzerin und Forscherin</w:t>
-      </w:r>
-    </w:p>
-    <w:p>
-      <w:pPr>
-        <w:spacing w:after="160" w:before="60"/>
-      </w:pPr>
-      <w:r>
-        <w:rPr>
-          <w:rFonts w:ascii="Arial" w:cs="Arial" w:eastAsia="Arial" w:hAnsi="Arial"/>
-          <w:i/>
-          <w:iCs/>
-          <w:color w:val="A6803C"/>
-          <w:sz w:val="21"/>
-          <w:szCs w:val="21"/>
-        </w:rPr>
-        <w:t xml:space="preserve">Eine praktische Lösung anbieten, die auf echtem Fundament steht</w:t>
-      </w:r>
-    </w:p>
-    <w:p>
-      <w:pPr>
-        <w:spacing w:after="200" w:line="320"/>
-        <w:jc w:val="both"/>
-      </w:pPr>
-      <w:r>
-        <w:rPr>
-          <w:rFonts w:ascii="Arial" w:cs="Arial" w:eastAsia="Arial" w:hAnsi="Arial"/>
-          <w:color w:val="2B2620"/>
-          <w:sz w:val="22"/>
-          <w:szCs w:val="22"/>
-        </w:rPr>
-        <w:t xml:space="preserve">Die erste Zahl deines Profils (5) beschreibt deine bewusste Rolle: die 'Ketzerin' – jemand, dem andere, oft ungefragt, praktische Lösungen und Führung in Krisen zutrauen. Menschen projizieren auf eine 5er-Linie leicht ihre Erwartungen und Hoffnungen; das bringt große, öffentlichkeitswirksame Wertschätzung, wenn eine Lösung wirklich trägt – aber auch das Risiko unfairer Enttäuschung, wenn die Erwartung nicht mit der Person hinter der Rolle übereinstimmt. Die zweite Zahl (1) beschreibt deine unbewusste, innere Grundlage: die 'Forscherin' – ein Bedürfnis nach solidem Fundament, nach wirklich verstandenem Wissen, bevor du dich sicher genug fühlst, um nach außen zu wirken. Zusammen ergibt das jemanden, deren nach außen sichtbare, oft geforderte praktische Kompetenz aus echter, in die Tiefe gehender eigener Recherche gespeist ist – nicht aus dem Bauch heraus.</w:t>
-      </w:r>
-    </w:p>
-    <w:p>
-      <w:pPr>
-        <w:pBdr>
-          <w:bottom w:val="single" w:color="A6803C" w:sz="6" w:space="6"/>
-        </w:pBdr>
-        <w:spacing w:after="40" w:before="320"/>
-      </w:pPr>
-      <w:r>
-        <w:rPr>
-          <w:rFonts w:ascii="Arial" w:cs="Arial" w:eastAsia="Arial" w:hAnsi="Arial"/>
-          <w:b/>
-          <w:bCs/>
-          <w:color w:val="5B2333"/>
-          <w:sz w:val="30"/>
-          <w:szCs w:val="30"/>
-        </w:rPr>
-        <w:t xml:space="preserve">Definierte Zentren — Wurzel, Solarplexus, Milz</w:t>
-      </w:r>
-    </w:p>
-    <w:p>
-      <w:pPr>
-        <w:spacing w:after="160" w:before="60"/>
-      </w:pPr>
-      <w:r>
-        <w:rPr>
-          <w:rFonts w:ascii="Arial" w:cs="Arial" w:eastAsia="Arial" w:hAnsi="Arial"/>
-          <w:i/>
-          <w:iCs/>
-          <w:color w:val="A6803C"/>
-          <w:sz w:val="21"/>
-          <w:szCs w:val="21"/>
-        </w:rPr>
-        <w:t xml:space="preserve">Wo deine Energie beständig und verlässlich ist</w:t>
-      </w:r>
-    </w:p>
-    <w:p>
-      <w:pPr>
-        <w:spacing w:after="200" w:line="320"/>
-        <w:jc w:val="both"/>
-      </w:pPr>
-      <w:r>
-        <w:rPr>
-          <w:rFonts w:ascii="Arial" w:cs="Arial" w:eastAsia="Arial" w:hAnsi="Arial"/>
-          <w:color w:val="2B2620"/>
-          <w:sz w:val="22"/>
-          <w:szCs w:val="22"/>
-        </w:rPr>
-        <w:t xml:space="preserve">Zwei aktive Kanäle verbinden deine drei definierten Zentren: der Kanal 28–38, der 'Kanal des Kampfes' (Milz–Wurzel), steht für eine stille, zähe Entschlossenheit, für das zu kämpfen, was wirklich Bedeutung hat – Ausdauer nicht um des Kämpfens willen, sondern weil dir das Leben ohne einen Sinn, für den es sich lohnt, zu leer wäre. Der Kanal 30–41, der 'Kanal der Anerkennung' (Wurzel–Solarplexus), speist eine tief sitzende Sehnsucht nach neuer, bedeutungsvoller emotionaler Erfahrung – eine Fantasie und Vorstellungskraft, die nach echtem Gefühl sucht, nicht nach Oberflächlichem.</w:t>
-      </w:r>
-    </w:p>
-    <w:p>
-      <w:pPr>
-        <w:spacing w:after="200" w:line="320"/>
-        <w:jc w:val="both"/>
-      </w:pPr>
-      <w:r>
-        <w:rPr>
-          <w:rFonts w:ascii="Arial" w:cs="Arial" w:eastAsia="Arial" w:hAnsi="Arial"/>
-          <w:color w:val="2B2620"/>
-          <w:sz w:val="22"/>
-          <w:szCs w:val="22"/>
-        </w:rPr>
-        <w:t xml:space="preserve">Dein Wurzel-Zentrum trägt zusätzlich zwei einzelne, nicht verkanalte Tore: Tor 39 (Provokation, über die bewusste Sonne) und Tor 60 (Begrenzung/Akzeptanz, gleich doppelt – bewusst über Jupiter und unbewusst über Saturn, beide auf Linie 2). Diese Tor-60-Doppelung ist wieder dieselbe reale Konstellation wie die Jupiter-Saturn-Konjunktion aus der Astrologie oben, nur in der Sprache von Human Design: das Thema Struktur, Grenzen und geduldiger Aufbau erscheint damit in beiden Systemen unabhängig voneinander.</w:t>
-      </w:r>
-    </w:p>
-    <w:p>
-      <w:pPr>
-        <w:spacing w:after="200" w:line="320"/>
-        <w:jc w:val="both"/>
-      </w:pPr>
-      <w:r>
-        <w:rPr>
-          <w:rFonts w:ascii="Arial" w:cs="Arial" w:eastAsia="Arial" w:hAnsi="Arial"/>
-          <w:color w:val="2B2620"/>
-          <w:sz w:val="22"/>
-          <w:szCs w:val="22"/>
-        </w:rPr>
-        <w:t xml:space="preserve">Die übrigen sechs Zentren – Kopf, Ajna, Kehle, Ich (G), Sakral und Herz – sind bei dir offen. Das ist kein Mangel, sondern deine Weisheit: Offene Zentren nehmen die Energie des Umfelds auf, verstärken sie und geben oft weise, aus vielen Blickwinkeln gewonnene Erkenntnis zurück – gerade weil du dort nicht in eine feste Art zu sein eingeschlossen bist.</w:t>
-      </w:r>
-    </w:p>
-    <w:p>
-      <w:r>
-        <w:br w:type="page"/>
-      </w:r>
-    </w:p>
-    <w:p>
-      <w:pPr>
-        <w:pBdr>
-          <w:bottom w:val="single" w:color="A6803C" w:sz="6" w:space="6"/>
-        </w:pBdr>
-        <w:spacing w:after="40" w:before="320"/>
-      </w:pPr>
-      <w:r>
-        <w:rPr>
-          <w:rFonts w:ascii="Arial" w:cs="Arial" w:eastAsia="Arial" w:hAnsi="Arial"/>
-          <w:b/>
-          <w:bCs/>
-          <w:color w:val="5B2333"/>
-          <w:sz w:val="30"/>
-          <w:szCs w:val="30"/>
-        </w:rPr>
-        <w:t xml:space="preserve">Alle 17 aktivierten Tore im Überblick</w:t>
-      </w:r>
-    </w:p>
-    <w:p>
-      <w:pPr>
-        <w:spacing w:after="160" w:before="60"/>
-      </w:pPr>
-      <w:r>
-        <w:rPr>
-          <w:rFonts w:ascii="Arial" w:cs="Arial" w:eastAsia="Arial" w:hAnsi="Arial"/>
-          <w:i/>
-          <w:iCs/>
-          <w:color w:val="A6803C"/>
+          <w:color w:val="AD4B6E"/>
           <w:sz w:val="21"/>
           <w:szCs w:val="21"/>
         </w:rPr>
@@ -3131,7 +3378,7 @@
         <w:tc>
           <w:tcPr>
             <w:tcW w:type="dxa" w:w="900"/>
-            <w:shd w:fill="5B2333" w:val="clear"/>
+            <w:shd w:fill="AD4B6E" w:val="clear"/>
             <w:tcMar>
               <w:top w:type="dxa" w:w="100"/>
               <w:left w:type="dxa" w:w="120"/>
@@ -3157,7 +3404,7 @@
         <w:tc>
           <w:tcPr>
             <w:tcW w:type="dxa" w:w="1500"/>
-            <w:shd w:fill="5B2333" w:val="clear"/>
+            <w:shd w:fill="AD4B6E" w:val="clear"/>
             <w:tcMar>
               <w:top w:type="dxa" w:w="100"/>
               <w:left w:type="dxa" w:w="120"/>
@@ -3183,7 +3430,7 @@
         <w:tc>
           <w:tcPr>
             <w:tcW w:type="dxa" w:w="2600"/>
-            <w:shd w:fill="5B2333" w:val="clear"/>
+            <w:shd w:fill="AD4B6E" w:val="clear"/>
             <w:tcMar>
               <w:top w:type="dxa" w:w="100"/>
               <w:left w:type="dxa" w:w="120"/>
@@ -3209,7 +3456,7 @@
         <w:tc>
           <w:tcPr>
             <w:tcW w:type="dxa" w:w="3600"/>
-            <w:shd w:fill="5B2333" w:val="clear"/>
+            <w:shd w:fill="AD4B6E" w:val="clear"/>
             <w:tcMar>
               <w:top w:type="dxa" w:w="100"/>
               <w:left w:type="dxa" w:w="120"/>
@@ -3343,7 +3590,7 @@
         <w:tc>
           <w:tcPr>
             <w:tcW w:type="dxa" w:w="900"/>
-            <w:shd w:fill="F6EFE3" w:val="clear"/>
+            <w:shd w:fill="FBE9EC" w:val="clear"/>
             <w:tcMar>
               <w:top w:type="dxa" w:w="100"/>
               <w:left w:type="dxa" w:w="120"/>
@@ -3369,7 +3616,7 @@
         <w:tc>
           <w:tcPr>
             <w:tcW w:type="dxa" w:w="1500"/>
-            <w:shd w:fill="F6EFE3" w:val="clear"/>
+            <w:shd w:fill="FBE9EC" w:val="clear"/>
             <w:tcMar>
               <w:top w:type="dxa" w:w="100"/>
               <w:left w:type="dxa" w:w="120"/>
@@ -3395,7 +3642,7 @@
         <w:tc>
           <w:tcPr>
             <w:tcW w:type="dxa" w:w="2600"/>
-            <w:shd w:fill="F6EFE3" w:val="clear"/>
+            <w:shd w:fill="FBE9EC" w:val="clear"/>
             <w:tcMar>
               <w:top w:type="dxa" w:w="100"/>
               <w:left w:type="dxa" w:w="120"/>
@@ -3421,7 +3668,7 @@
         <w:tc>
           <w:tcPr>
             <w:tcW w:type="dxa" w:w="3600"/>
-            <w:shd w:fill="F6EFE3" w:val="clear"/>
+            <w:shd w:fill="FBE9EC" w:val="clear"/>
             <w:tcMar>
               <w:top w:type="dxa" w:w="100"/>
               <w:left w:type="dxa" w:w="120"/>
@@ -3555,7 +3802,7 @@
         <w:tc>
           <w:tcPr>
             <w:tcW w:type="dxa" w:w="900"/>
-            <w:shd w:fill="F6EFE3" w:val="clear"/>
+            <w:shd w:fill="FBE9EC" w:val="clear"/>
             <w:tcMar>
               <w:top w:type="dxa" w:w="100"/>
               <w:left w:type="dxa" w:w="120"/>
@@ -3581,7 +3828,7 @@
         <w:tc>
           <w:tcPr>
             <w:tcW w:type="dxa" w:w="1500"/>
-            <w:shd w:fill="F6EFE3" w:val="clear"/>
+            <w:shd w:fill="FBE9EC" w:val="clear"/>
             <w:tcMar>
               <w:top w:type="dxa" w:w="100"/>
               <w:left w:type="dxa" w:w="120"/>
@@ -3607,7 +3854,7 @@
         <w:tc>
           <w:tcPr>
             <w:tcW w:type="dxa" w:w="2600"/>
-            <w:shd w:fill="F6EFE3" w:val="clear"/>
+            <w:shd w:fill="FBE9EC" w:val="clear"/>
             <w:tcMar>
               <w:top w:type="dxa" w:w="100"/>
               <w:left w:type="dxa" w:w="120"/>
@@ -3633,7 +3880,7 @@
         <w:tc>
           <w:tcPr>
             <w:tcW w:type="dxa" w:w="3600"/>
-            <w:shd w:fill="F6EFE3" w:val="clear"/>
+            <w:shd w:fill="FBE9EC" w:val="clear"/>
             <w:tcMar>
               <w:top w:type="dxa" w:w="100"/>
               <w:left w:type="dxa" w:w="120"/>
@@ -3767,7 +4014,7 @@
         <w:tc>
           <w:tcPr>
             <w:tcW w:type="dxa" w:w="900"/>
-            <w:shd w:fill="F6EFE3" w:val="clear"/>
+            <w:shd w:fill="FBE9EC" w:val="clear"/>
             <w:tcMar>
               <w:top w:type="dxa" w:w="100"/>
               <w:left w:type="dxa" w:w="120"/>
@@ -3793,7 +4040,7 @@
         <w:tc>
           <w:tcPr>
             <w:tcW w:type="dxa" w:w="1500"/>
-            <w:shd w:fill="F6EFE3" w:val="clear"/>
+            <w:shd w:fill="FBE9EC" w:val="clear"/>
             <w:tcMar>
               <w:top w:type="dxa" w:w="100"/>
               <w:left w:type="dxa" w:w="120"/>
@@ -3819,7 +4066,7 @@
         <w:tc>
           <w:tcPr>
             <w:tcW w:type="dxa" w:w="2600"/>
-            <w:shd w:fill="F6EFE3" w:val="clear"/>
+            <w:shd w:fill="FBE9EC" w:val="clear"/>
             <w:tcMar>
               <w:top w:type="dxa" w:w="100"/>
               <w:left w:type="dxa" w:w="120"/>
@@ -3845,7 +4092,7 @@
         <w:tc>
           <w:tcPr>
             <w:tcW w:type="dxa" w:w="3600"/>
-            <w:shd w:fill="F6EFE3" w:val="clear"/>
+            <w:shd w:fill="FBE9EC" w:val="clear"/>
             <w:tcMar>
               <w:top w:type="dxa" w:w="100"/>
               <w:left w:type="dxa" w:w="120"/>
@@ -3979,7 +4226,7 @@
         <w:tc>
           <w:tcPr>
             <w:tcW w:type="dxa" w:w="900"/>
-            <w:shd w:fill="F6EFE3" w:val="clear"/>
+            <w:shd w:fill="FBE9EC" w:val="clear"/>
             <w:tcMar>
               <w:top w:type="dxa" w:w="100"/>
               <w:left w:type="dxa" w:w="120"/>
@@ -4005,7 +4252,7 @@
         <w:tc>
           <w:tcPr>
             <w:tcW w:type="dxa" w:w="1500"/>
-            <w:shd w:fill="F6EFE3" w:val="clear"/>
+            <w:shd w:fill="FBE9EC" w:val="clear"/>
             <w:tcMar>
               <w:top w:type="dxa" w:w="100"/>
               <w:left w:type="dxa" w:w="120"/>
@@ -4031,7 +4278,7 @@
         <w:tc>
           <w:tcPr>
             <w:tcW w:type="dxa" w:w="2600"/>
-            <w:shd w:fill="F6EFE3" w:val="clear"/>
+            <w:shd w:fill="FBE9EC" w:val="clear"/>
             <w:tcMar>
               <w:top w:type="dxa" w:w="100"/>
               <w:left w:type="dxa" w:w="120"/>
@@ -4057,7 +4304,7 @@
         <w:tc>
           <w:tcPr>
             <w:tcW w:type="dxa" w:w="3600"/>
-            <w:shd w:fill="F6EFE3" w:val="clear"/>
+            <w:shd w:fill="FBE9EC" w:val="clear"/>
             <w:tcMar>
               <w:top w:type="dxa" w:w="100"/>
               <w:left w:type="dxa" w:w="120"/>
@@ -4191,7 +4438,7 @@
         <w:tc>
           <w:tcPr>
             <w:tcW w:type="dxa" w:w="900"/>
-            <w:shd w:fill="F6EFE3" w:val="clear"/>
+            <w:shd w:fill="FBE9EC" w:val="clear"/>
             <w:tcMar>
               <w:top w:type="dxa" w:w="100"/>
               <w:left w:type="dxa" w:w="120"/>
@@ -4217,7 +4464,7 @@
         <w:tc>
           <w:tcPr>
             <w:tcW w:type="dxa" w:w="1500"/>
-            <w:shd w:fill="F6EFE3" w:val="clear"/>
+            <w:shd w:fill="FBE9EC" w:val="clear"/>
             <w:tcMar>
               <w:top w:type="dxa" w:w="100"/>
               <w:left w:type="dxa" w:w="120"/>
@@ -4243,7 +4490,7 @@
         <w:tc>
           <w:tcPr>
             <w:tcW w:type="dxa" w:w="2600"/>
-            <w:shd w:fill="F6EFE3" w:val="clear"/>
+            <w:shd w:fill="FBE9EC" w:val="clear"/>
             <w:tcMar>
               <w:top w:type="dxa" w:w="100"/>
               <w:left w:type="dxa" w:w="120"/>
@@ -4269,7 +4516,7 @@
         <w:tc>
           <w:tcPr>
             <w:tcW w:type="dxa" w:w="3600"/>
-            <w:shd w:fill="F6EFE3" w:val="clear"/>
+            <w:shd w:fill="FBE9EC" w:val="clear"/>
             <w:tcMar>
               <w:top w:type="dxa" w:w="100"/>
               <w:left w:type="dxa" w:w="120"/>
@@ -4403,7 +4650,7 @@
         <w:tc>
           <w:tcPr>
             <w:tcW w:type="dxa" w:w="900"/>
-            <w:shd w:fill="F6EFE3" w:val="clear"/>
+            <w:shd w:fill="FBE9EC" w:val="clear"/>
             <w:tcMar>
               <w:top w:type="dxa" w:w="100"/>
               <w:left w:type="dxa" w:w="120"/>
@@ -4429,7 +4676,7 @@
         <w:tc>
           <w:tcPr>
             <w:tcW w:type="dxa" w:w="1500"/>
-            <w:shd w:fill="F6EFE3" w:val="clear"/>
+            <w:shd w:fill="FBE9EC" w:val="clear"/>
             <w:tcMar>
               <w:top w:type="dxa" w:w="100"/>
               <w:left w:type="dxa" w:w="120"/>
@@ -4455,7 +4702,7 @@
         <w:tc>
           <w:tcPr>
             <w:tcW w:type="dxa" w:w="2600"/>
-            <w:shd w:fill="F6EFE3" w:val="clear"/>
+            <w:shd w:fill="FBE9EC" w:val="clear"/>
             <w:tcMar>
               <w:top w:type="dxa" w:w="100"/>
               <w:left w:type="dxa" w:w="120"/>
@@ -4481,7 +4728,7 @@
         <w:tc>
           <w:tcPr>
             <w:tcW w:type="dxa" w:w="3600"/>
-            <w:shd w:fill="F6EFE3" w:val="clear"/>
+            <w:shd w:fill="FBE9EC" w:val="clear"/>
             <w:tcMar>
               <w:top w:type="dxa" w:w="100"/>
               <w:left w:type="dxa" w:w="120"/>
@@ -4615,7 +4862,7 @@
         <w:tc>
           <w:tcPr>
             <w:tcW w:type="dxa" w:w="900"/>
-            <w:shd w:fill="F6EFE3" w:val="clear"/>
+            <w:shd w:fill="FBE9EC" w:val="clear"/>
             <w:tcMar>
               <w:top w:type="dxa" w:w="100"/>
               <w:left w:type="dxa" w:w="120"/>
@@ -4641,7 +4888,7 @@
         <w:tc>
           <w:tcPr>
             <w:tcW w:type="dxa" w:w="1500"/>
-            <w:shd w:fill="F6EFE3" w:val="clear"/>
+            <w:shd w:fill="FBE9EC" w:val="clear"/>
             <w:tcMar>
               <w:top w:type="dxa" w:w="100"/>
               <w:left w:type="dxa" w:w="120"/>
@@ -4667,7 +4914,7 @@
         <w:tc>
           <w:tcPr>
             <w:tcW w:type="dxa" w:w="2600"/>
-            <w:shd w:fill="F6EFE3" w:val="clear"/>
+            <w:shd w:fill="FBE9EC" w:val="clear"/>
             <w:tcMar>
               <w:top w:type="dxa" w:w="100"/>
               <w:left w:type="dxa" w:w="120"/>
@@ -4693,7 +4940,7 @@
         <w:tc>
           <w:tcPr>
             <w:tcW w:type="dxa" w:w="3600"/>
-            <w:shd w:fill="F6EFE3" w:val="clear"/>
+            <w:shd w:fill="FBE9EC" w:val="clear"/>
             <w:tcMar>
               <w:top w:type="dxa" w:w="100"/>
               <w:left w:type="dxa" w:w="120"/>
@@ -4827,7 +5074,7 @@
         <w:tc>
           <w:tcPr>
             <w:tcW w:type="dxa" w:w="900"/>
-            <w:shd w:fill="F6EFE3" w:val="clear"/>
+            <w:shd w:fill="FBE9EC" w:val="clear"/>
             <w:tcMar>
               <w:top w:type="dxa" w:w="100"/>
               <w:left w:type="dxa" w:w="120"/>
@@ -4853,7 +5100,7 @@
         <w:tc>
           <w:tcPr>
             <w:tcW w:type="dxa" w:w="1500"/>
-            <w:shd w:fill="F6EFE3" w:val="clear"/>
+            <w:shd w:fill="FBE9EC" w:val="clear"/>
             <w:tcMar>
               <w:top w:type="dxa" w:w="100"/>
               <w:left w:type="dxa" w:w="120"/>
@@ -4879,7 +5126,7 @@
         <w:tc>
           <w:tcPr>
             <w:tcW w:type="dxa" w:w="2600"/>
-            <w:shd w:fill="F6EFE3" w:val="clear"/>
+            <w:shd w:fill="FBE9EC" w:val="clear"/>
             <w:tcMar>
               <w:top w:type="dxa" w:w="100"/>
               <w:left w:type="dxa" w:w="120"/>
@@ -4905,7 +5152,7 @@
         <w:tc>
           <w:tcPr>
             <w:tcW w:type="dxa" w:w="3600"/>
-            <w:shd w:fill="F6EFE3" w:val="clear"/>
+            <w:shd w:fill="FBE9EC" w:val="clear"/>
             <w:tcMar>
               <w:top w:type="dxa" w:w="100"/>
               <w:left w:type="dxa" w:w="120"/>
@@ -5064,10 +5311,243 @@
     <w:p>
       <w:pPr>
         <w:pBdr>
-          <w:bottom w:val="single" w:color="A6803C" w:sz="6" w:space="6"/>
+          <w:bottom w:val="single" w:color="C97B95" w:sz="6" w:space="6"/>
         </w:pBdr>
         <w:spacing w:after="40" w:before="320"/>
       </w:pPr>
+      <w:r>
+        <w:rPr>
+          <w:rFonts w:ascii="Arial" w:cs="Arial" w:eastAsia="Arial" w:hAnsi="Arial"/>
+          <w:b/>
+          <w:bCs/>
+          <w:color w:val="C97B95"/>
+          <w:sz w:val="30"/>
+          <w:szCs w:val="30"/>
+        </w:rPr>
+        <w:t xml:space="preserve">✦ </w:t>
+      </w:r>
+      <w:r>
+        <w:rPr>
+          <w:rFonts w:ascii="Arial" w:cs="Arial" w:eastAsia="Arial" w:hAnsi="Arial"/>
+          <w:b/>
+          <w:bCs/>
+          <w:color w:val="AD4B6E"/>
+          <w:sz w:val="30"/>
+          <w:szCs w:val="30"/>
+        </w:rPr>
+        <w:t xml:space="preserve">Die offenen Zentren im Detail</w:t>
+      </w:r>
+    </w:p>
+    <w:p>
+      <w:pPr>
+        <w:spacing w:after="160" w:before="60"/>
+      </w:pPr>
+      <w:r>
+        <w:rPr>
+          <w:rFonts w:ascii="Arial" w:cs="Arial" w:eastAsia="Arial" w:hAnsi="Arial"/>
+          <w:i/>
+          <w:iCs/>
+          <w:color w:val="AD4B6E"/>
+          <w:sz w:val="21"/>
+          <w:szCs w:val="21"/>
+        </w:rPr>
+        <w:t xml:space="preserve">Kopf, Ajna, Kehle, Ich (G), Sakral und Herz — mit ihren einzelnen Toren</w:t>
+      </w:r>
+    </w:p>
+    <w:p>
+      <w:pPr>
+        <w:spacing w:after="200" w:line="320"/>
+        <w:jc w:val="both"/>
+      </w:pPr>
+      <w:r>
+        <w:rPr>
+          <w:rFonts w:ascii="Arial" w:cs="Arial" w:eastAsia="Arial" w:hAnsi="Arial"/>
+          <w:color w:val="2B2620"/>
+          <w:sz w:val="22"/>
+          <w:szCs w:val="22"/>
+        </w:rPr>
+        <w:t xml:space="preserve">Kopf (Tor 61, bewusst über Saturn, Linie 3): Ein leises, nicht immer erklärbares inneres Wissen drängt nach Ausdruck — verstärkt durch die Bindungsprüferin-Linie 3, das heißt: Diese Ahnungen bewähren sich bei dir eher in der praktischen Erprobung als in der reinen Theorie. Da das Kopf-Zentrum insgesamt offen ist, nimmst du den Denk- und Inspirationsdruck deiner Umgebung leicht auf, ohne ihn selbst zu erzeugen — eine Stärke, wenn du dir bewusst machst, dass nicht jede drängende Frage deine eigene ist.</w:t>
+      </w:r>
+    </w:p>
+    <w:p>
+      <w:pPr>
+        <w:spacing w:after="200" w:line="320"/>
+        <w:jc w:val="both"/>
+      </w:pPr>
+      <w:r>
+        <w:rPr>
+          <w:rFonts w:ascii="Arial" w:cs="Arial" w:eastAsia="Arial" w:hAnsi="Arial"/>
+          <w:color w:val="2B2620"/>
+          <w:sz w:val="22"/>
+          <w:szCs w:val="22"/>
+        </w:rPr>
+        <w:t xml:space="preserve">Ajna (Tore 17 und 4): Tor 17 (bewusst, Erde, Linie 5) gibt dir eine klare, oft gefragte Meinung; Tor 4 (unbewusst, Uranus, Linie 5) liefert im Hintergrund feste, logische Antworten auf wiederkehrende Fragen. Beide tragen die Fünfer-Linie: Deine Meinungen und Antworten werden von außen leicht als praktische Lösung eingefordert. Weil Ajna insgesamt offen bleibt, ist keine dieser Meinungen in Stein gemeißelt — du kannst, anders als bei einer definierten Ajna, mehrere Blickwinkel gleichzeitig einnehmen, was Weisheit ermöglicht, aber auch verunsichern kann, wenn zu viele fremde Meinungen gleichzeitig einströmen.</w:t>
+      </w:r>
+    </w:p>
+    <w:p>
+      <w:pPr>
+        <w:spacing w:after="200" w:line="320"/>
+        <w:jc w:val="both"/>
+      </w:pPr>
+      <w:r>
+        <w:rPr>
+          <w:rFonts w:ascii="Arial" w:cs="Arial" w:eastAsia="Arial" w:hAnsi="Arial"/>
+          <w:color w:val="2B2620"/>
+          <w:sz w:val="22"/>
+          <w:szCs w:val="22"/>
+        </w:rPr>
+        <w:t xml:space="preserve">Kehle (Tor 8, unbewusst über Venus, Linie 1): Ein unbewusster Drang, dich mit einem eigenen, unverwechselbaren Stil einzubringen — hier über die Forscherin-Linie 1, also getragen von echtem, selbst erarbeitetem Fundament statt von Show. Da die Kehle als Ganzes offen ist, ist dieser Beitrag nicht ständig verfügbar, sondern situativ: Du bist nicht dafür gebaut, immer im Rampenlicht zu performen, sondern dann, wenn Umstände und Publikum wirklich passen.</w:t>
+      </w:r>
+    </w:p>
+    <w:p>
+      <w:pPr>
+        <w:spacing w:after="200" w:line="320"/>
+        <w:jc w:val="both"/>
+      </w:pPr>
+      <w:r>
+        <w:rPr>
+          <w:rFonts w:ascii="Arial" w:cs="Arial" w:eastAsia="Arial" w:hAnsi="Arial"/>
+          <w:color w:val="2B2620"/>
+          <w:sz w:val="22"/>
+          <w:szCs w:val="22"/>
+        </w:rPr>
+        <w:t xml:space="preserve">Ich / G (Tor 15, doppelt: bewusst über den Mond UND unbewusst über Merkur, jeweils Linie 6): Eine besonders verstärkte Aktivierung — Tor 15, 'Extreme', erscheint bei dir gleich zweimal auf derselben Linie. Das Thema, die ganze Bandbreite menschlichen Verhaltens anzunehmen und einen eigenen, unabhängigen Rhythmus zu finden statt sich fremden Zeitplänen zu unterwerfen, ist bei dir also doppelt unterstrichen — passend zur Vorbild-Linie 6, die diesen eigenen Rhythmus zunehmend beispielhaft nach außen trägt. Da das Ich-Zentrum insgesamt offen ist, bleibt deine Identität und deine Liebesrichtung wandelbar und kontextabhängig: lebendig und anpassungsfähig, aber eben auch leicht beeinflussbar durch das Gegenüber, wenn du nicht bei dir bleibst.</w:t>
+      </w:r>
+    </w:p>
+    <w:p>
+      <w:pPr>
+        <w:spacing w:after="200" w:line="320"/>
+        <w:jc w:val="both"/>
+      </w:pPr>
+      <w:r>
+        <w:rPr>
+          <w:rFonts w:ascii="Arial" w:cs="Arial" w:eastAsia="Arial" w:hAnsi="Arial"/>
+          <w:color w:val="2B2620"/>
+          <w:sz w:val="22"/>
+          <w:szCs w:val="22"/>
+        </w:rPr>
+        <w:t xml:space="preserve">Sakral (Tore 29 und 59): Tor 29 ist bei dir gleich dreifach aktiv — bewusst über den Nordknoten (Linie 3) und Uranus (Linie 5), unbewusst über den Südknoten (Linie 4) — ein ungewöhnlich starkes Echo des Themas 'Ausdauer': das volle, verbindliche Ja zu einer Erfahrung. Tor 59 (unbewusst über Mars, Linie 2) bringt zusätzlich den Impuls, Barrieren zwischen Menschen aufzulösen, um echte Nähe zu ermöglichen. Weil dein Sakral-Zentrum insgesamt offen ist — du bist kein Generator-Typ —, ist diese Ausdauer- und Verbindungskraft nicht endlos verfügbar: Sie will bewusst dosiert werden, statt sich (dem eigenen Ja-Sagen-Reflex folgend) in Erfahrungen zu erschöpfen, für die eigentlich keine nachhaltige Energie da ist.</w:t>
+      </w:r>
+    </w:p>
+    <w:p>
+      <w:pPr>
+        <w:spacing w:after="200" w:line="320"/>
+        <w:jc w:val="both"/>
+      </w:pPr>
+      <w:r>
+        <w:rPr>
+          <w:rFonts w:ascii="Arial" w:cs="Arial" w:eastAsia="Arial" w:hAnsi="Arial"/>
+          <w:color w:val="2B2620"/>
+          <w:sz w:val="22"/>
+          <w:szCs w:val="22"/>
+        </w:rPr>
+        <w:t xml:space="preserve">Herz (Tor 40, dreifach: bewusst über Venus UND Pluto, beide Linie 4, unbewusst über Pluto, Linie 1): Bemerkenswert ist hier die exakte Übereinstimmung mit der Venus-Pluto-Konjunktion aus dem astrologischen Teil oben — dieselbe reale Planetenkonstellation zeigt sich in Human Design als doppelte Aktivierung von Tor 40, 'Alleinsein'. Das Thema: sich für andere verausgaben können, aber ebenso das Recht und die Notwendigkeit, sich danach bewusst abzugrenzen, um wirklich anzukommen — over-give und Rückzug im Wechsel. Da das Herz-Zentrum offen ist, ist Wille und Selbstwert bei dir kein Dauerzustand, sondern schwankt mit dem Umfeld; die eigene Verausgabung an Bedingungen zu knüpfen (siehe die Reflexion zu Venus/Pluto oben) ist auch hier der Schlüssel.</w:t>
+      </w:r>
+    </w:p>
+    <w:p>
+      <w:r>
+        <w:br w:type="page"/>
+      </w:r>
+    </w:p>
+    <w:p>
+      <w:pPr>
+        <w:pBdr>
+          <w:bottom w:val="single" w:color="C97B95" w:sz="6" w:space="6"/>
+        </w:pBdr>
+        <w:spacing w:after="40" w:before="320"/>
+      </w:pPr>
+      <w:r>
+        <w:rPr>
+          <w:rFonts w:ascii="Arial" w:cs="Arial" w:eastAsia="Arial" w:hAnsi="Arial"/>
+          <w:b/>
+          <w:bCs/>
+          <w:color w:val="C97B95"/>
+          <w:sz w:val="30"/>
+          <w:szCs w:val="30"/>
+        </w:rPr>
+        <w:t xml:space="preserve">✦ </w:t>
+      </w:r>
+      <w:r>
+        <w:rPr>
+          <w:rFonts w:ascii="Arial" w:cs="Arial" w:eastAsia="Arial" w:hAnsi="Arial"/>
+          <w:b/>
+          <w:bCs/>
+          <w:color w:val="AD4B6E"/>
+          <w:sz w:val="30"/>
+          <w:szCs w:val="30"/>
+        </w:rPr>
+        <w:t xml:space="preserve">Lebensaufgabe</w:t>
+      </w:r>
+    </w:p>
+    <w:p>
+      <w:pPr>
+        <w:spacing w:after="160" w:before="60"/>
+      </w:pPr>
+      <w:r>
+        <w:rPr>
+          <w:rFonts w:ascii="Arial" w:cs="Arial" w:eastAsia="Arial" w:hAnsi="Arial"/>
+          <w:i/>
+          <w:iCs/>
+          <w:color w:val="AD4B6E"/>
+          <w:sz w:val="21"/>
+          <w:szCs w:val="21"/>
+        </w:rPr>
+        <w:t xml:space="preserve">Sonne und Erde, bewusst und unbewusst — dein Inkarnationskreuz</w:t>
+      </w:r>
+    </w:p>
+    <w:p>
+      <w:pPr>
+        <w:spacing w:after="200" w:line="320"/>
+        <w:jc w:val="both"/>
+      </w:pPr>
+      <w:r>
+        <w:rPr>
+          <w:rFonts w:ascii="Arial" w:cs="Arial" w:eastAsia="Arial" w:hAnsi="Arial"/>
+          <w:color w:val="2B2620"/>
+          <w:sz w:val="22"/>
+          <w:szCs w:val="22"/>
+        </w:rPr>
+        <w:t xml:space="preserve">Deine Lebensaufgabe wird in Human Design vor allem über vier Tore bestimmt: Sonne und Erde zum Zeitpunkt deiner Geburt (Tor 18 und Tor 17) sowie Sonne und Erde 88 Tage davor (Tor 39 und Tor 38). Tor 18 steht für Korrektur – den Blick für das, was nicht stimmt, und den Antrieb, es zu verbessern. Tor 17 steht für die eigene, gut durchdachte Meinung. Tor 39 steht für Provokation – das bewusste oder unbewusste Herausfordern anderer, um echte statt vorgetäuschte Reaktion sichtbar zu machen. Tor 38 steht für den Kampf um das, was wirklich zählt.</w:t>
+      </w:r>
+    </w:p>
+    <w:p>
+      <w:pPr>
+        <w:spacing w:after="200" w:line="320"/>
+        <w:jc w:val="both"/>
+      </w:pPr>
+      <w:r>
+        <w:rPr>
+          <w:rFonts w:ascii="Arial" w:cs="Arial" w:eastAsia="Arial" w:hAnsi="Arial"/>
+          <w:color w:val="2B2620"/>
+          <w:sz w:val="22"/>
+          <w:szCs w:val="22"/>
+        </w:rPr>
+        <w:t xml:space="preserve">Zusammengenommen zeichnet dieses Kreuz die Aufgabe einer Frau, die dort, wo etwas nicht stimmig ist, nicht wegsieht, sondern es benennt und dafür kämpft – nicht aus Streitlust, sondern aus einem tiefen, oft unbequemen Sinn für das, was richtig wäre. Verbunden mit Profil und Autorität heißt das: Deine Lösungen wirken am stärksten, wenn du eingeladen wirst, sie zu geben; wenn du emotional durchgefühlt und nicht überstürzt entscheidest; und wenn dein Kampfgeist einem Fundament dient, das du dir selbst wirklich erarbeitet hast.</w:t>
+      </w:r>
+    </w:p>
+    <w:p>
+      <w:r>
+        <w:br w:type="page"/>
+      </w:r>
+    </w:p>
+    <w:p>
+      <w:pPr>
+        <w:pBdr>
+          <w:bottom w:val="single" w:color="D9C48F" w:sz="6" w:space="6"/>
+        </w:pBdr>
+        <w:spacing w:after="40" w:before="320"/>
+      </w:pPr>
+      <w:r>
+        <w:rPr>
+          <w:rFonts w:ascii="Arial" w:cs="Arial" w:eastAsia="Arial" w:hAnsi="Arial"/>
+          <w:b/>
+          <w:bCs/>
+          <w:color w:val="C97B95"/>
+          <w:sz w:val="30"/>
+          <w:szCs w:val="30"/>
+        </w:rPr>
+        <w:t xml:space="preserve">✦ </w:t>
+      </w:r>
       <w:r>
         <w:rPr>
           <w:rFonts w:ascii="Arial" w:cs="Arial" w:eastAsia="Arial" w:hAnsi="Arial"/>
@@ -5077,7 +5557,7 @@
           <w:sz w:val="30"/>
           <w:szCs w:val="30"/>
         </w:rPr>
-        <w:t xml:space="preserve">Die offenen Zentren im Detail</w:t>
+        <w:t xml:space="preserve">Ein wiederkehrender Faden — eine Einladung zur Reflexion</w:t>
       </w:r>
     </w:p>
     <w:p>
@@ -5089,11 +5569,11 @@
           <w:rFonts w:ascii="Arial" w:cs="Arial" w:eastAsia="Arial" w:hAnsi="Arial"/>
           <w:i/>
           <w:iCs/>
-          <w:color w:val="A6803C"/>
+          <w:color w:val="AD4B6E"/>
           <w:sz w:val="21"/>
           <w:szCs w:val="21"/>
         </w:rPr>
-        <w:t xml:space="preserve">Kopf, Ajna, Kehle, Ich (G), Sakral und Herz — mit ihren einzelnen Toren</w:t>
+        <w:t xml:space="preserve">Nicht, was dir widerfährt, sondern von wo du entscheidest</w:t>
       </w:r>
     </w:p>
     <w:p>
@@ -5108,7 +5588,7 @@
           <w:sz w:val="22"/>
           <w:szCs w:val="22"/>
         </w:rPr>
-        <w:t xml:space="preserve">Kopf (Tor 61, bewusst über Saturn, Linie 3): Ein leises, nicht immer erklärbares inneres Wissen drängt nach Ausdruck — verstärkt durch die Bindungsprüferin-Linie 3, das heißt: Diese Ahnungen bewähren sich bei dir eher in der praktischen Erprobung als in der reinen Theorie. Da das Kopf-Zentrum insgesamt offen ist, nimmst du den Denk- und Inspirationsdruck deiner Umgebung leicht auf, ohne ihn selbst zu erzeugen — eine Stärke, wenn du dir bewusst machst, dass nicht jede drängende Frage deine eigene ist.</w:t>
+        <w:t xml:space="preserve">Zwei unabhängige Systeme laufen in diesem Portrait auf ein verwandtes Thema zu: Die Astrologie zeigt mit Venus und Pluto im 12. Haus sowie Neptun bei Mars und Merkur eine Liebesfähigkeit, die sehr tief, sehr hingebungsvoll und zugleich anfällig für Idealisierung ist. Dein Human-Design-Chart bestätigt das aus einer ganz anderen Richtung: eine emotionale Autorität, die Zeit statt Tempo braucht, ein offenes Ich-Zentrum, das sich im Kontakt mit anderen leicht mitverändert, und eine Projektor-Energie, die sich für andere aufreiben kann, wenn sie ungefragt gibt statt zu warten.</w:t>
       </w:r>
     </w:p>
     <w:p>
@@ -5123,67 +5603,7 @@
           <w:sz w:val="22"/>
           <w:szCs w:val="22"/>
         </w:rPr>
-        <w:t xml:space="preserve">Ajna (Tore 17 und 4): Tor 17 (bewusst, Erde, Linie 5) gibt dir eine klare, oft gefragte Meinung; Tor 4 (unbewusst, Uranus, Linie 5) liefert im Hintergrund feste, logische Antworten auf wiederkehrende Fragen. Beide tragen die Fünfer-Linie: Deine Meinungen und Antworten werden von außen leicht als praktische Lösung eingefordert. Weil Ajna insgesamt offen bleibt, ist keine dieser Meinungen in Stein gemeißelt — du kannst, anders als bei einer definierten Ajna, mehrere Blickwinkel gleichzeitig einnehmen, was Weisheit ermöglicht, aber auch verunsichern kann, wenn zu viele fremde Meinungen gleichzeitig einströmen.</w:t>
-      </w:r>
-    </w:p>
-    <w:p>
-      <w:pPr>
-        <w:spacing w:after="200" w:line="320"/>
-        <w:jc w:val="both"/>
-      </w:pPr>
-      <w:r>
-        <w:rPr>
-          <w:rFonts w:ascii="Arial" w:cs="Arial" w:eastAsia="Arial" w:hAnsi="Arial"/>
-          <w:color w:val="2B2620"/>
-          <w:sz w:val="22"/>
-          <w:szCs w:val="22"/>
-        </w:rPr>
-        <w:t xml:space="preserve">Kehle (Tor 8, unbewusst über Venus, Linie 1): Ein unbewusster Drang, dich mit einem eigenen, unverwechselbaren Stil einzubringen — hier über die Forscherin-Linie 1, also getragen von echtem, selbst erarbeitetem Fundament statt von Show. Da die Kehle als Ganzes offen ist, ist dieser Beitrag nicht ständig verfügbar, sondern situativ: Du bist nicht dafür gebaut, immer im Rampenlicht zu performen, sondern dann, wenn Umstände und Publikum wirklich passen.</w:t>
-      </w:r>
-    </w:p>
-    <w:p>
-      <w:pPr>
-        <w:spacing w:after="200" w:line="320"/>
-        <w:jc w:val="both"/>
-      </w:pPr>
-      <w:r>
-        <w:rPr>
-          <w:rFonts w:ascii="Arial" w:cs="Arial" w:eastAsia="Arial" w:hAnsi="Arial"/>
-          <w:color w:val="2B2620"/>
-          <w:sz w:val="22"/>
-          <w:szCs w:val="22"/>
-        </w:rPr>
-        <w:t xml:space="preserve">Ich / G (Tor 15, doppelt: bewusst über den Mond UND unbewusst über Merkur, jeweils Linie 6): Eine besonders verstärkte Aktivierung — Tor 15, 'Extreme', erscheint bei dir gleich zweimal auf derselben Linie. Das Thema, die ganze Bandbreite menschlichen Verhaltens anzunehmen und einen eigenen, unabhängigen Rhythmus zu finden statt sich fremden Zeitplänen zu unterwerfen, ist bei dir also doppelt unterstrichen — passend zur Vorbild-Linie 6, die diesen eigenen Rhythmus zunehmend beispielhaft nach außen trägt. Da das Ich-Zentrum insgesamt offen ist, bleibt deine Identität und deine Liebesrichtung wandelbar und kontextabhängig: lebendig und anpassungsfähig, aber eben auch leicht beeinflussbar durch das Gegenüber, wenn du nicht bei dir bleibst.</w:t>
-      </w:r>
-    </w:p>
-    <w:p>
-      <w:pPr>
-        <w:spacing w:after="200" w:line="320"/>
-        <w:jc w:val="both"/>
-      </w:pPr>
-      <w:r>
-        <w:rPr>
-          <w:rFonts w:ascii="Arial" w:cs="Arial" w:eastAsia="Arial" w:hAnsi="Arial"/>
-          <w:color w:val="2B2620"/>
-          <w:sz w:val="22"/>
-          <w:szCs w:val="22"/>
-        </w:rPr>
-        <w:t xml:space="preserve">Sakral (Tore 29 und 59): Tor 29 ist bei dir gleich dreifach aktiv — bewusst über den Nordknoten (Linie 3) und Uranus (Linie 5), unbewusst über den Südknoten (Linie 4) — ein ungewöhnlich starkes Echo des Themas 'Ausdauer': das volle, verbindliche Ja zu einer Erfahrung. Tor 59 (unbewusst über Mars, Linie 2) bringt zusätzlich den Impuls, Barrieren zwischen Menschen aufzulösen, um echte Nähe zu ermöglichen. Weil dein Sakral-Zentrum insgesamt offen ist — du bist kein Generator-Typ —, ist diese Ausdauer- und Verbindungskraft nicht endlos verfügbar: Sie will bewusst dosiert werden, statt sich (dem eigenen Ja-Sagen-Reflex folgend) in Erfahrungen zu erschöpfen, für die eigentlich keine nachhaltige Energie da ist.</w:t>
-      </w:r>
-    </w:p>
-    <w:p>
-      <w:pPr>
-        <w:spacing w:after="200" w:line="320"/>
-        <w:jc w:val="both"/>
-      </w:pPr>
-      <w:r>
-        <w:rPr>
-          <w:rFonts w:ascii="Arial" w:cs="Arial" w:eastAsia="Arial" w:hAnsi="Arial"/>
-          <w:color w:val="2B2620"/>
-          <w:sz w:val="22"/>
-          <w:szCs w:val="22"/>
-        </w:rPr>
-        <w:t xml:space="preserve">Herz (Tor 40, dreifach: bewusst über Venus UND Pluto, beide Linie 4, unbewusst über Pluto, Linie 1): Bemerkenswert ist hier die exakte Übereinstimmung mit der Venus-Pluto-Konjunktion aus dem astrologischen Teil oben — dieselbe reale Planetenkonstellation zeigt sich in Human Design als doppelte Aktivierung von Tor 40, 'Alleinsein'. Das Thema: sich für andere verausgaben können, aber ebenso das Recht und die Notwendigkeit, sich danach bewusst abzugrenzen, um wirklich anzukommen — over-give und Rückzug im Wechsel. Da das Herz-Zentrum offen ist, ist Wille und Selbstwert bei dir kein Dauerzustand, sondern schwankt mit dem Umfeld; die eigene Verausgabung an Bedingungen zu knüpfen (siehe die Reflexion zu Venus/Pluto oben) ist auch hier der Schlüssel.</w:t>
+        <w:t xml:space="preserve">Das ist keine Erklärung dafür, was in einzelnen Beziehungen geschehen ist – dafür sind Sterne und Tore der falsche Ort, denn was ein Gegenüber tut, bleibt immer dessen eigene Entscheidung. Es ist eher eine sehr konkrete Einladung an dich: einer Entscheidung in der Liebe erst dann zu vertrauen, wenn die emotionale Welle abgeklungen ist und die Antwort sich wiederholt – und dein Geben von einer echten Einladung abhängig zu machen, nicht vom Wunsch, gebraucht oder gesehen zu werden.</w:t>
       </w:r>
     </w:p>
     <w:p>
@@ -5203,141 +5623,12 @@
           <w:rFonts w:ascii="Arial" w:cs="Arial" w:eastAsia="Arial" w:hAnsi="Arial"/>
           <w:b/>
           <w:bCs/>
-          <w:color w:val="5B2333"/>
+          <w:color w:val="C97B95"/>
           <w:sz w:val="30"/>
           <w:szCs w:val="30"/>
         </w:rPr>
-        <w:t xml:space="preserve">Lebensaufgabe</w:t>
-      </w:r>
-    </w:p>
-    <w:p>
-      <w:pPr>
-        <w:spacing w:after="160" w:before="60"/>
-      </w:pPr>
-      <w:r>
-        <w:rPr>
-          <w:rFonts w:ascii="Arial" w:cs="Arial" w:eastAsia="Arial" w:hAnsi="Arial"/>
-          <w:i/>
-          <w:iCs/>
-          <w:color w:val="A6803C"/>
-          <w:sz w:val="21"/>
-          <w:szCs w:val="21"/>
-        </w:rPr>
-        <w:t xml:space="preserve">Sonne und Erde, bewusst und unbewusst — dein Inkarnationskreuz</w:t>
-      </w:r>
-    </w:p>
-    <w:p>
-      <w:pPr>
-        <w:spacing w:after="200" w:line="320"/>
-        <w:jc w:val="both"/>
-      </w:pPr>
-      <w:r>
-        <w:rPr>
-          <w:rFonts w:ascii="Arial" w:cs="Arial" w:eastAsia="Arial" w:hAnsi="Arial"/>
-          <w:color w:val="2B2620"/>
-          <w:sz w:val="22"/>
-          <w:szCs w:val="22"/>
-        </w:rPr>
-        <w:t xml:space="preserve">Deine Lebensaufgabe wird in Human Design vor allem über vier Tore bestimmt: Sonne und Erde zum Zeitpunkt deiner Geburt (Tor 18 und Tor 17) sowie Sonne und Erde 88 Tage davor (Tor 39 und Tor 38). Tor 18 steht für Korrektur – den Blick für das, was nicht stimmt, und den Antrieb, es zu verbessern. Tor 17 steht für die eigene, gut durchdachte Meinung. Tor 39 steht für Provokation – das bewusste oder unbewusste Herausfordern anderer, um echte statt vorgetäuschte Reaktion sichtbar zu machen. Tor 38 steht für den Kampf um das, was wirklich zählt.</w:t>
-      </w:r>
-    </w:p>
-    <w:p>
-      <w:pPr>
-        <w:spacing w:after="200" w:line="320"/>
-        <w:jc w:val="both"/>
-      </w:pPr>
-      <w:r>
-        <w:rPr>
-          <w:rFonts w:ascii="Arial" w:cs="Arial" w:eastAsia="Arial" w:hAnsi="Arial"/>
-          <w:color w:val="2B2620"/>
-          <w:sz w:val="22"/>
-          <w:szCs w:val="22"/>
-        </w:rPr>
-        <w:t xml:space="preserve">Zusammengenommen zeichnet dieses Kreuz die Aufgabe einer Frau, die dort, wo etwas nicht stimmig ist, nicht wegsieht, sondern es benennt und dafür kämpft – nicht aus Streitlust, sondern aus einem tiefen, oft unbequemen Sinn für das, was richtig wäre. Verbunden mit Profil und Autorität heißt das: Deine Lösungen wirken am stärksten, wenn du eingeladen wirst, sie zu geben; wenn du emotional durchgefühlt und nicht überstürzt entscheidest; und wenn dein Kampfgeist einem Fundament dient, das du dir selbst wirklich erarbeitet hast.</w:t>
-      </w:r>
-    </w:p>
-    <w:p>
-      <w:r>
-        <w:br w:type="page"/>
-      </w:r>
-    </w:p>
-    <w:p>
-      <w:pPr>
-        <w:pBdr>
-          <w:bottom w:val="single" w:color="A6803C" w:sz="6" w:space="6"/>
-        </w:pBdr>
-        <w:spacing w:after="40" w:before="320"/>
-      </w:pPr>
-      <w:r>
-        <w:rPr>
-          <w:rFonts w:ascii="Arial" w:cs="Arial" w:eastAsia="Arial" w:hAnsi="Arial"/>
-          <w:b/>
-          <w:bCs/>
-          <w:color w:val="5B2333"/>
-          <w:sz w:val="30"/>
-          <w:szCs w:val="30"/>
-        </w:rPr>
-        <w:t xml:space="preserve">Ein wiederkehrender Faden — eine Einladung zur Reflexion</w:t>
-      </w:r>
-    </w:p>
-    <w:p>
-      <w:pPr>
-        <w:spacing w:after="160" w:before="60"/>
-      </w:pPr>
-      <w:r>
-        <w:rPr>
-          <w:rFonts w:ascii="Arial" w:cs="Arial" w:eastAsia="Arial" w:hAnsi="Arial"/>
-          <w:i/>
-          <w:iCs/>
-          <w:color w:val="A6803C"/>
-          <w:sz w:val="21"/>
-          <w:szCs w:val="21"/>
-        </w:rPr>
-        <w:t xml:space="preserve">Nicht, was dir widerfährt, sondern von wo du entscheidest</w:t>
-      </w:r>
-    </w:p>
-    <w:p>
-      <w:pPr>
-        <w:spacing w:after="200" w:line="320"/>
-        <w:jc w:val="both"/>
-      </w:pPr>
-      <w:r>
-        <w:rPr>
-          <w:rFonts w:ascii="Arial" w:cs="Arial" w:eastAsia="Arial" w:hAnsi="Arial"/>
-          <w:color w:val="2B2620"/>
-          <w:sz w:val="22"/>
-          <w:szCs w:val="22"/>
-        </w:rPr>
-        <w:t xml:space="preserve">Zwei unabhängige Systeme laufen in diesem Portrait auf ein verwandtes Thema zu: Die Astrologie zeigt mit Venus und Pluto im 12. Haus sowie Neptun bei Mars und Merkur eine Liebesfähigkeit, die sehr tief, sehr hingebungsvoll und zugleich anfällig für Idealisierung ist. Dein Human-Design-Chart bestätigt das aus einer ganz anderen Richtung: eine emotionale Autorität, die Zeit statt Tempo braucht, ein offenes Ich-Zentrum, das sich im Kontakt mit anderen leicht mitverändert, und eine Projektor-Energie, die sich für andere aufreiben kann, wenn sie ungefragt gibt statt zu warten.</w:t>
-      </w:r>
-    </w:p>
-    <w:p>
-      <w:pPr>
-        <w:spacing w:after="200" w:line="320"/>
-        <w:jc w:val="both"/>
-      </w:pPr>
-      <w:r>
-        <w:rPr>
-          <w:rFonts w:ascii="Arial" w:cs="Arial" w:eastAsia="Arial" w:hAnsi="Arial"/>
-          <w:color w:val="2B2620"/>
-          <w:sz w:val="22"/>
-          <w:szCs w:val="22"/>
-        </w:rPr>
-        <w:t xml:space="preserve">Das ist keine Erklärung dafür, was in einzelnen Beziehungen geschehen ist – dafür sind Sterne und Tore der falsche Ort, denn was ein Gegenüber tut, bleibt immer dessen eigene Entscheidung. Es ist eher eine sehr konkrete Einladung an dich: einer Entscheidung in der Liebe erst dann zu vertrauen, wenn die emotionale Welle abgeklungen ist und die Antwort sich wiederholt – und dein Geben von einer echten Einladung abhängig zu machen, nicht vom Wunsch, gebraucht oder gesehen zu werden.</w:t>
-      </w:r>
-    </w:p>
-    <w:p>
-      <w:r>
-        <w:br w:type="page"/>
-      </w:r>
-    </w:p>
-    <w:p>
-      <w:pPr>
-        <w:pBdr>
-          <w:bottom w:val="single" w:color="A6803C" w:sz="6" w:space="6"/>
-        </w:pBdr>
-        <w:spacing w:after="40" w:before="320"/>
-      </w:pPr>
+        <w:t xml:space="preserve">✦ </w:t>
+      </w:r>
       <w:r>
         <w:rPr>
           <w:rFonts w:ascii="Arial" w:cs="Arial" w:eastAsia="Arial" w:hAnsi="Arial"/>

</xml_diff>